<commit_message>
feat(designer-kit): document-to-figma dùng luôn design system artifact có sẵn, không tạo mới
- intake §2.4: 3 nhánh A dùng nguyên / B bổ sung artifact có quyền EDIT / C bản sao; §4–§5 bỏ qua khi đã có artifact
- agent bước 0.1: có link artifact (tham số lệnh / prompt) thì bỏ DS-1, không hỏi duyệt lại
- lệnh thêm tham số thứ 3 [design-system-url]; cập nhật AGENTS, README, docx hướng dẫn
- xoá file khoá Word ~$ lỡ commit trong ba-kit/system-to-doc/docs

Co-Authored-By: Claude Sonnet 5.5 <noreply@anthropic.com>
</commit_message>
<xml_diff>
--- a/designer-kit/document-to-figma/docs/Hướng dẫn sử dụng Document to Figma.docx
+++ b/designer-kit/document-to-figma/docs/Hướng dẫn sử dụng Document to Figma.docx
@@ -146,7 +146,7 @@
           <wp:inline distT="0" distB="0" distL="0" distR="0">
             <wp:extent cx="6096000" cy="3223846"/>
             <wp:effectExtent l="0" t="0" r="0" b="0"/>
-            <wp:docPr id="1" name="gen/flow.png" descr="Luồng tính năng — chưa có design system thì chỉ cần link Figma, AI tự tạo · bạn duyệt 2 lần" title="Luồng tính năng — chưa có design system thì chỉ cần link Figma, AI tự tạo · bạn duyệt 2 lần"/>
+            <wp:docPr id="1" name="gen/flow.png" descr="Luồng tính năng — đã có link design system thì dùng luôn · chưa có thì chỉ cần link Figma, AI tự tạo · bạn duyệt 2 lần" title="Luồng tính năng — chưa có design system thì chỉ cần link Figma, AI tự tạo · bạn duyệt 2 lần"/>
             <wp:cNvGraphicFramePr>
               <a:graphicFrameLocks xmlns:a="http://schemas.openxmlformats.org/drawingml/2006/main" noChangeAspect="1"/>
             </wp:cNvGraphicFramePr>
@@ -295,7 +295,7 @@
               <w:rPr>
                 <w:color w:val="24292F"/>
               </w:rPr>
-              <w:t>Design system: file có sẵn — hoặc chỉ cần link Figma (cấu trúc design / màn hình thực tế), AI tự tạo</w:t>
+              <w:t>Design system: link artifact có sẵn (dùng luôn, không tạo mới) · file có sẵn · hoặc link Figma (cấu trúc design / màn hình thực tế), AI tự tạo</w:t>
             </w:r>
           </w:p>
           <w:p>
@@ -592,7 +592,7 @@
                 <w:sz w:val="22"/>
                 <w:szCs w:val="22"/>
               </w:rPr>
-              <w:t>https://drive.google.com/file/d/1-s4s7KKU1qWmRoFEeSK7Pd6trwH39GlB/view?usp=sharing</w:t>
+              <w:t>https://drive.google.com/drive/folders/1PqGzQVp3BAzw0wSkHE4hPhmirmsk69Oy</w:t>
             </w:r>
           </w:p>
         </w:tc>
@@ -1082,7 +1082,7 @@
                 <w:sz w:val="26"/>
                 <w:szCs w:val="26"/>
               </w:rPr>
-              <w:t>BƯỚC 2 — MỞ CLAUDE CODE TẠI FOLDER KIT</w:t>
+              <w:t xml:space="preserve">BƯỚC 2 — MỞ CLAUDE CODE TẠI FOLDER </w:t>
             </w:r>
           </w:p>
         </w:tc>
@@ -1103,146 +1103,6 @@
           <w:color w:val="24292F"/>
         </w:rPr>
         <w:t>Claude phải được mở đúng ở folder document-to-figma (folder có CLAUDE.md) thì Designer Agent mới được nạp. Chọn 1 trong 2 cách:</w:t>
-      </w:r>
-    </w:p>
-    <w:p>
-      <w:pPr>
-        <w:pStyle w:val="Heading2"/>
-        <w:keepNext/>
-        <w:spacing w:before="240" w:after="100"/>
-      </w:pPr>
-      <w:r>
-        <w:rPr>
-          <w:b/>
-          <w:bCs/>
-          <w:color w:val="D86107"/>
-        </w:rPr>
-        <w:lastRenderedPageBreak/>
-        <w:t>Cách A — Ứng dụng Claude (Desktop)</w:t>
-      </w:r>
-    </w:p>
-    <w:p>
-      <w:pPr>
-        <w:pStyle w:val="ListParagraph"/>
-        <w:numPr>
-          <w:ilvl w:val="0"/>
-          <w:numId w:val="4"/>
-        </w:numPr>
-        <w:spacing w:before="20" w:after="20"/>
-      </w:pPr>
-      <w:r>
-        <w:rPr>
-          <w:color w:val="24292F"/>
-        </w:rPr>
-        <w:t xml:space="preserve">Mở ứng dụng </w:t>
-      </w:r>
-      <w:r>
-        <w:rPr>
-          <w:b/>
-          <w:bCs/>
-          <w:color w:val="24292F"/>
-        </w:rPr>
-        <w:t>Claude</w:t>
-      </w:r>
-      <w:r>
-        <w:rPr>
-          <w:color w:val="24292F"/>
-        </w:rPr>
-        <w:t xml:space="preserve"> trên máy, đăng nhập tài khoản công ty.</w:t>
-      </w:r>
-    </w:p>
-    <w:p>
-      <w:pPr>
-        <w:pStyle w:val="ListParagraph"/>
-        <w:numPr>
-          <w:ilvl w:val="0"/>
-          <w:numId w:val="4"/>
-        </w:numPr>
-        <w:spacing w:before="20" w:after="20"/>
-      </w:pPr>
-      <w:r>
-        <w:rPr>
-          <w:color w:val="24292F"/>
-        </w:rPr>
-        <w:t xml:space="preserve">Chọn tab </w:t>
-      </w:r>
-      <w:r>
-        <w:rPr>
-          <w:b/>
-          <w:bCs/>
-          <w:color w:val="24292F"/>
-        </w:rPr>
-        <w:t>Code</w:t>
-      </w:r>
-      <w:r>
-        <w:rPr>
-          <w:color w:val="24292F"/>
-        </w:rPr>
-        <w:t xml:space="preserve"> (Claude Code).</w:t>
-      </w:r>
-    </w:p>
-    <w:p>
-      <w:pPr>
-        <w:pStyle w:val="ListParagraph"/>
-        <w:numPr>
-          <w:ilvl w:val="0"/>
-          <w:numId w:val="4"/>
-        </w:numPr>
-        <w:spacing w:before="20" w:after="20"/>
-      </w:pPr>
-      <w:r>
-        <w:rPr>
-          <w:color w:val="24292F"/>
-        </w:rPr>
-        <w:t xml:space="preserve">Bấm chọn folder làm việc → chọn folder </w:t>
-      </w:r>
-      <w:r>
-        <w:rPr>
-          <w:rFonts w:ascii="Consolas" w:eastAsia="MS Gothic" w:hAnsi="Consolas" w:cs="Consolas"/>
-          <w:b/>
-          <w:bCs/>
-          <w:color w:val="0969DA"/>
-          <w:sz w:val="19"/>
-          <w:szCs w:val="19"/>
-        </w:rPr>
-        <w:t>document-to-figma</w:t>
-      </w:r>
-      <w:r>
-        <w:rPr>
-          <w:color w:val="24292F"/>
-        </w:rPr>
-        <w:t xml:space="preserve"> → Open.</w:t>
-      </w:r>
-    </w:p>
-    <w:p>
-      <w:pPr>
-        <w:pStyle w:val="ListParagraph"/>
-        <w:numPr>
-          <w:ilvl w:val="0"/>
-          <w:numId w:val="4"/>
-        </w:numPr>
-        <w:spacing w:before="20" w:after="20"/>
-      </w:pPr>
-      <w:r>
-        <w:rPr>
-          <w:color w:val="24292F"/>
-        </w:rPr>
-        <w:t>Ô chat hiện ra — sẵn sàng dùng.</w:t>
-      </w:r>
-    </w:p>
-    <w:p>
-      <w:pPr>
-        <w:pStyle w:val="Heading2"/>
-        <w:keepNext/>
-        <w:spacing w:before="240" w:after="100"/>
-      </w:pPr>
-      <w:r>
-        <w:rPr>
-          <w:b/>
-          <w:bCs/>
-          <w:color w:val="D86107"/>
-        </w:rPr>
-        <w:t>Cách B — VS Code + extension Claude Code</w:t>
       </w:r>
     </w:p>
     <w:p>
@@ -1258,6 +1118,7 @@
         <w:rPr>
           <w:color w:val="24292F"/>
         </w:rPr>
+        <w:lastRenderedPageBreak/>
         <w:t xml:space="preserve">Mở VS Code → </w:t>
       </w:r>
       <w:r>
@@ -1992,10 +1853,7 @@
       </w:pPr>
       <w:r>
         <w:rPr>
-          <w:rFonts w:ascii="Calibri" w:cs="Calibri" w:eastAsia="Yu Gothic" w:hAnsi="Calibri"/>
-          <w:color w:val="24292F"/>
-          <w:sz w:val="20"/>
-          <w:szCs w:val="20"/>
+          <w:color w:val="24292F"/>
         </w:rPr>
         <w:t xml:space="preserve">Design system là bộ quy định giao diện của dự án: màu sắc, font, size, weight, khoảng cách, bo góc, component. Agent chỉ vẽ khi có design system. </w:t>
       </w:r>
@@ -2011,23 +1869,17 @@
       </w:pPr>
       <w:r>
         <w:rPr>
-          <w:rFonts w:ascii="Calibri" w:cs="Calibri" w:eastAsia="Yu Gothic" w:hAnsi="Calibri"/>
           <w:b/>
           <w:bCs/>
           <w:color w:val="24292F"/>
-          <w:sz w:val="20"/>
-          <w:szCs w:val="20"/>
         </w:rPr>
         <w:t xml:space="preserve">Trường hợp 1 — Đã có file design system: </w:t>
       </w:r>
       <w:r>
         <w:rPr>
-          <w:rFonts w:ascii="Calibri" w:cs="Calibri" w:eastAsia="Yu Gothic" w:hAnsi="Calibri"/>
-          <w:color w:val="24292F"/>
-          <w:sz w:val="20"/>
-          <w:szCs w:val="20"/>
-        </w:rPr>
-        <w:t xml:space="preserve">file .md / .pdf / .docx / .xlsx / ảnh → copy vào folder input/design-system (tự tạo nếu chưa có). Có link Design System artifact (claude.ai/artifact/…) thì dán khi Claude hỏi.</w:t>
+          <w:color w:val="24292F"/>
+        </w:rPr>
+        <w:t>file .md / .pdf / .docx / .xlsx / ảnh → copy vào folder input/design-system (tự tạo nếu chưa có). Có link Design System artifact (claude.ai/artifact/…) đúng định dạng → dán khi Claude hỏi hoặc truyền ngay trong lệnh: Claude dùng luôn artifact đó, KHÔNG tạo design system mới và không hỏi duyệt lại.</w:t>
       </w:r>
     </w:p>
     <w:p>
@@ -2041,50 +1893,29 @@
       </w:pPr>
       <w:r>
         <w:rPr>
-          <w:rFonts w:ascii="Calibri" w:cs="Calibri" w:eastAsia="Yu Gothic" w:hAnsi="Calibri"/>
           <w:b/>
           <w:bCs/>
           <w:color w:val="D86107"/>
-          <w:sz w:val="20"/>
-          <w:szCs w:val="20"/>
         </w:rPr>
         <w:t xml:space="preserve">Trường hợp 2 — Chưa có file design system: </w:t>
       </w:r>
       <w:r>
         <w:rPr>
-          <w:rFonts w:ascii="Calibri" w:cs="Calibri" w:eastAsia="Yu Gothic" w:hAnsi="Calibri"/>
-          <w:color w:val="24292F"/>
-          <w:sz w:val="20"/>
-          <w:szCs w:val="20"/>
-        </w:rPr>
-        <w:t xml:space="preserve">chuẩn bị 1 trong 2 loại link Figma: (A) link Figma về cấu trúc design — page Foundations / Design Tokens / Component Library; hoặc (B) link Figma về màn hình thực tế — 1–5 màn đã được designer duyệt.</w:t>
-      </w:r>
-      <w:r>
-        <w:rPr>
-          <w:rFonts w:ascii="Calibri" w:cs="Calibri" w:eastAsia="Yu Gothic" w:hAnsi="Calibri"/>
-          <w:color w:val="24292F"/>
-          <w:sz w:val="20"/>
-          <w:szCs w:val="20"/>
-        </w:rPr>
-        <w:t xml:space="preserve"> → AI tự đọc link Figma, đo màu, chữ, khoảng cách, component và </w:t>
-      </w:r>
-      <w:r>
-        <w:rPr>
-          <w:rFonts w:ascii="Calibri" w:cs="Calibri" w:eastAsia="Yu Gothic" w:hAnsi="Calibri"/>
+          <w:color w:val="24292F"/>
+        </w:rPr>
+        <w:t xml:space="preserve">chuẩn bị 1 trong 2 loại link Figma: (A) link Figma về cấu trúc design — page Foundations / Design Tokens / Component Library; hoặc (B) link Figma về màn hình thực tế — 1–5 màn đã được designer duyệt. → AI tự đọc link Figma, đo màu, chữ, khoảng cách, component và </w:t>
+      </w:r>
+      <w:r>
+        <w:rPr>
           <w:b/>
           <w:bCs/>
           <w:color w:val="24292F"/>
-          <w:sz w:val="20"/>
-          <w:szCs w:val="20"/>
-        </w:rPr>
-        <w:t xml:space="preserve">tạo ra design system cho dự án</w:t>
-      </w:r>
-      <w:r>
-        <w:rPr>
-          <w:rFonts w:ascii="Calibri" w:cs="Calibri" w:eastAsia="Yu Gothic" w:hAnsi="Calibri"/>
-          <w:color w:val="24292F"/>
-          <w:sz w:val="20"/>
-          <w:szCs w:val="20"/>
+        </w:rPr>
+        <w:t>tạo ra design system cho dự án</w:t>
+      </w:r>
+      <w:r>
+        <w:rPr>
+          <w:color w:val="24292F"/>
         </w:rPr>
         <w:t xml:space="preserve"> — bạn chỉ cần duyệt.</w:t>
       </w:r>
@@ -2149,7 +1980,7 @@
               <w:rPr>
                 <w:color w:val="24292F"/>
               </w:rPr>
-              <w:t xml:space="preserve">Không có file và cũng không có link Figma nào → agent sẽ DỪNG, không vẽ. Xin designer / leader dự án 1 link Figma rồi chạy lại.</w:t>
+              <w:t>Không có file và cũng không có link Figma nào → agent sẽ DỪNG, không vẽ. Xin designer / leader dự án 1 link Figma rồi chạy lại.</w:t>
             </w:r>
           </w:p>
         </w:tc>
@@ -2215,7 +2046,7 @@
               <w:rPr>
                 <w:color w:val="24292F"/>
               </w:rPr>
-              <w:t xml:space="preserve">Lần đầu agent tạo Design System (1 link artifact + folder design-system) và nhờ bạn duyệt. Các lần sau dùng lại luôn, không hỏi lại.</w:t>
+              <w:t>Đã có link artifact Design System → dùng luôn (thiếu mục nào thì Claude hỏi bổ sung, có quyền sửa thì sửa chính artifact đó). Chưa có → lần đầu agent tạo Design System (1 link artifact + folder design-system) và nhờ bạn duyệt; các lần sau dùng lại, không hỏi lại.</w:t>
             </w:r>
           </w:p>
         </w:tc>
@@ -2819,7 +2650,7 @@
                 <w:sz w:val="24"/>
                 <w:szCs w:val="24"/>
               </w:rPr>
-              <w:t>/document-to-figma</w:t>
+              <w:t>/document-to-figma [document-path] [figma-output-url] [design-system-url]</w:t>
             </w:r>
           </w:p>
         </w:tc>
@@ -2899,6 +2730,36 @@
               <w:t>Hãy là Designer, chuyển tài liệu trong folder input sang Figma, đặt vào &lt;link Figma&gt;</w:t>
             </w:r>
           </w:p>
+          <w:p>
+            <w:pPr>
+              <w:spacing w:before="60" w:after="40"/>
+            </w:pPr>
+            <w:r>
+              <w:rPr>
+                <w:b/>
+                <w:bCs/>
+                <w:color w:val="6E7781"/>
+                <w:sz w:val="16"/>
+                <w:szCs w:val="16"/>
+              </w:rPr>
+              <w:t>NẾU ĐÃ CÓ LINK DESIGN SYSTEM (thay &lt;link artifact&gt;)</w:t>
+            </w:r>
+          </w:p>
+          <w:p>
+            <w:pPr>
+              <w:spacing w:after="20"/>
+            </w:pPr>
+            <w:r>
+              <w:rPr>
+                <w:b/>
+                <w:bCs/>
+                <w:color w:val="0969DA"/>
+                <w:sz w:val="24"/>
+                <w:szCs w:val="24"/>
+              </w:rPr>
+              <w:t>Hãy là Designer, chuyển tài liệu trong folder input sang Figma, dùng design system &lt;link artifact&gt;</w:t>
+            </w:r>
+          </w:p>
         </w:tc>
       </w:tr>
     </w:tbl>
@@ -3034,1447 +2895,6 @@
         <w:t>Hình minh họa — Bước 6</w:t>
       </w:r>
     </w:p>
-    <w:p>
-      <w:pPr>
-        <w:keepNext/>
-        <w:spacing w:after="120"/>
-      </w:pPr>
-    </w:p>
-    <w:tbl>
-      <w:tblPr>
-        <w:tblW w:w="9746" w:type="dxa"/>
-        <w:tblBorders>
-          <w:top w:val="single" w:sz="4" w:space="0" w:color="auto"/>
-          <w:left w:val="single" w:sz="4" w:space="0" w:color="auto"/>
-          <w:bottom w:val="single" w:sz="4" w:space="0" w:color="auto"/>
-          <w:right w:val="single" w:sz="4" w:space="0" w:color="auto"/>
-          <w:insideH w:val="single" w:sz="4" w:space="0" w:color="auto"/>
-          <w:insideV w:val="single" w:sz="4" w:space="0" w:color="auto"/>
-        </w:tblBorders>
-        <w:tblCellMar>
-          <w:left w:w="10" w:type="dxa"/>
-          <w:right w:w="10" w:type="dxa"/>
-        </w:tblCellMar>
-        <w:tblLook w:val="04A0" w:firstRow="1" w:lastRow="0" w:firstColumn="1" w:lastColumn="0" w:noHBand="0" w:noVBand="1"/>
-      </w:tblPr>
-      <w:tblGrid>
-        <w:gridCol w:w="9746"/>
-      </w:tblGrid>
-      <w:tr>
-        <w:tc>
-          <w:tcPr>
-            <w:tcW w:w="9746" w:type="dxa"/>
-            <w:tcBorders>
-              <w:top w:val="single" w:sz="4" w:space="0" w:color="0969DA"/>
-              <w:left w:val="single" w:sz="4" w:space="0" w:color="0969DA"/>
-              <w:bottom w:val="single" w:sz="4" w:space="0" w:color="0969DA"/>
-              <w:right w:val="single" w:sz="4" w:space="0" w:color="0969DA"/>
-            </w:tcBorders>
-            <w:shd w:val="clear" w:color="auto" w:fill="0969DA"/>
-            <w:tcMar>
-              <w:top w:w="100" w:type="dxa"/>
-              <w:left w:w="140" w:type="dxa"/>
-              <w:bottom w:w="100" w:type="dxa"/>
-              <w:right w:w="140" w:type="dxa"/>
-            </w:tcMar>
-          </w:tcPr>
-          <w:p>
-            <w:pPr>
-              <w:keepNext/>
-              <w:spacing w:before="40" w:after="40"/>
-            </w:pPr>
-            <w:r>
-              <w:rPr>
-                <w:b/>
-                <w:bCs/>
-                <w:color w:val="FFFFFF"/>
-                <w:sz w:val="26"/>
-                <w:szCs w:val="26"/>
-              </w:rPr>
-              <w:t>BƯỚC 7 — TRẢ LỜI CÂU HỎI CỦA CLAUDE</w:t>
-            </w:r>
-          </w:p>
-        </w:tc>
-      </w:tr>
-    </w:tbl>
-    <w:p>
-      <w:pPr>
-        <w:keepNext/>
-        <w:spacing w:after="80"/>
-      </w:pPr>
-    </w:p>
-    <w:p>
-      <w:pPr>
-        <w:spacing w:before="60" w:after="60"/>
-      </w:pPr>
-      <w:r>
-        <w:rPr>
-          <w:color w:val="24292F"/>
-        </w:rPr>
-        <w:t>Claude không tự đoán. Trước khi vẽ, Claude hiện các hộp chọn — bấm chọn; muốn trả lời khác thì chọn Other và gõ / dán vào. Câu nào bạn đã ghi trong prompt thì Claude không hỏi lại.</w:t>
-      </w:r>
-    </w:p>
-    <w:tbl>
-      <w:tblPr>
-        <w:tblW w:w="9746" w:type="dxa"/>
-        <w:tblBorders>
-          <w:top w:val="single" w:sz="4" w:space="0" w:color="auto"/>
-          <w:left w:val="single" w:sz="4" w:space="0" w:color="auto"/>
-          <w:bottom w:val="single" w:sz="4" w:space="0" w:color="auto"/>
-          <w:right w:val="single" w:sz="4" w:space="0" w:color="auto"/>
-          <w:insideH w:val="single" w:sz="4" w:space="0" w:color="auto"/>
-          <w:insideV w:val="single" w:sz="4" w:space="0" w:color="auto"/>
-        </w:tblBorders>
-        <w:tblCellMar>
-          <w:left w:w="10" w:type="dxa"/>
-          <w:right w:w="10" w:type="dxa"/>
-        </w:tblCellMar>
-        <w:tblLook w:val="04A0" w:firstRow="1" w:lastRow="0" w:firstColumn="1" w:lastColumn="0" w:noHBand="0" w:noVBand="1"/>
-      </w:tblPr>
-      <w:tblGrid>
-        <w:gridCol w:w="2900"/>
-        <w:gridCol w:w="6846"/>
-      </w:tblGrid>
-      <w:tr>
-        <w:tc>
-          <w:tcPr>
-            <w:tcW w:w="2900" w:type="dxa"/>
-            <w:tcBorders>
-              <w:top w:val="single" w:sz="4" w:space="0" w:color="0969DA"/>
-              <w:left w:val="single" w:sz="4" w:space="0" w:color="0969DA"/>
-              <w:bottom w:val="single" w:sz="4" w:space="0" w:color="0969DA"/>
-              <w:right w:val="single" w:sz="4" w:space="0" w:color="0969DA"/>
-            </w:tcBorders>
-            <w:shd w:val="clear" w:color="auto" w:fill="0969DA"/>
-            <w:tcMar>
-              <w:top w:w="100" w:type="dxa"/>
-              <w:left w:w="140" w:type="dxa"/>
-              <w:bottom w:w="100" w:type="dxa"/>
-              <w:right w:w="140" w:type="dxa"/>
-            </w:tcMar>
-          </w:tcPr>
-          <w:p>
-            <w:pPr>
-              <w:spacing w:before="60" w:after="60"/>
-            </w:pPr>
-            <w:r>
-              <w:rPr>
-                <w:b/>
-                <w:bCs/>
-                <w:color w:val="FFFFFF"/>
-              </w:rPr>
-              <w:t>Claude hỏi</w:t>
-            </w:r>
-          </w:p>
-        </w:tc>
-        <w:tc>
-          <w:tcPr>
-            <w:tcW w:w="6846" w:type="dxa"/>
-            <w:tcBorders>
-              <w:top w:val="single" w:sz="4" w:space="0" w:color="0969DA"/>
-              <w:left w:val="single" w:sz="4" w:space="0" w:color="0969DA"/>
-              <w:bottom w:val="single" w:sz="4" w:space="0" w:color="0969DA"/>
-              <w:right w:val="single" w:sz="4" w:space="0" w:color="0969DA"/>
-            </w:tcBorders>
-            <w:shd w:val="clear" w:color="auto" w:fill="0969DA"/>
-            <w:tcMar>
-              <w:top w:w="100" w:type="dxa"/>
-              <w:left w:w="140" w:type="dxa"/>
-              <w:bottom w:w="100" w:type="dxa"/>
-              <w:right w:w="140" w:type="dxa"/>
-            </w:tcMar>
-          </w:tcPr>
-          <w:p>
-            <w:pPr>
-              <w:spacing w:before="60" w:after="60"/>
-            </w:pPr>
-            <w:r>
-              <w:rPr>
-                <w:b/>
-                <w:bCs/>
-                <w:color w:val="FFFFFF"/>
-              </w:rPr>
-              <w:t>Bạn chọn / trả lời</w:t>
-            </w:r>
-          </w:p>
-        </w:tc>
-      </w:tr>
-      <w:tr>
-        <w:tc>
-          <w:tcPr>
-            <w:tcW w:w="2900" w:type="dxa"/>
-            <w:tcBorders>
-              <w:top w:val="single" w:sz="4" w:space="0" w:color="D0D7DE"/>
-              <w:left w:val="single" w:sz="4" w:space="0" w:color="D0D7DE"/>
-              <w:bottom w:val="single" w:sz="4" w:space="0" w:color="D0D7DE"/>
-              <w:right w:val="single" w:sz="4" w:space="0" w:color="D0D7DE"/>
-            </w:tcBorders>
-            <w:tcMar>
-              <w:top w:w="100" w:type="dxa"/>
-              <w:left w:w="140" w:type="dxa"/>
-              <w:bottom w:w="100" w:type="dxa"/>
-              <w:right w:w="140" w:type="dxa"/>
-            </w:tcMar>
-          </w:tcPr>
-          <w:p>
-            <w:pPr>
-              <w:spacing w:before="60" w:after="60"/>
-            </w:pPr>
-            <w:r>
-              <w:rPr>
-                <w:b/>
-                <w:bCs/>
-                <w:color w:val="24292F"/>
-              </w:rPr>
-              <w:t>1. Đã có design system chưa?</w:t>
-            </w:r>
-          </w:p>
-        </w:tc>
-        <w:tc>
-          <w:tcPr>
-            <w:tcW w:w="6846" w:type="dxa"/>
-            <w:tcBorders>
-              <w:top w:val="single" w:sz="4" w:space="0" w:color="D0D7DE"/>
-              <w:left w:val="single" w:sz="4" w:space="0" w:color="D0D7DE"/>
-              <w:bottom w:val="single" w:sz="4" w:space="0" w:color="D0D7DE"/>
-              <w:right w:val="single" w:sz="4" w:space="0" w:color="D0D7DE"/>
-            </w:tcBorders>
-            <w:tcMar>
-              <w:top w:w="100" w:type="dxa"/>
-              <w:left w:w="140" w:type="dxa"/>
-              <w:bottom w:w="100" w:type="dxa"/>
-              <w:right w:w="140" w:type="dxa"/>
-            </w:tcMar>
-          </w:tcPr>
-          <w:p>
-            <w:pPr>
-              <w:spacing w:before="60" w:after="60"/>
-            </w:pPr>
-            <w:r>
-              <w:rPr>
-                <w:color w:val="24292F"/>
-              </w:rPr>
-              <w:t xml:space="preserve">Link Figma (cấu trúc design hoặc màn hình thực tế) · File tài liệu · Link artifact Design System · Chưa có (→ Claude dừng)</w:t>
-            </w:r>
-          </w:p>
-        </w:tc>
-      </w:tr>
-      <w:tr>
-        <w:tc>
-          <w:tcPr>
-            <w:tcW w:w="2900" w:type="dxa"/>
-            <w:tcBorders>
-              <w:top w:val="single" w:sz="4" w:space="0" w:color="D0D7DE"/>
-              <w:left w:val="single" w:sz="4" w:space="0" w:color="D0D7DE"/>
-              <w:bottom w:val="single" w:sz="4" w:space="0" w:color="D0D7DE"/>
-              <w:right w:val="single" w:sz="4" w:space="0" w:color="D0D7DE"/>
-            </w:tcBorders>
-            <w:tcMar>
-              <w:top w:w="100" w:type="dxa"/>
-              <w:left w:w="140" w:type="dxa"/>
-              <w:bottom w:w="100" w:type="dxa"/>
-              <w:right w:w="140" w:type="dxa"/>
-            </w:tcMar>
-          </w:tcPr>
-          <w:p>
-            <w:pPr>
-              <w:spacing w:before="60" w:after="60"/>
-            </w:pPr>
-            <w:r>
-              <w:rPr>
-                <w:b/>
-                <w:bCs/>
-                <w:color w:val="24292F"/>
-              </w:rPr>
-              <w:t>2. Design system còn thiếu … — bổ sung thế nào?</w:t>
-            </w:r>
-          </w:p>
-        </w:tc>
-        <w:tc>
-          <w:tcPr>
-            <w:tcW w:w="6846" w:type="dxa"/>
-            <w:tcBorders>
-              <w:top w:val="single" w:sz="4" w:space="0" w:color="D0D7DE"/>
-              <w:left w:val="single" w:sz="4" w:space="0" w:color="D0D7DE"/>
-              <w:bottom w:val="single" w:sz="4" w:space="0" w:color="D0D7DE"/>
-              <w:right w:val="single" w:sz="4" w:space="0" w:color="D0D7DE"/>
-            </w:tcBorders>
-            <w:tcMar>
-              <w:top w:w="100" w:type="dxa"/>
-              <w:left w:w="140" w:type="dxa"/>
-              <w:bottom w:w="100" w:type="dxa"/>
-              <w:right w:w="140" w:type="dxa"/>
-            </w:tcMar>
-          </w:tcPr>
-          <w:p>
-            <w:pPr>
-              <w:spacing w:before="60" w:after="60"/>
-            </w:pPr>
-            <w:r>
-              <w:rPr>
-                <w:color w:val="24292F"/>
-              </w:rPr>
-              <w:t>(chỉ hỏi khi thiếu) Gửi 1–5 màn Figma (khuyến nghị) · Gửi thêm tài liệu · Dùng tạm (ghi TBD) · Dừng lại</w:t>
-            </w:r>
-          </w:p>
-        </w:tc>
-      </w:tr>
-      <w:tr>
-        <w:tc>
-          <w:tcPr>
-            <w:tcW w:w="2900" w:type="dxa"/>
-            <w:tcBorders>
-              <w:top w:val="single" w:sz="4" w:space="0" w:color="D0D7DE"/>
-              <w:left w:val="single" w:sz="4" w:space="0" w:color="D0D7DE"/>
-              <w:bottom w:val="single" w:sz="4" w:space="0" w:color="D0D7DE"/>
-              <w:right w:val="single" w:sz="4" w:space="0" w:color="D0D7DE"/>
-            </w:tcBorders>
-            <w:tcMar>
-              <w:top w:w="100" w:type="dxa"/>
-              <w:left w:w="140" w:type="dxa"/>
-              <w:bottom w:w="100" w:type="dxa"/>
-              <w:right w:w="140" w:type="dxa"/>
-            </w:tcMar>
-          </w:tcPr>
-          <w:p>
-            <w:pPr>
-              <w:spacing w:before="60" w:after="60"/>
-            </w:pPr>
-            <w:r>
-              <w:rPr>
-                <w:b/>
-                <w:bCs/>
-                <w:color w:val="24292F"/>
-              </w:rPr>
-              <w:t>3. Duyệt design system?</w:t>
-            </w:r>
-          </w:p>
-        </w:tc>
-        <w:tc>
-          <w:tcPr>
-            <w:tcW w:w="6846" w:type="dxa"/>
-            <w:tcBorders>
-              <w:top w:val="single" w:sz="4" w:space="0" w:color="D0D7DE"/>
-              <w:left w:val="single" w:sz="4" w:space="0" w:color="D0D7DE"/>
-              <w:bottom w:val="single" w:sz="4" w:space="0" w:color="D0D7DE"/>
-              <w:right w:val="single" w:sz="4" w:space="0" w:color="D0D7DE"/>
-            </w:tcBorders>
-            <w:tcMar>
-              <w:top w:w="100" w:type="dxa"/>
-              <w:left w:w="140" w:type="dxa"/>
-              <w:bottom w:w="100" w:type="dxa"/>
-              <w:right w:w="140" w:type="dxa"/>
-            </w:tcMar>
-          </w:tcPr>
-          <w:p>
-            <w:pPr>
-              <w:spacing w:before="60" w:after="60"/>
-            </w:pPr>
-            <w:r>
-              <w:rPr>
-                <w:color w:val="24292F"/>
-              </w:rPr>
-              <w:t xml:space="preserve">Claude gửi link Design System + tóm tắt màu, font, component → Duyệt · Sửa</w:t>
-            </w:r>
-          </w:p>
-        </w:tc>
-      </w:tr>
-      <w:tr>
-        <w:tc>
-          <w:tcPr>
-            <w:tcW w:w="2900" w:type="dxa"/>
-            <w:tcBorders>
-              <w:top w:val="single" w:sz="4" w:space="0" w:color="D0D7DE"/>
-              <w:left w:val="single" w:sz="4" w:space="0" w:color="D0D7DE"/>
-              <w:bottom w:val="single" w:sz="4" w:space="0" w:color="D0D7DE"/>
-              <w:right w:val="single" w:sz="4" w:space="0" w:color="D0D7DE"/>
-            </w:tcBorders>
-            <w:tcMar>
-              <w:top w:w="100" w:type="dxa"/>
-              <w:left w:w="140" w:type="dxa"/>
-              <w:bottom w:w="100" w:type="dxa"/>
-              <w:right w:w="140" w:type="dxa"/>
-            </w:tcMar>
-          </w:tcPr>
-          <w:p>
-            <w:pPr>
-              <w:spacing w:before="60" w:after="60"/>
-            </w:pPr>
-            <w:r>
-              <w:rPr>
-                <w:b/>
-                <w:bCs/>
-                <w:color w:val="24292F"/>
-              </w:rPr>
-              <w:t>4. Tài liệu ở đâu? · Tài liệu khác?</w:t>
-            </w:r>
-          </w:p>
-        </w:tc>
-        <w:tc>
-          <w:tcPr>
-            <w:tcW w:w="6846" w:type="dxa"/>
-            <w:tcBorders>
-              <w:top w:val="single" w:sz="4" w:space="0" w:color="D0D7DE"/>
-              <w:left w:val="single" w:sz="4" w:space="0" w:color="D0D7DE"/>
-              <w:bottom w:val="single" w:sz="4" w:space="0" w:color="D0D7DE"/>
-              <w:right w:val="single" w:sz="4" w:space="0" w:color="D0D7DE"/>
-            </w:tcBorders>
-            <w:tcMar>
-              <w:top w:w="100" w:type="dxa"/>
-              <w:left w:w="140" w:type="dxa"/>
-              <w:bottom w:w="100" w:type="dxa"/>
-              <w:right w:w="140" w:type="dxa"/>
-            </w:tcMar>
-          </w:tcPr>
-          <w:p>
-            <w:pPr>
-              <w:spacing w:before="60" w:after="60"/>
-            </w:pPr>
-            <w:r>
-              <w:rPr>
-                <w:color w:val="24292F"/>
-              </w:rPr>
-              <w:t>Trong input (khuyến nghị) · Đường dẫn khác — Tài liệu: SPEC / yêu cầu · Figma wireframe · Ảnh · Không có</w:t>
-            </w:r>
-          </w:p>
-        </w:tc>
-      </w:tr>
-      <w:tr>
-        <w:tc>
-          <w:tcPr>
-            <w:tcW w:w="2900" w:type="dxa"/>
-            <w:tcBorders>
-              <w:top w:val="single" w:sz="4" w:space="0" w:color="D0D7DE"/>
-              <w:left w:val="single" w:sz="4" w:space="0" w:color="D0D7DE"/>
-              <w:bottom w:val="single" w:sz="4" w:space="0" w:color="D0D7DE"/>
-              <w:right w:val="single" w:sz="4" w:space="0" w:color="D0D7DE"/>
-            </w:tcBorders>
-            <w:tcMar>
-              <w:top w:w="100" w:type="dxa"/>
-              <w:left w:w="140" w:type="dxa"/>
-              <w:bottom w:w="100" w:type="dxa"/>
-              <w:right w:w="140" w:type="dxa"/>
-            </w:tcMar>
-          </w:tcPr>
-          <w:p>
-            <w:pPr>
-              <w:spacing w:before="60" w:after="60"/>
-            </w:pPr>
-            <w:r>
-              <w:rPr>
-                <w:b/>
-                <w:bCs/>
-                <w:color w:val="24292F"/>
-              </w:rPr>
-              <w:t>5. Muốn phân tích / vẽ gì?</w:t>
-            </w:r>
-          </w:p>
-        </w:tc>
-        <w:tc>
-          <w:tcPr>
-            <w:tcW w:w="6846" w:type="dxa"/>
-            <w:tcBorders>
-              <w:top w:val="single" w:sz="4" w:space="0" w:color="D0D7DE"/>
-              <w:left w:val="single" w:sz="4" w:space="0" w:color="D0D7DE"/>
-              <w:bottom w:val="single" w:sz="4" w:space="0" w:color="D0D7DE"/>
-              <w:right w:val="single" w:sz="4" w:space="0" w:color="D0D7DE"/>
-            </w:tcBorders>
-            <w:tcMar>
-              <w:top w:w="100" w:type="dxa"/>
-              <w:left w:w="140" w:type="dxa"/>
-              <w:bottom w:w="100" w:type="dxa"/>
-              <w:right w:w="140" w:type="dxa"/>
-            </w:tcMar>
-          </w:tcPr>
-          <w:p>
-            <w:pPr>
-              <w:spacing w:before="60" w:after="60"/>
-            </w:pPr>
-            <w:r>
-              <w:rPr>
-                <w:color w:val="24292F"/>
-              </w:rPr>
-              <w:t>Vẽ toàn bộ (khuyến nghị) · Chọn một số màn · Chỉ phân tích (chưa vẽ) · Vẽ 1 luồng cụ thể</w:t>
-            </w:r>
-          </w:p>
-        </w:tc>
-      </w:tr>
-      <w:tr>
-        <w:tc>
-          <w:tcPr>
-            <w:tcW w:w="2900" w:type="dxa"/>
-            <w:tcBorders>
-              <w:top w:val="single" w:sz="4" w:space="0" w:color="D0D7DE"/>
-              <w:left w:val="single" w:sz="4" w:space="0" w:color="D0D7DE"/>
-              <w:bottom w:val="single" w:sz="4" w:space="0" w:color="D0D7DE"/>
-              <w:right w:val="single" w:sz="4" w:space="0" w:color="D0D7DE"/>
-            </w:tcBorders>
-            <w:tcMar>
-              <w:top w:w="100" w:type="dxa"/>
-              <w:left w:w="140" w:type="dxa"/>
-              <w:bottom w:w="100" w:type="dxa"/>
-              <w:right w:w="140" w:type="dxa"/>
-            </w:tcMar>
-          </w:tcPr>
-          <w:p>
-            <w:pPr>
-              <w:spacing w:before="60" w:after="60"/>
-            </w:pPr>
-            <w:r>
-              <w:rPr>
-                <w:b/>
-                <w:bCs/>
-                <w:color w:val="24292F"/>
-              </w:rPr>
-              <w:t>6. Link Figma đầu ra? · Tên output?</w:t>
-            </w:r>
-          </w:p>
-        </w:tc>
-        <w:tc>
-          <w:tcPr>
-            <w:tcW w:w="6846" w:type="dxa"/>
-            <w:tcBorders>
-              <w:top w:val="single" w:sz="4" w:space="0" w:color="D0D7DE"/>
-              <w:left w:val="single" w:sz="4" w:space="0" w:color="D0D7DE"/>
-              <w:bottom w:val="single" w:sz="4" w:space="0" w:color="D0D7DE"/>
-              <w:right w:val="single" w:sz="4" w:space="0" w:color="D0D7DE"/>
-            </w:tcBorders>
-            <w:tcMar>
-              <w:top w:w="100" w:type="dxa"/>
-              <w:left w:w="140" w:type="dxa"/>
-              <w:bottom w:w="100" w:type="dxa"/>
-              <w:right w:w="140" w:type="dxa"/>
-            </w:tcMar>
-          </w:tcPr>
-          <w:p>
-            <w:pPr>
-              <w:spacing w:before="60" w:after="60"/>
-            </w:pPr>
-            <w:r>
-              <w:rPr>
-                <w:color w:val="24292F"/>
-              </w:rPr>
-              <w:t>Dán link (bắt buộc, có quyền EDIT) hoặc Tạo file mới — Tên: Claude đề xuất AI_Generate_&lt;tính năng&gt; · Tự đặt</w:t>
-            </w:r>
-          </w:p>
-        </w:tc>
-      </w:tr>
-      <w:tr>
-        <w:tc>
-          <w:tcPr>
-            <w:tcW w:w="2900" w:type="dxa"/>
-            <w:tcBorders>
-              <w:top w:val="single" w:sz="4" w:space="0" w:color="D0D7DE"/>
-              <w:left w:val="single" w:sz="4" w:space="0" w:color="D0D7DE"/>
-              <w:bottom w:val="single" w:sz="4" w:space="0" w:color="D0D7DE"/>
-              <w:right w:val="single" w:sz="4" w:space="0" w:color="D0D7DE"/>
-            </w:tcBorders>
-            <w:tcMar>
-              <w:top w:w="100" w:type="dxa"/>
-              <w:left w:w="140" w:type="dxa"/>
-              <w:bottom w:w="100" w:type="dxa"/>
-              <w:right w:w="140" w:type="dxa"/>
-            </w:tcMar>
-          </w:tcPr>
-          <w:p>
-            <w:pPr>
-              <w:spacing w:before="60" w:after="60"/>
-            </w:pPr>
-            <w:r>
-              <w:rPr>
-                <w:b/>
-                <w:bCs/>
-                <w:color w:val="24292F"/>
-              </w:rPr>
-              <w:t>7. Platform? · Ngôn ngữ tên màn?</w:t>
-            </w:r>
-          </w:p>
-        </w:tc>
-        <w:tc>
-          <w:tcPr>
-            <w:tcW w:w="6846" w:type="dxa"/>
-            <w:tcBorders>
-              <w:top w:val="single" w:sz="4" w:space="0" w:color="D0D7DE"/>
-              <w:left w:val="single" w:sz="4" w:space="0" w:color="D0D7DE"/>
-              <w:bottom w:val="single" w:sz="4" w:space="0" w:color="D0D7DE"/>
-              <w:right w:val="single" w:sz="4" w:space="0" w:color="D0D7DE"/>
-            </w:tcBorders>
-            <w:tcMar>
-              <w:top w:w="100" w:type="dxa"/>
-              <w:left w:w="140" w:type="dxa"/>
-              <w:bottom w:w="100" w:type="dxa"/>
-              <w:right w:w="140" w:type="dxa"/>
-            </w:tcMar>
-          </w:tcPr>
-          <w:p>
-            <w:pPr>
-              <w:spacing w:before="60" w:after="60"/>
-            </w:pPr>
-            <w:r>
-              <w:rPr>
-                <w:color w:val="24292F"/>
-              </w:rPr>
-              <w:t>Platform theo design system — Ngôn ngữ: vi + ja + en (khuyến nghị) · vi + ja · ja · vi</w:t>
-            </w:r>
-          </w:p>
-        </w:tc>
-      </w:tr>
-      <w:tr>
-        <w:tc>
-          <w:tcPr>
-            <w:tcW w:w="2900" w:type="dxa"/>
-            <w:tcBorders>
-              <w:top w:val="single" w:sz="4" w:space="0" w:color="D0D7DE"/>
-              <w:left w:val="single" w:sz="4" w:space="0" w:color="D0D7DE"/>
-              <w:bottom w:val="single" w:sz="4" w:space="0" w:color="D0D7DE"/>
-              <w:right w:val="single" w:sz="4" w:space="0" w:color="D0D7DE"/>
-            </w:tcBorders>
-            <w:tcMar>
-              <w:top w:w="100" w:type="dxa"/>
-              <w:left w:w="140" w:type="dxa"/>
-              <w:bottom w:w="100" w:type="dxa"/>
-              <w:right w:w="140" w:type="dxa"/>
-            </w:tcMar>
-          </w:tcPr>
-          <w:p>
-            <w:pPr>
-              <w:spacing w:before="60" w:after="60"/>
-            </w:pPr>
-            <w:r>
-              <w:rPr>
-                <w:b/>
-                <w:bCs/>
-                <w:color w:val="24292F"/>
-              </w:rPr>
-              <w:t>8. Duyệt danh sách màn?</w:t>
-            </w:r>
-          </w:p>
-        </w:tc>
-        <w:tc>
-          <w:tcPr>
-            <w:tcW w:w="6846" w:type="dxa"/>
-            <w:tcBorders>
-              <w:top w:val="single" w:sz="4" w:space="0" w:color="D0D7DE"/>
-              <w:left w:val="single" w:sz="4" w:space="0" w:color="D0D7DE"/>
-              <w:bottom w:val="single" w:sz="4" w:space="0" w:color="D0D7DE"/>
-              <w:right w:val="single" w:sz="4" w:space="0" w:color="D0D7DE"/>
-            </w:tcBorders>
-            <w:tcMar>
-              <w:top w:w="100" w:type="dxa"/>
-              <w:left w:w="140" w:type="dxa"/>
-              <w:bottom w:w="100" w:type="dxa"/>
-              <w:right w:w="140" w:type="dxa"/>
-            </w:tcMar>
-          </w:tcPr>
-          <w:p>
-            <w:pPr>
-              <w:spacing w:before="60" w:after="60"/>
-            </w:pPr>
-            <w:r>
-              <w:rPr>
-                <w:color w:val="24292F"/>
-              </w:rPr>
-              <w:t>Claude liệt kê các màn + popup / toast / lỗi → Duyệt · Sửa danh sách</w:t>
-            </w:r>
-          </w:p>
-        </w:tc>
-      </w:tr>
-    </w:tbl>
-    <w:p>
-      <w:pPr>
-        <w:spacing w:before="120" w:after="40"/>
-        <w:jc w:val="center"/>
-      </w:pPr>
-      <w:r>
-        <w:rPr>
-          <w:noProof/>
-        </w:rPr>
-        <w:lastRenderedPageBreak/>
-        <w:drawing>
-          <wp:inline distT="0" distB="0" distL="0" distR="0">
-            <wp:extent cx="5905500" cy="2047875"/>
-            <wp:effectExtent l="0" t="0" r="0" b="0"/>
-            <wp:docPr id="9" name="gen/g_ask.png" descr="Hình minh họa — hộp chọn design system và phạm vi" title="Hình minh họa — hộp chọn design system và phạm vi"/>
-            <wp:cNvGraphicFramePr>
-              <a:graphicFrameLocks xmlns:a="http://schemas.openxmlformats.org/drawingml/2006/main" noChangeAspect="1"/>
-            </wp:cNvGraphicFramePr>
-            <a:graphic xmlns:a="http://schemas.openxmlformats.org/drawingml/2006/main">
-              <a:graphicData uri="http://schemas.openxmlformats.org/drawingml/2006/picture">
-                <pic:pic xmlns:pic="http://schemas.openxmlformats.org/drawingml/2006/picture">
-                  <pic:nvPicPr>
-                    <pic:cNvPr id="0" name=""/>
-                    <pic:cNvPicPr>
-                      <a:picLocks noChangeAspect="1" noChangeArrowheads="1"/>
-                    </pic:cNvPicPr>
-                  </pic:nvPicPr>
-                  <pic:blipFill>
-                    <a:blip r:embed="rId15"/>
-                    <a:srcRect/>
-                    <a:stretch>
-                      <a:fillRect/>
-                    </a:stretch>
-                  </pic:blipFill>
-                  <pic:spPr bwMode="auto">
-                    <a:xfrm>
-                      <a:off x="0" y="0"/>
-                      <a:ext cx="5905500" cy="2047875"/>
-                    </a:xfrm>
-                    <a:prstGeom prst="rect">
-                      <a:avLst/>
-                    </a:prstGeom>
-                  </pic:spPr>
-                </pic:pic>
-              </a:graphicData>
-            </a:graphic>
-          </wp:inline>
-        </w:drawing>
-      </w:r>
-    </w:p>
-    <w:p>
-      <w:pPr>
-        <w:spacing w:before="60" w:after="160"/>
-        <w:jc w:val="center"/>
-      </w:pPr>
-      <w:r>
-        <w:rPr>
-          <w:i/>
-          <w:iCs/>
-          <w:color w:val="6E7781"/>
-          <w:sz w:val="18"/>
-          <w:szCs w:val="18"/>
-        </w:rPr>
-        <w:t>Hình minh họa — hộp chọn design system và phạm vi</w:t>
-      </w:r>
-    </w:p>
-    <w:p>
-      <w:pPr>
-        <w:spacing w:before="60" w:after="60"/>
-      </w:pPr>
-      <w:r>
-        <w:rPr>
-          <w:b/>
-          <w:bCs/>
-          <w:color w:val="24292F"/>
-        </w:rPr>
-        <w:t xml:space="preserve">Tên đa ngôn ngữ không bị cắt: </w:t>
-      </w:r>
-      <w:r>
-        <w:rPr>
-          <w:color w:val="24292F"/>
-        </w:rPr>
-        <w:t>Claude đặt tên layer 1 dòng và thêm nhãn chữ nhiều dòng (mỗi ngôn ngữ 1 dòng) ngay trên mỗi màn.</w:t>
-      </w:r>
-    </w:p>
-    <w:p>
-      <w:pPr>
-        <w:spacing w:before="120" w:after="40"/>
-        <w:jc w:val="center"/>
-      </w:pPr>
-      <w:r>
-        <w:rPr>
-          <w:noProof/>
-        </w:rPr>
-        <w:drawing>
-          <wp:inline distT="0" distB="0" distL="0" distR="0">
-            <wp:extent cx="5524500" cy="1733550"/>
-            <wp:effectExtent l="0" t="0" r="0" b="0"/>
-            <wp:docPr id="10" name="gen/img3_naming.png" descr="Trái: tên 1 dòng bị cắt — Phải: nhãn nhiều dòng đầy đủ" title="Trái: tên 1 dòng bị cắt — Phải: nhãn nhiều dòng đầy đủ"/>
-            <wp:cNvGraphicFramePr>
-              <a:graphicFrameLocks xmlns:a="http://schemas.openxmlformats.org/drawingml/2006/main" noChangeAspect="1"/>
-            </wp:cNvGraphicFramePr>
-            <a:graphic xmlns:a="http://schemas.openxmlformats.org/drawingml/2006/main">
-              <a:graphicData uri="http://schemas.openxmlformats.org/drawingml/2006/picture">
-                <pic:pic xmlns:pic="http://schemas.openxmlformats.org/drawingml/2006/picture">
-                  <pic:nvPicPr>
-                    <pic:cNvPr id="0" name=""/>
-                    <pic:cNvPicPr>
-                      <a:picLocks noChangeAspect="1" noChangeArrowheads="1"/>
-                    </pic:cNvPicPr>
-                  </pic:nvPicPr>
-                  <pic:blipFill>
-                    <a:blip r:embed="rId16"/>
-                    <a:srcRect/>
-                    <a:stretch>
-                      <a:fillRect/>
-                    </a:stretch>
-                  </pic:blipFill>
-                  <pic:spPr bwMode="auto">
-                    <a:xfrm>
-                      <a:off x="0" y="0"/>
-                      <a:ext cx="5524500" cy="1733550"/>
-                    </a:xfrm>
-                    <a:prstGeom prst="rect">
-                      <a:avLst/>
-                    </a:prstGeom>
-                  </pic:spPr>
-                </pic:pic>
-              </a:graphicData>
-            </a:graphic>
-          </wp:inline>
-        </w:drawing>
-      </w:r>
-    </w:p>
-    <w:p>
-      <w:pPr>
-        <w:spacing w:before="60" w:after="160"/>
-        <w:jc w:val="center"/>
-      </w:pPr>
-      <w:r>
-        <w:rPr>
-          <w:i/>
-          <w:iCs/>
-          <w:color w:val="6E7781"/>
-          <w:sz w:val="18"/>
-          <w:szCs w:val="18"/>
-        </w:rPr>
-        <w:t>Trái: tên 1 dòng bị cắt — Phải: nhãn nhiều dòng đầy đủ</w:t>
-      </w:r>
-    </w:p>
-    <w:p>
-      <w:pPr>
-        <w:keepNext/>
-        <w:spacing w:after="120"/>
-      </w:pPr>
-    </w:p>
-    <w:tbl>
-      <w:tblPr>
-        <w:tblW w:w="9746" w:type="dxa"/>
-        <w:tblBorders>
-          <w:top w:val="single" w:sz="4" w:space="0" w:color="auto"/>
-          <w:left w:val="single" w:sz="4" w:space="0" w:color="auto"/>
-          <w:bottom w:val="single" w:sz="4" w:space="0" w:color="auto"/>
-          <w:right w:val="single" w:sz="4" w:space="0" w:color="auto"/>
-          <w:insideH w:val="single" w:sz="4" w:space="0" w:color="auto"/>
-          <w:insideV w:val="single" w:sz="4" w:space="0" w:color="auto"/>
-        </w:tblBorders>
-        <w:tblCellMar>
-          <w:left w:w="10" w:type="dxa"/>
-          <w:right w:w="10" w:type="dxa"/>
-        </w:tblCellMar>
-        <w:tblLook w:val="04A0" w:firstRow="1" w:lastRow="0" w:firstColumn="1" w:lastColumn="0" w:noHBand="0" w:noVBand="1"/>
-      </w:tblPr>
-      <w:tblGrid>
-        <w:gridCol w:w="9746"/>
-      </w:tblGrid>
-      <w:tr>
-        <w:tc>
-          <w:tcPr>
-            <w:tcW w:w="9746" w:type="dxa"/>
-            <w:tcBorders>
-              <w:top w:val="single" w:sz="4" w:space="0" w:color="0969DA"/>
-              <w:left w:val="single" w:sz="4" w:space="0" w:color="0969DA"/>
-              <w:bottom w:val="single" w:sz="4" w:space="0" w:color="0969DA"/>
-              <w:right w:val="single" w:sz="4" w:space="0" w:color="0969DA"/>
-            </w:tcBorders>
-            <w:shd w:val="clear" w:color="auto" w:fill="0969DA"/>
-            <w:tcMar>
-              <w:top w:w="100" w:type="dxa"/>
-              <w:left w:w="140" w:type="dxa"/>
-              <w:bottom w:w="100" w:type="dxa"/>
-              <w:right w:w="140" w:type="dxa"/>
-            </w:tcMar>
-          </w:tcPr>
-          <w:p>
-            <w:pPr>
-              <w:keepNext/>
-              <w:spacing w:before="40" w:after="40"/>
-            </w:pPr>
-            <w:r>
-              <w:rPr>
-                <w:b/>
-                <w:bCs/>
-                <w:color w:val="FFFFFF"/>
-                <w:sz w:val="26"/>
-                <w:szCs w:val="26"/>
-              </w:rPr>
-              <w:t>BƯỚC 8 — ĐỢI VÀ KIỂM TRA KẾT QUẢ TRÊN FIGMA</w:t>
-            </w:r>
-          </w:p>
-        </w:tc>
-      </w:tr>
-    </w:tbl>
-    <w:p>
-      <w:pPr>
-        <w:keepNext/>
-        <w:spacing w:after="80"/>
-      </w:pPr>
-    </w:p>
-    <w:p>
-      <w:pPr>
-        <w:spacing w:before="60" w:after="60"/>
-      </w:pPr>
-      <w:r>
-        <w:rPr>
-          <w:color w:val="24292F"/>
-        </w:rPr>
-        <w:t>Khi xong, Claude trả về link Figma và file báo cáo. Bấm link để mở đúng Section vừa vẽ, rồi kiểm tra:</w:t>
-      </w:r>
-    </w:p>
-    <w:p>
-      <w:pPr>
-        <w:pStyle w:val="ListParagraph"/>
-        <w:numPr>
-          <w:ilvl w:val="0"/>
-          <w:numId w:val="2"/>
-        </w:numPr>
-        <w:spacing w:before="20" w:after="20"/>
-      </w:pPr>
-      <w:r>
-        <w:rPr>
-          <w:color w:val="24292F"/>
-        </w:rPr>
-        <w:t>Đủ các màn + popup / toast / màn lỗi / màn trống so với tài liệu nguồn</w:t>
-      </w:r>
-    </w:p>
-    <w:p>
-      <w:pPr>
-        <w:pStyle w:val="ListParagraph"/>
-        <w:numPr>
-          <w:ilvl w:val="0"/>
-          <w:numId w:val="2"/>
-        </w:numPr>
-        <w:spacing w:before="20" w:after="20"/>
-      </w:pPr>
-      <w:r>
-        <w:rPr>
-          <w:color w:val="24292F"/>
-        </w:rPr>
-        <w:t>Đúng màu, font, kích thước theo design system</w:t>
-      </w:r>
-    </w:p>
-    <w:p>
-      <w:pPr>
-        <w:pStyle w:val="ListParagraph"/>
-        <w:numPr>
-          <w:ilvl w:val="0"/>
-          <w:numId w:val="2"/>
-        </w:numPr>
-        <w:spacing w:before="20" w:after="20"/>
-      </w:pPr>
-      <w:r>
-        <w:rPr>
-          <w:color w:val="24292F"/>
-        </w:rPr>
-        <w:t>Component là component thật của library dự án</w:t>
-      </w:r>
-    </w:p>
-    <w:p>
-      <w:pPr>
-        <w:pStyle w:val="ListParagraph"/>
-        <w:numPr>
-          <w:ilvl w:val="0"/>
-          <w:numId w:val="2"/>
-        </w:numPr>
-        <w:spacing w:before="20" w:after="20"/>
-      </w:pPr>
-      <w:r>
-        <w:rPr>
-          <w:color w:val="24292F"/>
-        </w:rPr>
-        <w:t>Tên màn hình đủ ngôn ngữ, không bị cắt chữ</w:t>
-      </w:r>
-    </w:p>
-    <w:p>
-      <w:pPr>
-        <w:pStyle w:val="ListParagraph"/>
-        <w:numPr>
-          <w:ilvl w:val="0"/>
-          <w:numId w:val="2"/>
-        </w:numPr>
-        <w:spacing w:before="20" w:after="20"/>
-      </w:pPr>
-      <w:r>
-        <w:rPr>
-          <w:color w:val="24292F"/>
-        </w:rPr>
-        <w:t>Báo cáo: mở folder output → figma-screens.md (danh sách màn + link Figma + điểm cần xác nhận)</w:t>
-      </w:r>
-    </w:p>
-    <w:p>
-      <w:pPr>
-        <w:spacing w:before="120" w:after="40"/>
-        <w:jc w:val="center"/>
-      </w:pPr>
-      <w:r>
-        <w:rPr>
-          <w:noProof/>
-        </w:rPr>
-        <w:lastRenderedPageBreak/>
-        <w:drawing>
-          <wp:inline distT="0" distB="0" distL="0" distR="0">
-            <wp:extent cx="5905500" cy="2695575"/>
-            <wp:effectExtent l="0" t="0" r="0" b="0"/>
-            <wp:docPr id="11" name="gen/s7g.png" descr="Hình minh họa — Bước 8" title="Hình minh họa — Bước 8"/>
-            <wp:cNvGraphicFramePr>
-              <a:graphicFrameLocks xmlns:a="http://schemas.openxmlformats.org/drawingml/2006/main" noChangeAspect="1"/>
-            </wp:cNvGraphicFramePr>
-            <a:graphic xmlns:a="http://schemas.openxmlformats.org/drawingml/2006/main">
-              <a:graphicData uri="http://schemas.openxmlformats.org/drawingml/2006/picture">
-                <pic:pic xmlns:pic="http://schemas.openxmlformats.org/drawingml/2006/picture">
-                  <pic:nvPicPr>
-                    <pic:cNvPr id="0" name=""/>
-                    <pic:cNvPicPr>
-                      <a:picLocks noChangeAspect="1" noChangeArrowheads="1"/>
-                    </pic:cNvPicPr>
-                  </pic:nvPicPr>
-                  <pic:blipFill>
-                    <a:blip r:embed="rId17"/>
-                    <a:srcRect/>
-                    <a:stretch>
-                      <a:fillRect/>
-                    </a:stretch>
-                  </pic:blipFill>
-                  <pic:spPr bwMode="auto">
-                    <a:xfrm>
-                      <a:off x="0" y="0"/>
-                      <a:ext cx="5905500" cy="2695575"/>
-                    </a:xfrm>
-                    <a:prstGeom prst="rect">
-                      <a:avLst/>
-                    </a:prstGeom>
-                  </pic:spPr>
-                </pic:pic>
-              </a:graphicData>
-            </a:graphic>
-          </wp:inline>
-        </w:drawing>
-      </w:r>
-    </w:p>
-    <w:p>
-      <w:pPr>
-        <w:spacing w:before="60" w:after="160"/>
-        <w:jc w:val="center"/>
-      </w:pPr>
-      <w:r>
-        <w:rPr>
-          <w:i/>
-          <w:iCs/>
-          <w:color w:val="6E7781"/>
-          <w:sz w:val="18"/>
-          <w:szCs w:val="18"/>
-        </w:rPr>
-        <w:t>Hình minh họa — Bước 8</w:t>
-      </w:r>
-    </w:p>
-    <w:p>
-      <w:pPr>
-        <w:keepNext/>
-        <w:spacing w:after="120"/>
-      </w:pPr>
-    </w:p>
-    <w:tbl>
-      <w:tblPr>
-        <w:tblW w:w="9746" w:type="dxa"/>
-        <w:tblBorders>
-          <w:top w:val="single" w:sz="4" w:space="0" w:color="auto"/>
-          <w:left w:val="single" w:sz="4" w:space="0" w:color="auto"/>
-          <w:bottom w:val="single" w:sz="4" w:space="0" w:color="auto"/>
-          <w:right w:val="single" w:sz="4" w:space="0" w:color="auto"/>
-          <w:insideH w:val="single" w:sz="4" w:space="0" w:color="auto"/>
-          <w:insideV w:val="single" w:sz="4" w:space="0" w:color="auto"/>
-        </w:tblBorders>
-        <w:tblCellMar>
-          <w:left w:w="10" w:type="dxa"/>
-          <w:right w:w="10" w:type="dxa"/>
-        </w:tblCellMar>
-        <w:tblLook w:val="04A0" w:firstRow="1" w:lastRow="0" w:firstColumn="1" w:lastColumn="0" w:noHBand="0" w:noVBand="1"/>
-      </w:tblPr>
-      <w:tblGrid>
-        <w:gridCol w:w="9746"/>
-      </w:tblGrid>
-      <w:tr>
-        <w:tc>
-          <w:tcPr>
-            <w:tcW w:w="9746" w:type="dxa"/>
-            <w:tcBorders>
-              <w:top w:val="single" w:sz="4" w:space="0" w:color="0969DA"/>
-              <w:left w:val="single" w:sz="4" w:space="0" w:color="0969DA"/>
-              <w:bottom w:val="single" w:sz="4" w:space="0" w:color="0969DA"/>
-              <w:right w:val="single" w:sz="4" w:space="0" w:color="0969DA"/>
-            </w:tcBorders>
-            <w:shd w:val="clear" w:color="auto" w:fill="0969DA"/>
-            <w:tcMar>
-              <w:top w:w="100" w:type="dxa"/>
-              <w:left w:w="140" w:type="dxa"/>
-              <w:bottom w:w="100" w:type="dxa"/>
-              <w:right w:w="140" w:type="dxa"/>
-            </w:tcMar>
-          </w:tcPr>
-          <w:p>
-            <w:pPr>
-              <w:keepNext/>
-              <w:spacing w:before="40" w:after="40"/>
-            </w:pPr>
-            <w:r>
-              <w:rPr>
-                <w:b/>
-                <w:bCs/>
-                <w:color w:val="FFFFFF"/>
-                <w:sz w:val="26"/>
-                <w:szCs w:val="26"/>
-              </w:rPr>
-              <w:t>BƯỚC 9 — SỬA MÀN / CẬP NHẬT DESIGN SYSTEM</w:t>
-            </w:r>
-          </w:p>
-        </w:tc>
-      </w:tr>
-    </w:tbl>
-    <w:p>
-      <w:pPr>
-        <w:keepNext/>
-        <w:spacing w:after="80"/>
-      </w:pPr>
-    </w:p>
-    <w:p>
-      <w:pPr>
-        <w:pStyle w:val="Heading2"/>
-        <w:keepNext/>
-        <w:spacing w:before="240" w:after="100"/>
-      </w:pPr>
-      <w:r>
-        <w:rPr>
-          <w:b/>
-          <w:bCs/>
-          <w:color w:val="D86107"/>
-        </w:rPr>
-        <w:t>Sửa 1 màn</w:t>
-      </w:r>
-    </w:p>
-    <w:p>
-      <w:pPr>
-        <w:pStyle w:val="ListParagraph"/>
-        <w:numPr>
-          <w:ilvl w:val="0"/>
-          <w:numId w:val="9"/>
-        </w:numPr>
-        <w:spacing w:before="20" w:after="20"/>
-      </w:pPr>
-      <w:r>
-        <w:rPr>
-          <w:color w:val="24292F"/>
-        </w:rPr>
-        <w:t xml:space="preserve">Trong Figma, chuột phải vào frame cần sửa → </w:t>
-      </w:r>
-      <w:r>
-        <w:rPr>
-          <w:b/>
-          <w:bCs/>
-          <w:color w:val="24292F"/>
-        </w:rPr>
-        <w:t>Copy link to selection</w:t>
-      </w:r>
-      <w:r>
-        <w:rPr>
-          <w:color w:val="24292F"/>
-        </w:rPr>
-        <w:t>.</w:t>
-      </w:r>
-    </w:p>
-    <w:p>
-      <w:pPr>
-        <w:pStyle w:val="ListParagraph"/>
-        <w:numPr>
-          <w:ilvl w:val="0"/>
-          <w:numId w:val="9"/>
-        </w:numPr>
-        <w:spacing w:before="20" w:after="20"/>
-      </w:pPr>
-      <w:r>
-        <w:rPr>
-          <w:color w:val="24292F"/>
-        </w:rPr>
-        <w:t>Dán vào ô chat Claude kèm nội dung cần sửa:</w:t>
-      </w:r>
-    </w:p>
-    <w:tbl>
-      <w:tblPr>
-        <w:tblW w:w="9746" w:type="dxa"/>
-        <w:tblBorders>
-          <w:top w:val="single" w:sz="4" w:space="0" w:color="auto"/>
-          <w:left w:val="single" w:sz="4" w:space="0" w:color="auto"/>
-          <w:bottom w:val="single" w:sz="4" w:space="0" w:color="auto"/>
-          <w:right w:val="single" w:sz="4" w:space="0" w:color="auto"/>
-          <w:insideH w:val="single" w:sz="4" w:space="0" w:color="auto"/>
-          <w:insideV w:val="single" w:sz="4" w:space="0" w:color="auto"/>
-        </w:tblBorders>
-        <w:tblCellMar>
-          <w:left w:w="10" w:type="dxa"/>
-          <w:right w:w="10" w:type="dxa"/>
-        </w:tblCellMar>
-        <w:tblLook w:val="04A0" w:firstRow="1" w:lastRow="0" w:firstColumn="1" w:lastColumn="0" w:noHBand="0" w:noVBand="1"/>
-      </w:tblPr>
-      <w:tblGrid>
-        <w:gridCol w:w="9746"/>
-      </w:tblGrid>
-      <w:tr>
-        <w:tc>
-          <w:tcPr>
-            <w:tcW w:w="9746" w:type="dxa"/>
-            <w:tcBorders>
-              <w:top w:val="single" w:sz="4" w:space="0" w:color="97D3FF"/>
-              <w:left w:val="single" w:sz="4" w:space="0" w:color="97D3FF"/>
-              <w:bottom w:val="single" w:sz="4" w:space="0" w:color="97D3FF"/>
-              <w:right w:val="single" w:sz="4" w:space="0" w:color="97D3FF"/>
-            </w:tcBorders>
-            <w:shd w:val="clear" w:color="auto" w:fill="E5F6FF"/>
-            <w:tcMar>
-              <w:top w:w="100" w:type="dxa"/>
-              <w:left w:w="140" w:type="dxa"/>
-              <w:bottom w:w="100" w:type="dxa"/>
-              <w:right w:w="140" w:type="dxa"/>
-            </w:tcMar>
-          </w:tcPr>
-          <w:p>
-            <w:pPr>
-              <w:spacing w:before="60" w:after="40"/>
-            </w:pPr>
-            <w:r>
-              <w:rPr>
-                <w:b/>
-                <w:bCs/>
-                <w:color w:val="6E7781"/>
-                <w:sz w:val="16"/>
-                <w:szCs w:val="16"/>
-              </w:rPr>
-              <w:t>PROMPT MẪU</w:t>
-            </w:r>
-          </w:p>
-          <w:p>
-            <w:pPr>
-              <w:spacing w:after="20"/>
-            </w:pPr>
-            <w:r>
-              <w:rPr>
-                <w:b/>
-                <w:bCs/>
-                <w:color w:val="0969DA"/>
-                <w:sz w:val="24"/>
-                <w:szCs w:val="24"/>
-              </w:rPr>
-              <w:t>Sửa màn &lt;link Figma frame&gt;: thêm cột Ngày duyệt vào bảng</w:t>
-            </w:r>
-          </w:p>
-        </w:tc>
-      </w:tr>
-    </w:tbl>
-    <w:p>
-      <w:pPr>
-        <w:keepNext/>
-        <w:spacing w:after="60"/>
-      </w:pPr>
-    </w:p>
-    <w:tbl>
-      <w:tblPr>
-        <w:tblW w:w="9746" w:type="dxa"/>
-        <w:tblBorders>
-          <w:top w:val="single" w:sz="4" w:space="0" w:color="auto"/>
-          <w:left w:val="single" w:sz="4" w:space="0" w:color="auto"/>
-          <w:bottom w:val="single" w:sz="4" w:space="0" w:color="auto"/>
-          <w:right w:val="single" w:sz="4" w:space="0" w:color="auto"/>
-          <w:insideH w:val="single" w:sz="4" w:space="0" w:color="auto"/>
-          <w:insideV w:val="single" w:sz="4" w:space="0" w:color="auto"/>
-        </w:tblBorders>
-        <w:tblCellMar>
-          <w:left w:w="10" w:type="dxa"/>
-          <w:right w:w="10" w:type="dxa"/>
-        </w:tblCellMar>
-        <w:tblLook w:val="04A0" w:firstRow="1" w:lastRow="0" w:firstColumn="1" w:lastColumn="0" w:noHBand="0" w:noVBand="1"/>
-      </w:tblPr>
-      <w:tblGrid>
-        <w:gridCol w:w="9746"/>
-      </w:tblGrid>
-      <w:tr>
-        <w:tc>
-          <w:tcPr>
-            <w:tcW w:w="9746" w:type="dxa"/>
-            <w:tcBorders>
-              <w:top w:val="single" w:sz="4" w:space="0" w:color="FDDA8A"/>
-              <w:left w:val="single" w:sz="4" w:space="0" w:color="FDDA8A"/>
-              <w:bottom w:val="single" w:sz="4" w:space="0" w:color="FDDA8A"/>
-              <w:right w:val="single" w:sz="4" w:space="0" w:color="FDDA8A"/>
-            </w:tcBorders>
-            <w:shd w:val="clear" w:color="auto" w:fill="FFF9EB"/>
-            <w:tcMar>
-              <w:top w:w="100" w:type="dxa"/>
-              <w:left w:w="140" w:type="dxa"/>
-              <w:bottom w:w="100" w:type="dxa"/>
-              <w:right w:w="140" w:type="dxa"/>
-            </w:tcMar>
-          </w:tcPr>
-          <w:p>
-            <w:pPr>
-              <w:spacing w:before="60" w:after="60"/>
-            </w:pPr>
-            <w:r>
-              <w:rPr>
-                <w:b/>
-                <w:bCs/>
-                <w:color w:val="D86107"/>
-              </w:rPr>
-              <w:t xml:space="preserve">Lưu ý: </w:t>
-            </w:r>
-            <w:r>
-              <w:rPr>
-                <w:color w:val="24292F"/>
-              </w:rPr>
-              <w:t>Claude chỉ sửa đúng màn được chỉ định, không vẽ lại toàn bộ.</w:t>
-            </w:r>
-          </w:p>
-        </w:tc>
-      </w:tr>
-    </w:tbl>
-    <w:p>
-      <w:pPr>
-        <w:pStyle w:val="Heading2"/>
-        <w:keepNext/>
-        <w:spacing w:before="240" w:after="100"/>
-      </w:pPr>
-      <w:r>
-        <w:rPr>
-          <w:b/>
-          <w:bCs/>
-          <w:color w:val="D86107"/>
-        </w:rPr>
-        <w:t>Cập nhật design system</w:t>
-      </w:r>
-    </w:p>
-    <w:tbl>
-      <w:tblPr>
-        <w:tblW w:w="9746" w:type="dxa"/>
-        <w:tblBorders>
-          <w:top w:val="single" w:sz="4" w:space="0" w:color="auto"/>
-          <w:left w:val="single" w:sz="4" w:space="0" w:color="auto"/>
-          <w:bottom w:val="single" w:sz="4" w:space="0" w:color="auto"/>
-          <w:right w:val="single" w:sz="4" w:space="0" w:color="auto"/>
-          <w:insideH w:val="single" w:sz="4" w:space="0" w:color="auto"/>
-          <w:insideV w:val="single" w:sz="4" w:space="0" w:color="auto"/>
-        </w:tblBorders>
-        <w:tblCellMar>
-          <w:left w:w="10" w:type="dxa"/>
-          <w:right w:w="10" w:type="dxa"/>
-        </w:tblCellMar>
-        <w:tblLook w:val="04A0" w:firstRow="1" w:lastRow="0" w:firstColumn="1" w:lastColumn="0" w:noHBand="0" w:noVBand="1"/>
-      </w:tblPr>
-      <w:tblGrid>
-        <w:gridCol w:w="9746"/>
-      </w:tblGrid>
-      <w:tr>
-        <w:tc>
-          <w:tcPr>
-            <w:tcW w:w="9746" w:type="dxa"/>
-            <w:tcBorders>
-              <w:top w:val="single" w:sz="4" w:space="0" w:color="97D3FF"/>
-              <w:left w:val="single" w:sz="4" w:space="0" w:color="97D3FF"/>
-              <w:bottom w:val="single" w:sz="4" w:space="0" w:color="97D3FF"/>
-              <w:right w:val="single" w:sz="4" w:space="0" w:color="97D3FF"/>
-            </w:tcBorders>
-            <w:shd w:val="clear" w:color="auto" w:fill="E5F6FF"/>
-            <w:tcMar>
-              <w:top w:w="100" w:type="dxa"/>
-              <w:left w:w="140" w:type="dxa"/>
-              <w:bottom w:w="100" w:type="dxa"/>
-              <w:right w:w="140" w:type="dxa"/>
-            </w:tcMar>
-          </w:tcPr>
-          <w:p>
-            <w:pPr>
-              <w:spacing w:before="60" w:after="40"/>
-            </w:pPr>
-            <w:r>
-              <w:rPr>
-                <w:b/>
-                <w:bCs/>
-                <w:color w:val="6E7781"/>
-                <w:sz w:val="16"/>
-                <w:szCs w:val="16"/>
-              </w:rPr>
-              <w:t>PROMPT MẪU</w:t>
-            </w:r>
-          </w:p>
-          <w:p>
-            <w:pPr>
-              <w:spacing w:after="20"/>
-            </w:pPr>
-            <w:r>
-              <w:rPr>
-                <w:b/>
-                <w:bCs/>
-                <w:color w:val="0969DA"/>
-                <w:sz w:val="24"/>
-                <w:szCs w:val="24"/>
-              </w:rPr>
-              <w:t>Cập nhật design system: màu chính đổi thành &lt;mã màu&gt;, theo &lt;link Figma&gt;</w:t>
-            </w:r>
-          </w:p>
-        </w:tc>
-      </w:tr>
-    </w:tbl>
-    <w:p>
-      <w:pPr>
-        <w:keepNext/>
-        <w:spacing w:after="60"/>
-      </w:pPr>
-    </w:p>
-    <w:tbl>
-      <w:tblPr>
-        <w:tblW w:w="9746" w:type="dxa"/>
-        <w:tblBorders>
-          <w:top w:val="single" w:sz="4" w:space="0" w:color="auto"/>
-          <w:left w:val="single" w:sz="4" w:space="0" w:color="auto"/>
-          <w:bottom w:val="single" w:sz="4" w:space="0" w:color="auto"/>
-          <w:right w:val="single" w:sz="4" w:space="0" w:color="auto"/>
-          <w:insideH w:val="single" w:sz="4" w:space="0" w:color="auto"/>
-          <w:insideV w:val="single" w:sz="4" w:space="0" w:color="auto"/>
-        </w:tblBorders>
-        <w:tblCellMar>
-          <w:left w:w="10" w:type="dxa"/>
-          <w:right w:w="10" w:type="dxa"/>
-        </w:tblCellMar>
-        <w:tblLook w:val="04A0" w:firstRow="1" w:lastRow="0" w:firstColumn="1" w:lastColumn="0" w:noHBand="0" w:noVBand="1"/>
-      </w:tblPr>
-      <w:tblGrid>
-        <w:gridCol w:w="9746"/>
-      </w:tblGrid>
-      <w:tr>
-        <w:tc>
-          <w:tcPr>
-            <w:tcW w:w="9746" w:type="dxa"/>
-            <w:tcBorders>
-              <w:top w:val="single" w:sz="4" w:space="0" w:color="FDDA8A"/>
-              <w:left w:val="single" w:sz="4" w:space="0" w:color="FDDA8A"/>
-              <w:bottom w:val="single" w:sz="4" w:space="0" w:color="FDDA8A"/>
-              <w:right w:val="single" w:sz="4" w:space="0" w:color="FDDA8A"/>
-            </w:tcBorders>
-            <w:shd w:val="clear" w:color="auto" w:fill="FFF9EB"/>
-            <w:tcMar>
-              <w:top w:w="100" w:type="dxa"/>
-              <w:left w:w="140" w:type="dxa"/>
-              <w:bottom w:w="100" w:type="dxa"/>
-              <w:right w:w="140" w:type="dxa"/>
-            </w:tcMar>
-          </w:tcPr>
-          <w:p>
-            <w:pPr>
-              <w:spacing w:before="60" w:after="60"/>
-            </w:pPr>
-            <w:r>
-              <w:rPr>
-                <w:b/>
-                <w:bCs/>
-                <w:color w:val="D86107"/>
-              </w:rPr>
-              <w:t xml:space="preserve">Lưu ý: </w:t>
-            </w:r>
-            <w:r>
-              <w:rPr>
-                <w:color w:val="24292F"/>
-              </w:rPr>
-              <w:t>Claude cập nhật folder design-system, ghi lịch sử thay đổi và báo các màn đã vẽ bị ảnh hưởng.</w:t>
-            </w:r>
-          </w:p>
-        </w:tc>
-      </w:tr>
-    </w:tbl>
     <w:p>
       <w:r>
         <w:br w:type="page"/>
@@ -5229,7 +3649,7 @@
         <w:rPr>
           <w:color w:val="24292F"/>
         </w:rPr>
-        <w:t>Gom toàn bộ quy định giao diện của dự án vào một link duy nhất. Designer duyệt một lần; agent và cả team dùng lại cho mọi màn sau, không phải hỏi lại.</w:t>
+        <w:t>Gom toàn bộ quy định giao diện của dự án vào một link duy nhất. Designer duyệt một lần; agent và cả team dùng lại cho mọi màn sau, không phải hỏi lại. Đã có artifact đúng định dạng thì Claude dùng chính link đó, không tạo thêm.</w:t>
       </w:r>
       <w:r>
         <w:rPr>
@@ -5243,7 +3663,7 @@
         </w:rPr>
         <w:t xml:space="preserve">Ví dụ &gt; </w:t>
       </w:r>
-      <w:hyperlink r:id="rId18" w:history="1">
+      <w:hyperlink r:id="rId15" w:history="1">
         <w:r>
           <w:rPr>
             <w:rStyle w:val="Hyperlink"/>
@@ -5276,6 +3696,203 @@
             <wp:extent cx="5905500" cy="2573110"/>
             <wp:effectExtent l="0" t="0" r="0" b="0"/>
             <wp:docPr id="201" name="output-201.png" descr="Trang artifact (bìa + các tab) và cấu trúc folder design-system/" title="Trang artifact (bìa + các tab) và cấu trúc folder design-system/"/>
+            <wp:cNvGraphicFramePr>
+              <a:graphicFrameLocks xmlns:a="http://schemas.openxmlformats.org/drawingml/2006/main" noChangeAspect="1"/>
+            </wp:cNvGraphicFramePr>
+            <a:graphic xmlns:a="http://schemas.openxmlformats.org/drawingml/2006/main">
+              <a:graphicData uri="http://schemas.openxmlformats.org/drawingml/2006/picture">
+                <pic:pic xmlns:pic="http://schemas.openxmlformats.org/drawingml/2006/picture">
+                  <pic:nvPicPr>
+                    <pic:cNvPr id="0" name=""/>
+                    <pic:cNvPicPr>
+                      <a:picLocks noChangeAspect="1" noChangeArrowheads="1"/>
+                    </pic:cNvPicPr>
+                  </pic:nvPicPr>
+                  <pic:blipFill>
+                    <a:blip r:embed="rId16"/>
+                    <a:srcRect/>
+                    <a:stretch>
+                      <a:fillRect/>
+                    </a:stretch>
+                  </pic:blipFill>
+                  <pic:spPr bwMode="auto">
+                    <a:xfrm>
+                      <a:off x="0" y="0"/>
+                      <a:ext cx="5905500" cy="2573110"/>
+                    </a:xfrm>
+                    <a:prstGeom prst="rect">
+                      <a:avLst/>
+                    </a:prstGeom>
+                  </pic:spPr>
+                </pic:pic>
+              </a:graphicData>
+            </a:graphic>
+          </wp:inline>
+        </w:drawing>
+      </w:r>
+    </w:p>
+    <w:p>
+      <w:pPr>
+        <w:spacing w:before="60" w:after="160"/>
+        <w:jc w:val="center"/>
+      </w:pPr>
+      <w:r>
+        <w:rPr>
+          <w:i/>
+          <w:iCs/>
+          <w:color w:val="6E7781"/>
+          <w:sz w:val="18"/>
+          <w:szCs w:val="18"/>
+        </w:rPr>
+        <w:t>Trang artifact (bìa + các tab) và cấu trúc folder design-system/</w:t>
+      </w:r>
+    </w:p>
+    <w:p>
+      <w:pPr>
+        <w:spacing w:before="120" w:after="40"/>
+        <w:jc w:val="center"/>
+      </w:pPr>
+      <w:r>
+        <w:rPr>
+          <w:noProof/>
+        </w:rPr>
+        <w:lastRenderedPageBreak/>
+        <w:drawing>
+          <wp:inline distT="0" distB="0" distL="0" distR="0">
+            <wp:extent cx="5905500" cy="3787956"/>
+            <wp:effectExtent l="0" t="0" r="0" b="0"/>
+            <wp:docPr id="202" name="output-202.png" descr="tokens.json — màu theo từng portal, thang chữ, spacing, radius, shadow" title="tokens.json — màu theo từng portal, thang chữ, spacing, radius, shadow"/>
+            <wp:cNvGraphicFramePr>
+              <a:graphicFrameLocks xmlns:a="http://schemas.openxmlformats.org/drawingml/2006/main" noChangeAspect="1"/>
+            </wp:cNvGraphicFramePr>
+            <a:graphic xmlns:a="http://schemas.openxmlformats.org/drawingml/2006/main">
+              <a:graphicData uri="http://schemas.openxmlformats.org/drawingml/2006/picture">
+                <pic:pic xmlns:pic="http://schemas.openxmlformats.org/drawingml/2006/picture">
+                  <pic:nvPicPr>
+                    <pic:cNvPr id="0" name=""/>
+                    <pic:cNvPicPr>
+                      <a:picLocks noChangeAspect="1" noChangeArrowheads="1"/>
+                    </pic:cNvPicPr>
+                  </pic:nvPicPr>
+                  <pic:blipFill>
+                    <a:blip r:embed="rId17"/>
+                    <a:srcRect/>
+                    <a:stretch>
+                      <a:fillRect/>
+                    </a:stretch>
+                  </pic:blipFill>
+                  <pic:spPr bwMode="auto">
+                    <a:xfrm>
+                      <a:off x="0" y="0"/>
+                      <a:ext cx="5905500" cy="3787956"/>
+                    </a:xfrm>
+                    <a:prstGeom prst="rect">
+                      <a:avLst/>
+                    </a:prstGeom>
+                  </pic:spPr>
+                </pic:pic>
+              </a:graphicData>
+            </a:graphic>
+          </wp:inline>
+        </w:drawing>
+      </w:r>
+    </w:p>
+    <w:p>
+      <w:pPr>
+        <w:spacing w:before="60" w:after="160"/>
+        <w:jc w:val="center"/>
+      </w:pPr>
+      <w:r>
+        <w:rPr>
+          <w:i/>
+          <w:iCs/>
+          <w:color w:val="6E7781"/>
+          <w:sz w:val="18"/>
+          <w:szCs w:val="18"/>
+        </w:rPr>
+        <w:t>tokens.json — màu theo từng portal, thang chữ, spacing, radius, shadow</w:t>
+      </w:r>
+    </w:p>
+    <w:p>
+      <w:pPr>
+        <w:spacing w:before="120" w:after="40"/>
+        <w:jc w:val="center"/>
+      </w:pPr>
+      <w:r>
+        <w:rPr>
+          <w:noProof/>
+        </w:rPr>
+        <w:drawing>
+          <wp:inline distT="0" distB="0" distL="0" distR="0">
+            <wp:extent cx="5905500" cy="4277269"/>
+            <wp:effectExtent l="0" t="0" r="0" b="0"/>
+            <wp:docPr id="203" name="output-203.png" descr="Component có hướng dẫn dùng và preview chạy thật" title="Component có hướng dẫn dùng và preview chạy thật"/>
+            <wp:cNvGraphicFramePr>
+              <a:graphicFrameLocks xmlns:a="http://schemas.openxmlformats.org/drawingml/2006/main" noChangeAspect="1"/>
+            </wp:cNvGraphicFramePr>
+            <a:graphic xmlns:a="http://schemas.openxmlformats.org/drawingml/2006/main">
+              <a:graphicData uri="http://schemas.openxmlformats.org/drawingml/2006/picture">
+                <pic:pic xmlns:pic="http://schemas.openxmlformats.org/drawingml/2006/picture">
+                  <pic:nvPicPr>
+                    <pic:cNvPr id="0" name=""/>
+                    <pic:cNvPicPr>
+                      <a:picLocks noChangeAspect="1" noChangeArrowheads="1"/>
+                    </pic:cNvPicPr>
+                  </pic:nvPicPr>
+                  <pic:blipFill>
+                    <a:blip r:embed="rId18"/>
+                    <a:srcRect/>
+                    <a:stretch>
+                      <a:fillRect/>
+                    </a:stretch>
+                  </pic:blipFill>
+                  <pic:spPr bwMode="auto">
+                    <a:xfrm>
+                      <a:off x="0" y="0"/>
+                      <a:ext cx="5905500" cy="4277269"/>
+                    </a:xfrm>
+                    <a:prstGeom prst="rect">
+                      <a:avLst/>
+                    </a:prstGeom>
+                  </pic:spPr>
+                </pic:pic>
+              </a:graphicData>
+            </a:graphic>
+          </wp:inline>
+        </w:drawing>
+      </w:r>
+    </w:p>
+    <w:p>
+      <w:pPr>
+        <w:spacing w:before="60" w:after="160"/>
+        <w:jc w:val="center"/>
+      </w:pPr>
+      <w:r>
+        <w:rPr>
+          <w:i/>
+          <w:iCs/>
+          <w:color w:val="6E7781"/>
+          <w:sz w:val="18"/>
+          <w:szCs w:val="18"/>
+        </w:rPr>
+        <w:t>Component có hướng dẫn dùng và preview chạy thật</w:t>
+      </w:r>
+    </w:p>
+    <w:p>
+      <w:pPr>
+        <w:spacing w:before="120" w:after="40"/>
+        <w:jc w:val="center"/>
+      </w:pPr>
+      <w:r>
+        <w:rPr>
+          <w:noProof/>
+        </w:rPr>
+        <w:lastRenderedPageBreak/>
+        <w:drawing>
+          <wp:inline distT="0" distB="0" distL="0" distR="0">
+            <wp:extent cx="5905500" cy="3692343"/>
+            <wp:effectExtent l="0" t="0" r="0" b="0"/>
+            <wp:docPr id="204" name="output-204.png" descr="README.md (luật sử dụng) + logo và bộ icon" title="README.md (luật sử dụng) + logo và bộ icon"/>
             <wp:cNvGraphicFramePr>
               <a:graphicFrameLocks xmlns:a="http://schemas.openxmlformats.org/drawingml/2006/main" noChangeAspect="1"/>
             </wp:cNvGraphicFramePr>
@@ -5298,7 +3915,7 @@
                   <pic:spPr bwMode="auto">
                     <a:xfrm>
                       <a:off x="0" y="0"/>
-                      <a:ext cx="5905500" cy="2573110"/>
+                      <a:ext cx="5905500" cy="3692343"/>
                     </a:xfrm>
                     <a:prstGeom prst="rect">
                       <a:avLst/>
@@ -5324,7 +3941,43 @@
           <w:sz w:val="18"/>
           <w:szCs w:val="18"/>
         </w:rPr>
-        <w:t>Trang artifact (bìa + các tab) và cấu trúc folder design-system/</w:t>
+        <w:t>README.md (luật sử dụng) + logo và bộ icon</w:t>
+      </w:r>
+    </w:p>
+    <w:p>
+      <w:pPr>
+        <w:pStyle w:val="Heading2"/>
+        <w:keepNext/>
+        <w:spacing w:before="240" w:after="100"/>
+      </w:pPr>
+      <w:r>
+        <w:rPr>
+          <w:b/>
+          <w:bCs/>
+          <w:color w:val="D86107"/>
+        </w:rPr>
+        <w:lastRenderedPageBreak/>
+        <w:t>Output 2 — design-system/STATUS.md</w:t>
+      </w:r>
+    </w:p>
+    <w:p>
+      <w:pPr>
+        <w:keepNext/>
+        <w:spacing w:before="40" w:after="80"/>
+      </w:pPr>
+      <w:r>
+        <w:rPr>
+          <w:b/>
+          <w:bCs/>
+          <w:color w:val="0969DA"/>
+        </w:rPr>
+        <w:t xml:space="preserve">Mục đích: </w:t>
+      </w:r>
+      <w:r>
+        <w:rPr>
+          <w:color w:val="24292F"/>
+        </w:rPr>
+        <w:t>Sổ theo dõi nội bộ của kit (không publish): trạng thái DRAFT/APPROVED, link artifact, platform và screen prefix, các mục còn thiếu (TBD) và mâu thuẫn cần designer xác nhận.</w:t>
       </w:r>
     </w:p>
     <w:p>
@@ -5336,12 +3989,11 @@
         <w:rPr>
           <w:noProof/>
         </w:rPr>
-        <w:lastRenderedPageBreak/>
         <w:drawing>
           <wp:inline distT="0" distB="0" distL="0" distR="0">
-            <wp:extent cx="5905500" cy="3787956"/>
+            <wp:extent cx="5905500" cy="3945436"/>
             <wp:effectExtent l="0" t="0" r="0" b="0"/>
-            <wp:docPr id="202" name="output-202.png" descr="tokens.json — màu theo từng portal, thang chữ, spacing, radius, shadow" title="tokens.json — màu theo từng portal, thang chữ, spacing, radius, shadow"/>
+            <wp:docPr id="205" name="output-205.png" descr="STATUS.md của lần chạy ES Kitchen" title="STATUS.md của lần chạy ES Kitchen"/>
             <wp:cNvGraphicFramePr>
               <a:graphicFrameLocks xmlns:a="http://schemas.openxmlformats.org/drawingml/2006/main" noChangeAspect="1"/>
             </wp:cNvGraphicFramePr>
@@ -5364,7 +4016,7 @@
                   <pic:spPr bwMode="auto">
                     <a:xfrm>
                       <a:off x="0" y="0"/>
-                      <a:ext cx="5905500" cy="3787956"/>
+                      <a:ext cx="5905500" cy="3945436"/>
                     </a:xfrm>
                     <a:prstGeom prst="rect">
                       <a:avLst/>
@@ -5390,7 +4042,42 @@
           <w:sz w:val="18"/>
           <w:szCs w:val="18"/>
         </w:rPr>
-        <w:t>tokens.json — màu theo từng portal, thang chữ, spacing, radius, shadow</w:t>
+        <w:t>STATUS.md của lần chạy ES Kitchen</w:t>
+      </w:r>
+    </w:p>
+    <w:p>
+      <w:pPr>
+        <w:pStyle w:val="Heading2"/>
+        <w:keepNext/>
+        <w:spacing w:before="240" w:after="100"/>
+      </w:pPr>
+      <w:r>
+        <w:rPr>
+          <w:b/>
+          <w:bCs/>
+          <w:color w:val="D86107"/>
+        </w:rPr>
+        <w:t>Output 3 — Màn hình Figma high-fidelity</w:t>
+      </w:r>
+    </w:p>
+    <w:p>
+      <w:pPr>
+        <w:keepNext/>
+        <w:spacing w:before="40" w:after="80"/>
+      </w:pPr>
+      <w:r>
+        <w:rPr>
+          <w:b/>
+          <w:bCs/>
+          <w:color w:val="0969DA"/>
+        </w:rPr>
+        <w:t xml:space="preserve">Mục đích: </w:t>
+      </w:r>
+      <w:r>
+        <w:rPr>
+          <w:color w:val="24292F"/>
+        </w:rPr>
+        <w:t>Các màn hình vẽ đúng design system (component thật, màu và chữ theo token), đủ popup / toast / lỗi / trống, tên màn đa ngôn ngữ không bị cắt — để designer review và FE dựng giao diện.</w:t>
       </w:r>
     </w:p>
     <w:p>
@@ -5404,9 +4091,9 @@
         </w:rPr>
         <w:drawing>
           <wp:inline distT="0" distB="0" distL="0" distR="0">
-            <wp:extent cx="5905500" cy="4277269"/>
+            <wp:extent cx="5905500" cy="2694784"/>
             <wp:effectExtent l="0" t="0" r="0" b="0"/>
-            <wp:docPr id="203" name="output-203.png" descr="Component có hướng dẫn dùng và preview chạy thật" title="Component có hướng dẫn dùng và preview chạy thật"/>
+            <wp:docPr id="206" name="output-206.png" descr="Section AI_Generate_&lt;tính năng&gt; trên Figma (xem thêm Bước 8)" title="Section AI_Generate_&lt;tính năng&gt; trên Figma (xem thêm Bước 8)"/>
             <wp:cNvGraphicFramePr>
               <a:graphicFrameLocks xmlns:a="http://schemas.openxmlformats.org/drawingml/2006/main" noChangeAspect="1"/>
             </wp:cNvGraphicFramePr>
@@ -5429,273 +4116,6 @@
                   <pic:spPr bwMode="auto">
                     <a:xfrm>
                       <a:off x="0" y="0"/>
-                      <a:ext cx="5905500" cy="4277269"/>
-                    </a:xfrm>
-                    <a:prstGeom prst="rect">
-                      <a:avLst/>
-                    </a:prstGeom>
-                  </pic:spPr>
-                </pic:pic>
-              </a:graphicData>
-            </a:graphic>
-          </wp:inline>
-        </w:drawing>
-      </w:r>
-    </w:p>
-    <w:p>
-      <w:pPr>
-        <w:spacing w:before="60" w:after="160"/>
-        <w:jc w:val="center"/>
-      </w:pPr>
-      <w:r>
-        <w:rPr>
-          <w:i/>
-          <w:iCs/>
-          <w:color w:val="6E7781"/>
-          <w:sz w:val="18"/>
-          <w:szCs w:val="18"/>
-        </w:rPr>
-        <w:t>Component có hướng dẫn dùng và preview chạy thật</w:t>
-      </w:r>
-    </w:p>
-    <w:p>
-      <w:pPr>
-        <w:spacing w:before="120" w:after="40"/>
-        <w:jc w:val="center"/>
-      </w:pPr>
-      <w:r>
-        <w:rPr>
-          <w:noProof/>
-        </w:rPr>
-        <w:lastRenderedPageBreak/>
-        <w:drawing>
-          <wp:inline distT="0" distB="0" distL="0" distR="0">
-            <wp:extent cx="5905500" cy="3692343"/>
-            <wp:effectExtent l="0" t="0" r="0" b="0"/>
-            <wp:docPr id="204" name="output-204.png" descr="README.md (luật sử dụng) + logo và bộ icon" title="README.md (luật sử dụng) + logo và bộ icon"/>
-            <wp:cNvGraphicFramePr>
-              <a:graphicFrameLocks xmlns:a="http://schemas.openxmlformats.org/drawingml/2006/main" noChangeAspect="1"/>
-            </wp:cNvGraphicFramePr>
-            <a:graphic xmlns:a="http://schemas.openxmlformats.org/drawingml/2006/main">
-              <a:graphicData uri="http://schemas.openxmlformats.org/drawingml/2006/picture">
-                <pic:pic xmlns:pic="http://schemas.openxmlformats.org/drawingml/2006/picture">
-                  <pic:nvPicPr>
-                    <pic:cNvPr id="0" name=""/>
-                    <pic:cNvPicPr>
-                      <a:picLocks noChangeAspect="1" noChangeArrowheads="1"/>
-                    </pic:cNvPicPr>
-                  </pic:nvPicPr>
-                  <pic:blipFill>
-                    <a:blip r:embed="rId22"/>
-                    <a:srcRect/>
-                    <a:stretch>
-                      <a:fillRect/>
-                    </a:stretch>
-                  </pic:blipFill>
-                  <pic:spPr bwMode="auto">
-                    <a:xfrm>
-                      <a:off x="0" y="0"/>
-                      <a:ext cx="5905500" cy="3692343"/>
-                    </a:xfrm>
-                    <a:prstGeom prst="rect">
-                      <a:avLst/>
-                    </a:prstGeom>
-                  </pic:spPr>
-                </pic:pic>
-              </a:graphicData>
-            </a:graphic>
-          </wp:inline>
-        </w:drawing>
-      </w:r>
-    </w:p>
-    <w:p>
-      <w:pPr>
-        <w:spacing w:before="60" w:after="160"/>
-        <w:jc w:val="center"/>
-      </w:pPr>
-      <w:r>
-        <w:rPr>
-          <w:i/>
-          <w:iCs/>
-          <w:color w:val="6E7781"/>
-          <w:sz w:val="18"/>
-          <w:szCs w:val="18"/>
-        </w:rPr>
-        <w:t>README.md (luật sử dụng) + logo và bộ icon</w:t>
-      </w:r>
-    </w:p>
-    <w:p>
-      <w:pPr>
-        <w:pStyle w:val="Heading2"/>
-        <w:keepNext/>
-        <w:spacing w:before="240" w:after="100"/>
-      </w:pPr>
-      <w:r>
-        <w:rPr>
-          <w:b/>
-          <w:bCs/>
-          <w:color w:val="D86107"/>
-        </w:rPr>
-        <w:lastRenderedPageBreak/>
-        <w:t>Output 2 — design-system/STATUS.md</w:t>
-      </w:r>
-    </w:p>
-    <w:p>
-      <w:pPr>
-        <w:keepNext/>
-        <w:spacing w:before="40" w:after="80"/>
-      </w:pPr>
-      <w:r>
-        <w:rPr>
-          <w:b/>
-          <w:bCs/>
-          <w:color w:val="0969DA"/>
-        </w:rPr>
-        <w:t xml:space="preserve">Mục đích: </w:t>
-      </w:r>
-      <w:r>
-        <w:rPr>
-          <w:color w:val="24292F"/>
-        </w:rPr>
-        <w:t>Sổ theo dõi nội bộ của kit (không publish): trạng thái DRAFT/APPROVED, link artifact, platform và screen prefix, các mục còn thiếu (TBD) và mâu thuẫn cần designer xác nhận.</w:t>
-      </w:r>
-    </w:p>
-    <w:p>
-      <w:pPr>
-        <w:spacing w:before="120" w:after="40"/>
-        <w:jc w:val="center"/>
-      </w:pPr>
-      <w:r>
-        <w:rPr>
-          <w:noProof/>
-        </w:rPr>
-        <w:drawing>
-          <wp:inline distT="0" distB="0" distL="0" distR="0">
-            <wp:extent cx="5905500" cy="3945436"/>
-            <wp:effectExtent l="0" t="0" r="0" b="0"/>
-            <wp:docPr id="205" name="output-205.png" descr="STATUS.md của lần chạy ES Kitchen" title="STATUS.md của lần chạy ES Kitchen"/>
-            <wp:cNvGraphicFramePr>
-              <a:graphicFrameLocks xmlns:a="http://schemas.openxmlformats.org/drawingml/2006/main" noChangeAspect="1"/>
-            </wp:cNvGraphicFramePr>
-            <a:graphic xmlns:a="http://schemas.openxmlformats.org/drawingml/2006/main">
-              <a:graphicData uri="http://schemas.openxmlformats.org/drawingml/2006/picture">
-                <pic:pic xmlns:pic="http://schemas.openxmlformats.org/drawingml/2006/picture">
-                  <pic:nvPicPr>
-                    <pic:cNvPr id="0" name=""/>
-                    <pic:cNvPicPr>
-                      <a:picLocks noChangeAspect="1" noChangeArrowheads="1"/>
-                    </pic:cNvPicPr>
-                  </pic:nvPicPr>
-                  <pic:blipFill>
-                    <a:blip r:embed="rId23"/>
-                    <a:srcRect/>
-                    <a:stretch>
-                      <a:fillRect/>
-                    </a:stretch>
-                  </pic:blipFill>
-                  <pic:spPr bwMode="auto">
-                    <a:xfrm>
-                      <a:off x="0" y="0"/>
-                      <a:ext cx="5905500" cy="3945436"/>
-                    </a:xfrm>
-                    <a:prstGeom prst="rect">
-                      <a:avLst/>
-                    </a:prstGeom>
-                  </pic:spPr>
-                </pic:pic>
-              </a:graphicData>
-            </a:graphic>
-          </wp:inline>
-        </w:drawing>
-      </w:r>
-    </w:p>
-    <w:p>
-      <w:pPr>
-        <w:spacing w:before="60" w:after="160"/>
-        <w:jc w:val="center"/>
-      </w:pPr>
-      <w:r>
-        <w:rPr>
-          <w:i/>
-          <w:iCs/>
-          <w:color w:val="6E7781"/>
-          <w:sz w:val="18"/>
-          <w:szCs w:val="18"/>
-        </w:rPr>
-        <w:t>STATUS.md của lần chạy ES Kitchen</w:t>
-      </w:r>
-    </w:p>
-    <w:p>
-      <w:pPr>
-        <w:pStyle w:val="Heading2"/>
-        <w:keepNext/>
-        <w:spacing w:before="240" w:after="100"/>
-      </w:pPr>
-      <w:r>
-        <w:rPr>
-          <w:b/>
-          <w:bCs/>
-          <w:color w:val="D86107"/>
-        </w:rPr>
-        <w:t>Output 3 — Màn hình Figma high-fidelity</w:t>
-      </w:r>
-    </w:p>
-    <w:p>
-      <w:pPr>
-        <w:keepNext/>
-        <w:spacing w:before="40" w:after="80"/>
-      </w:pPr>
-      <w:r>
-        <w:rPr>
-          <w:b/>
-          <w:bCs/>
-          <w:color w:val="0969DA"/>
-        </w:rPr>
-        <w:t xml:space="preserve">Mục đích: </w:t>
-      </w:r>
-      <w:r>
-        <w:rPr>
-          <w:color w:val="24292F"/>
-        </w:rPr>
-        <w:t>Các màn hình vẽ đúng design system (component thật, màu và chữ theo token), đủ popup / toast / lỗi / trống, tên màn đa ngôn ngữ không bị cắt — để designer review và FE dựng giao diện.</w:t>
-      </w:r>
-    </w:p>
-    <w:p>
-      <w:pPr>
-        <w:spacing w:before="120" w:after="40"/>
-        <w:jc w:val="center"/>
-      </w:pPr>
-      <w:r>
-        <w:rPr>
-          <w:noProof/>
-        </w:rPr>
-        <w:drawing>
-          <wp:inline distT="0" distB="0" distL="0" distR="0">
-            <wp:extent cx="5905500" cy="2694784"/>
-            <wp:effectExtent l="0" t="0" r="0" b="0"/>
-            <wp:docPr id="206" name="output-206.png" descr="Section AI_Generate_&lt;tính năng&gt; trên Figma (xem thêm Bước 8)" title="Section AI_Generate_&lt;tính năng&gt; trên Figma (xem thêm Bước 8)"/>
-            <wp:cNvGraphicFramePr>
-              <a:graphicFrameLocks xmlns:a="http://schemas.openxmlformats.org/drawingml/2006/main" noChangeAspect="1"/>
-            </wp:cNvGraphicFramePr>
-            <a:graphic xmlns:a="http://schemas.openxmlformats.org/drawingml/2006/main">
-              <a:graphicData uri="http://schemas.openxmlformats.org/drawingml/2006/picture">
-                <pic:pic xmlns:pic="http://schemas.openxmlformats.org/drawingml/2006/picture">
-                  <pic:nvPicPr>
-                    <pic:cNvPr id="0" name=""/>
-                    <pic:cNvPicPr>
-                      <a:picLocks noChangeAspect="1" noChangeArrowheads="1"/>
-                    </pic:cNvPicPr>
-                  </pic:nvPicPr>
-                  <pic:blipFill>
-                    <a:blip r:embed="rId17"/>
-                    <a:srcRect/>
-                    <a:stretch>
-                      <a:fillRect/>
-                    </a:stretch>
-                  </pic:blipFill>
-                  <pic:spPr bwMode="auto">
-                    <a:xfrm>
-                      <a:off x="0" y="0"/>
                       <a:ext cx="5905500" cy="2694784"/>
                     </a:xfrm>
                     <a:prstGeom prst="rect">
@@ -5788,7 +4208,7 @@
                     </pic:cNvPicPr>
                   </pic:nvPicPr>
                   <pic:blipFill>
-                    <a:blip r:embed="rId24"/>
+                    <a:blip r:embed="rId22"/>
                     <a:srcRect/>
                     <a:stretch>
                       <a:fillRect/>
@@ -6176,7 +4596,7 @@
       </w:r>
     </w:p>
     <w:sectPr>
-      <w:footerReference w:type="default" r:id="rId25"/>
+      <w:footerReference w:type="default" r:id="rId23"/>
       <w:pgSz w:w="12240" w:h="15840"/>
       <w:pgMar w:top="1134" w:right="1247" w:bottom="1134" w:left="1247" w:header="708" w:footer="708" w:gutter="0"/>
       <w:cols w:space="720"/>

</xml_diff>

<commit_message>
feat(designer-kit): document-to-figma dùng luôn design system artifact có sẵn, không tạo mới (#60)
- intake §2.4: 3 nhánh A dùng nguyên / B bổ sung artifact có quyền EDIT / C bản sao; §4–§5 bỏ qua khi đã có artifact
- agent bước 0.1: có link artifact (tham số lệnh / prompt) thì bỏ DS-1, không hỏi duyệt lại
- lệnh thêm tham số thứ 3 [design-system-url]; cập nhật AGENTS, README, docx hướng dẫn
- xoá file khoá Word ~$ lỡ commit trong ba-kit/system-to-doc/docs

Co-authored-by: Claude Sonnet 5.5 <noreply@anthropic.com>
</commit_message>
<xml_diff>
--- a/designer-kit/document-to-figma/docs/Hướng dẫn sử dụng Document to Figma.docx
+++ b/designer-kit/document-to-figma/docs/Hướng dẫn sử dụng Document to Figma.docx
@@ -146,7 +146,7 @@
           <wp:inline distT="0" distB="0" distL="0" distR="0">
             <wp:extent cx="6096000" cy="3223846"/>
             <wp:effectExtent l="0" t="0" r="0" b="0"/>
-            <wp:docPr id="1" name="gen/flow.png" descr="Luồng tính năng — chưa có design system thì chỉ cần link Figma, AI tự tạo · bạn duyệt 2 lần" title="Luồng tính năng — chưa có design system thì chỉ cần link Figma, AI tự tạo · bạn duyệt 2 lần"/>
+            <wp:docPr id="1" name="gen/flow.png" descr="Luồng tính năng — đã có link design system thì dùng luôn · chưa có thì chỉ cần link Figma, AI tự tạo · bạn duyệt 2 lần" title="Luồng tính năng — chưa có design system thì chỉ cần link Figma, AI tự tạo · bạn duyệt 2 lần"/>
             <wp:cNvGraphicFramePr>
               <a:graphicFrameLocks xmlns:a="http://schemas.openxmlformats.org/drawingml/2006/main" noChangeAspect="1"/>
             </wp:cNvGraphicFramePr>
@@ -295,7 +295,7 @@
               <w:rPr>
                 <w:color w:val="24292F"/>
               </w:rPr>
-              <w:t>Design system: file có sẵn — hoặc chỉ cần link Figma (cấu trúc design / màn hình thực tế), AI tự tạo</w:t>
+              <w:t>Design system: link artifact có sẵn (dùng luôn, không tạo mới) · file có sẵn · hoặc link Figma (cấu trúc design / màn hình thực tế), AI tự tạo</w:t>
             </w:r>
           </w:p>
           <w:p>
@@ -592,7 +592,7 @@
                 <w:sz w:val="22"/>
                 <w:szCs w:val="22"/>
               </w:rPr>
-              <w:t>https://drive.google.com/file/d/1-s4s7KKU1qWmRoFEeSK7Pd6trwH39GlB/view?usp=sharing</w:t>
+              <w:t>https://drive.google.com/drive/folders/1PqGzQVp3BAzw0wSkHE4hPhmirmsk69Oy</w:t>
             </w:r>
           </w:p>
         </w:tc>
@@ -1082,7 +1082,7 @@
                 <w:sz w:val="26"/>
                 <w:szCs w:val="26"/>
               </w:rPr>
-              <w:t>BƯỚC 2 — MỞ CLAUDE CODE TẠI FOLDER KIT</w:t>
+              <w:t xml:space="preserve">BƯỚC 2 — MỞ CLAUDE CODE TẠI FOLDER </w:t>
             </w:r>
           </w:p>
         </w:tc>
@@ -1103,146 +1103,6 @@
           <w:color w:val="24292F"/>
         </w:rPr>
         <w:t>Claude phải được mở đúng ở folder document-to-figma (folder có CLAUDE.md) thì Designer Agent mới được nạp. Chọn 1 trong 2 cách:</w:t>
-      </w:r>
-    </w:p>
-    <w:p>
-      <w:pPr>
-        <w:pStyle w:val="Heading2"/>
-        <w:keepNext/>
-        <w:spacing w:before="240" w:after="100"/>
-      </w:pPr>
-      <w:r>
-        <w:rPr>
-          <w:b/>
-          <w:bCs/>
-          <w:color w:val="D86107"/>
-        </w:rPr>
-        <w:lastRenderedPageBreak/>
-        <w:t>Cách A — Ứng dụng Claude (Desktop)</w:t>
-      </w:r>
-    </w:p>
-    <w:p>
-      <w:pPr>
-        <w:pStyle w:val="ListParagraph"/>
-        <w:numPr>
-          <w:ilvl w:val="0"/>
-          <w:numId w:val="4"/>
-        </w:numPr>
-        <w:spacing w:before="20" w:after="20"/>
-      </w:pPr>
-      <w:r>
-        <w:rPr>
-          <w:color w:val="24292F"/>
-        </w:rPr>
-        <w:t xml:space="preserve">Mở ứng dụng </w:t>
-      </w:r>
-      <w:r>
-        <w:rPr>
-          <w:b/>
-          <w:bCs/>
-          <w:color w:val="24292F"/>
-        </w:rPr>
-        <w:t>Claude</w:t>
-      </w:r>
-      <w:r>
-        <w:rPr>
-          <w:color w:val="24292F"/>
-        </w:rPr>
-        <w:t xml:space="preserve"> trên máy, đăng nhập tài khoản công ty.</w:t>
-      </w:r>
-    </w:p>
-    <w:p>
-      <w:pPr>
-        <w:pStyle w:val="ListParagraph"/>
-        <w:numPr>
-          <w:ilvl w:val="0"/>
-          <w:numId w:val="4"/>
-        </w:numPr>
-        <w:spacing w:before="20" w:after="20"/>
-      </w:pPr>
-      <w:r>
-        <w:rPr>
-          <w:color w:val="24292F"/>
-        </w:rPr>
-        <w:t xml:space="preserve">Chọn tab </w:t>
-      </w:r>
-      <w:r>
-        <w:rPr>
-          <w:b/>
-          <w:bCs/>
-          <w:color w:val="24292F"/>
-        </w:rPr>
-        <w:t>Code</w:t>
-      </w:r>
-      <w:r>
-        <w:rPr>
-          <w:color w:val="24292F"/>
-        </w:rPr>
-        <w:t xml:space="preserve"> (Claude Code).</w:t>
-      </w:r>
-    </w:p>
-    <w:p>
-      <w:pPr>
-        <w:pStyle w:val="ListParagraph"/>
-        <w:numPr>
-          <w:ilvl w:val="0"/>
-          <w:numId w:val="4"/>
-        </w:numPr>
-        <w:spacing w:before="20" w:after="20"/>
-      </w:pPr>
-      <w:r>
-        <w:rPr>
-          <w:color w:val="24292F"/>
-        </w:rPr>
-        <w:t xml:space="preserve">Bấm chọn folder làm việc → chọn folder </w:t>
-      </w:r>
-      <w:r>
-        <w:rPr>
-          <w:rFonts w:ascii="Consolas" w:eastAsia="MS Gothic" w:hAnsi="Consolas" w:cs="Consolas"/>
-          <w:b/>
-          <w:bCs/>
-          <w:color w:val="0969DA"/>
-          <w:sz w:val="19"/>
-          <w:szCs w:val="19"/>
-        </w:rPr>
-        <w:t>document-to-figma</w:t>
-      </w:r>
-      <w:r>
-        <w:rPr>
-          <w:color w:val="24292F"/>
-        </w:rPr>
-        <w:t xml:space="preserve"> → Open.</w:t>
-      </w:r>
-    </w:p>
-    <w:p>
-      <w:pPr>
-        <w:pStyle w:val="ListParagraph"/>
-        <w:numPr>
-          <w:ilvl w:val="0"/>
-          <w:numId w:val="4"/>
-        </w:numPr>
-        <w:spacing w:before="20" w:after="20"/>
-      </w:pPr>
-      <w:r>
-        <w:rPr>
-          <w:color w:val="24292F"/>
-        </w:rPr>
-        <w:t>Ô chat hiện ra — sẵn sàng dùng.</w:t>
-      </w:r>
-    </w:p>
-    <w:p>
-      <w:pPr>
-        <w:pStyle w:val="Heading2"/>
-        <w:keepNext/>
-        <w:spacing w:before="240" w:after="100"/>
-      </w:pPr>
-      <w:r>
-        <w:rPr>
-          <w:b/>
-          <w:bCs/>
-          <w:color w:val="D86107"/>
-        </w:rPr>
-        <w:t>Cách B — VS Code + extension Claude Code</w:t>
       </w:r>
     </w:p>
     <w:p>
@@ -1258,6 +1118,7 @@
         <w:rPr>
           <w:color w:val="24292F"/>
         </w:rPr>
+        <w:lastRenderedPageBreak/>
         <w:t xml:space="preserve">Mở VS Code → </w:t>
       </w:r>
       <w:r>
@@ -1992,10 +1853,7 @@
       </w:pPr>
       <w:r>
         <w:rPr>
-          <w:rFonts w:ascii="Calibri" w:cs="Calibri" w:eastAsia="Yu Gothic" w:hAnsi="Calibri"/>
-          <w:color w:val="24292F"/>
-          <w:sz w:val="20"/>
-          <w:szCs w:val="20"/>
+          <w:color w:val="24292F"/>
         </w:rPr>
         <w:t xml:space="preserve">Design system là bộ quy định giao diện của dự án: màu sắc, font, size, weight, khoảng cách, bo góc, component. Agent chỉ vẽ khi có design system. </w:t>
       </w:r>
@@ -2011,23 +1869,17 @@
       </w:pPr>
       <w:r>
         <w:rPr>
-          <w:rFonts w:ascii="Calibri" w:cs="Calibri" w:eastAsia="Yu Gothic" w:hAnsi="Calibri"/>
           <w:b/>
           <w:bCs/>
           <w:color w:val="24292F"/>
-          <w:sz w:val="20"/>
-          <w:szCs w:val="20"/>
         </w:rPr>
         <w:t xml:space="preserve">Trường hợp 1 — Đã có file design system: </w:t>
       </w:r>
       <w:r>
         <w:rPr>
-          <w:rFonts w:ascii="Calibri" w:cs="Calibri" w:eastAsia="Yu Gothic" w:hAnsi="Calibri"/>
-          <w:color w:val="24292F"/>
-          <w:sz w:val="20"/>
-          <w:szCs w:val="20"/>
-        </w:rPr>
-        <w:t xml:space="preserve">file .md / .pdf / .docx / .xlsx / ảnh → copy vào folder input/design-system (tự tạo nếu chưa có). Có link Design System artifact (claude.ai/artifact/…) thì dán khi Claude hỏi.</w:t>
+          <w:color w:val="24292F"/>
+        </w:rPr>
+        <w:t>file .md / .pdf / .docx / .xlsx / ảnh → copy vào folder input/design-system (tự tạo nếu chưa có). Có link Design System artifact (claude.ai/artifact/…) đúng định dạng → dán khi Claude hỏi hoặc truyền ngay trong lệnh: Claude dùng luôn artifact đó, KHÔNG tạo design system mới và không hỏi duyệt lại.</w:t>
       </w:r>
     </w:p>
     <w:p>
@@ -2041,50 +1893,29 @@
       </w:pPr>
       <w:r>
         <w:rPr>
-          <w:rFonts w:ascii="Calibri" w:cs="Calibri" w:eastAsia="Yu Gothic" w:hAnsi="Calibri"/>
           <w:b/>
           <w:bCs/>
           <w:color w:val="D86107"/>
-          <w:sz w:val="20"/>
-          <w:szCs w:val="20"/>
         </w:rPr>
         <w:t xml:space="preserve">Trường hợp 2 — Chưa có file design system: </w:t>
       </w:r>
       <w:r>
         <w:rPr>
-          <w:rFonts w:ascii="Calibri" w:cs="Calibri" w:eastAsia="Yu Gothic" w:hAnsi="Calibri"/>
-          <w:color w:val="24292F"/>
-          <w:sz w:val="20"/>
-          <w:szCs w:val="20"/>
-        </w:rPr>
-        <w:t xml:space="preserve">chuẩn bị 1 trong 2 loại link Figma: (A) link Figma về cấu trúc design — page Foundations / Design Tokens / Component Library; hoặc (B) link Figma về màn hình thực tế — 1–5 màn đã được designer duyệt.</w:t>
-      </w:r>
-      <w:r>
-        <w:rPr>
-          <w:rFonts w:ascii="Calibri" w:cs="Calibri" w:eastAsia="Yu Gothic" w:hAnsi="Calibri"/>
-          <w:color w:val="24292F"/>
-          <w:sz w:val="20"/>
-          <w:szCs w:val="20"/>
-        </w:rPr>
-        <w:t xml:space="preserve"> → AI tự đọc link Figma, đo màu, chữ, khoảng cách, component và </w:t>
-      </w:r>
-      <w:r>
-        <w:rPr>
-          <w:rFonts w:ascii="Calibri" w:cs="Calibri" w:eastAsia="Yu Gothic" w:hAnsi="Calibri"/>
+          <w:color w:val="24292F"/>
+        </w:rPr>
+        <w:t xml:space="preserve">chuẩn bị 1 trong 2 loại link Figma: (A) link Figma về cấu trúc design — page Foundations / Design Tokens / Component Library; hoặc (B) link Figma về màn hình thực tế — 1–5 màn đã được designer duyệt. → AI tự đọc link Figma, đo màu, chữ, khoảng cách, component và </w:t>
+      </w:r>
+      <w:r>
+        <w:rPr>
           <w:b/>
           <w:bCs/>
           <w:color w:val="24292F"/>
-          <w:sz w:val="20"/>
-          <w:szCs w:val="20"/>
-        </w:rPr>
-        <w:t xml:space="preserve">tạo ra design system cho dự án</w:t>
-      </w:r>
-      <w:r>
-        <w:rPr>
-          <w:rFonts w:ascii="Calibri" w:cs="Calibri" w:eastAsia="Yu Gothic" w:hAnsi="Calibri"/>
-          <w:color w:val="24292F"/>
-          <w:sz w:val="20"/>
-          <w:szCs w:val="20"/>
+        </w:rPr>
+        <w:t>tạo ra design system cho dự án</w:t>
+      </w:r>
+      <w:r>
+        <w:rPr>
+          <w:color w:val="24292F"/>
         </w:rPr>
         <w:t xml:space="preserve"> — bạn chỉ cần duyệt.</w:t>
       </w:r>
@@ -2149,7 +1980,7 @@
               <w:rPr>
                 <w:color w:val="24292F"/>
               </w:rPr>
-              <w:t xml:space="preserve">Không có file và cũng không có link Figma nào → agent sẽ DỪNG, không vẽ. Xin designer / leader dự án 1 link Figma rồi chạy lại.</w:t>
+              <w:t>Không có file và cũng không có link Figma nào → agent sẽ DỪNG, không vẽ. Xin designer / leader dự án 1 link Figma rồi chạy lại.</w:t>
             </w:r>
           </w:p>
         </w:tc>
@@ -2215,7 +2046,7 @@
               <w:rPr>
                 <w:color w:val="24292F"/>
               </w:rPr>
-              <w:t xml:space="preserve">Lần đầu agent tạo Design System (1 link artifact + folder design-system) và nhờ bạn duyệt. Các lần sau dùng lại luôn, không hỏi lại.</w:t>
+              <w:t>Đã có link artifact Design System → dùng luôn (thiếu mục nào thì Claude hỏi bổ sung, có quyền sửa thì sửa chính artifact đó). Chưa có → lần đầu agent tạo Design System (1 link artifact + folder design-system) và nhờ bạn duyệt; các lần sau dùng lại, không hỏi lại.</w:t>
             </w:r>
           </w:p>
         </w:tc>
@@ -2819,7 +2650,7 @@
                 <w:sz w:val="24"/>
                 <w:szCs w:val="24"/>
               </w:rPr>
-              <w:t>/document-to-figma</w:t>
+              <w:t>/document-to-figma [document-path] [figma-output-url] [design-system-url]</w:t>
             </w:r>
           </w:p>
         </w:tc>
@@ -2899,6 +2730,36 @@
               <w:t>Hãy là Designer, chuyển tài liệu trong folder input sang Figma, đặt vào &lt;link Figma&gt;</w:t>
             </w:r>
           </w:p>
+          <w:p>
+            <w:pPr>
+              <w:spacing w:before="60" w:after="40"/>
+            </w:pPr>
+            <w:r>
+              <w:rPr>
+                <w:b/>
+                <w:bCs/>
+                <w:color w:val="6E7781"/>
+                <w:sz w:val="16"/>
+                <w:szCs w:val="16"/>
+              </w:rPr>
+              <w:t>NẾU ĐÃ CÓ LINK DESIGN SYSTEM (thay &lt;link artifact&gt;)</w:t>
+            </w:r>
+          </w:p>
+          <w:p>
+            <w:pPr>
+              <w:spacing w:after="20"/>
+            </w:pPr>
+            <w:r>
+              <w:rPr>
+                <w:b/>
+                <w:bCs/>
+                <w:color w:val="0969DA"/>
+                <w:sz w:val="24"/>
+                <w:szCs w:val="24"/>
+              </w:rPr>
+              <w:t>Hãy là Designer, chuyển tài liệu trong folder input sang Figma, dùng design system &lt;link artifact&gt;</w:t>
+            </w:r>
+          </w:p>
         </w:tc>
       </w:tr>
     </w:tbl>
@@ -3034,1447 +2895,6 @@
         <w:t>Hình minh họa — Bước 6</w:t>
       </w:r>
     </w:p>
-    <w:p>
-      <w:pPr>
-        <w:keepNext/>
-        <w:spacing w:after="120"/>
-      </w:pPr>
-    </w:p>
-    <w:tbl>
-      <w:tblPr>
-        <w:tblW w:w="9746" w:type="dxa"/>
-        <w:tblBorders>
-          <w:top w:val="single" w:sz="4" w:space="0" w:color="auto"/>
-          <w:left w:val="single" w:sz="4" w:space="0" w:color="auto"/>
-          <w:bottom w:val="single" w:sz="4" w:space="0" w:color="auto"/>
-          <w:right w:val="single" w:sz="4" w:space="0" w:color="auto"/>
-          <w:insideH w:val="single" w:sz="4" w:space="0" w:color="auto"/>
-          <w:insideV w:val="single" w:sz="4" w:space="0" w:color="auto"/>
-        </w:tblBorders>
-        <w:tblCellMar>
-          <w:left w:w="10" w:type="dxa"/>
-          <w:right w:w="10" w:type="dxa"/>
-        </w:tblCellMar>
-        <w:tblLook w:val="04A0" w:firstRow="1" w:lastRow="0" w:firstColumn="1" w:lastColumn="0" w:noHBand="0" w:noVBand="1"/>
-      </w:tblPr>
-      <w:tblGrid>
-        <w:gridCol w:w="9746"/>
-      </w:tblGrid>
-      <w:tr>
-        <w:tc>
-          <w:tcPr>
-            <w:tcW w:w="9746" w:type="dxa"/>
-            <w:tcBorders>
-              <w:top w:val="single" w:sz="4" w:space="0" w:color="0969DA"/>
-              <w:left w:val="single" w:sz="4" w:space="0" w:color="0969DA"/>
-              <w:bottom w:val="single" w:sz="4" w:space="0" w:color="0969DA"/>
-              <w:right w:val="single" w:sz="4" w:space="0" w:color="0969DA"/>
-            </w:tcBorders>
-            <w:shd w:val="clear" w:color="auto" w:fill="0969DA"/>
-            <w:tcMar>
-              <w:top w:w="100" w:type="dxa"/>
-              <w:left w:w="140" w:type="dxa"/>
-              <w:bottom w:w="100" w:type="dxa"/>
-              <w:right w:w="140" w:type="dxa"/>
-            </w:tcMar>
-          </w:tcPr>
-          <w:p>
-            <w:pPr>
-              <w:keepNext/>
-              <w:spacing w:before="40" w:after="40"/>
-            </w:pPr>
-            <w:r>
-              <w:rPr>
-                <w:b/>
-                <w:bCs/>
-                <w:color w:val="FFFFFF"/>
-                <w:sz w:val="26"/>
-                <w:szCs w:val="26"/>
-              </w:rPr>
-              <w:t>BƯỚC 7 — TRẢ LỜI CÂU HỎI CỦA CLAUDE</w:t>
-            </w:r>
-          </w:p>
-        </w:tc>
-      </w:tr>
-    </w:tbl>
-    <w:p>
-      <w:pPr>
-        <w:keepNext/>
-        <w:spacing w:after="80"/>
-      </w:pPr>
-    </w:p>
-    <w:p>
-      <w:pPr>
-        <w:spacing w:before="60" w:after="60"/>
-      </w:pPr>
-      <w:r>
-        <w:rPr>
-          <w:color w:val="24292F"/>
-        </w:rPr>
-        <w:t>Claude không tự đoán. Trước khi vẽ, Claude hiện các hộp chọn — bấm chọn; muốn trả lời khác thì chọn Other và gõ / dán vào. Câu nào bạn đã ghi trong prompt thì Claude không hỏi lại.</w:t>
-      </w:r>
-    </w:p>
-    <w:tbl>
-      <w:tblPr>
-        <w:tblW w:w="9746" w:type="dxa"/>
-        <w:tblBorders>
-          <w:top w:val="single" w:sz="4" w:space="0" w:color="auto"/>
-          <w:left w:val="single" w:sz="4" w:space="0" w:color="auto"/>
-          <w:bottom w:val="single" w:sz="4" w:space="0" w:color="auto"/>
-          <w:right w:val="single" w:sz="4" w:space="0" w:color="auto"/>
-          <w:insideH w:val="single" w:sz="4" w:space="0" w:color="auto"/>
-          <w:insideV w:val="single" w:sz="4" w:space="0" w:color="auto"/>
-        </w:tblBorders>
-        <w:tblCellMar>
-          <w:left w:w="10" w:type="dxa"/>
-          <w:right w:w="10" w:type="dxa"/>
-        </w:tblCellMar>
-        <w:tblLook w:val="04A0" w:firstRow="1" w:lastRow="0" w:firstColumn="1" w:lastColumn="0" w:noHBand="0" w:noVBand="1"/>
-      </w:tblPr>
-      <w:tblGrid>
-        <w:gridCol w:w="2900"/>
-        <w:gridCol w:w="6846"/>
-      </w:tblGrid>
-      <w:tr>
-        <w:tc>
-          <w:tcPr>
-            <w:tcW w:w="2900" w:type="dxa"/>
-            <w:tcBorders>
-              <w:top w:val="single" w:sz="4" w:space="0" w:color="0969DA"/>
-              <w:left w:val="single" w:sz="4" w:space="0" w:color="0969DA"/>
-              <w:bottom w:val="single" w:sz="4" w:space="0" w:color="0969DA"/>
-              <w:right w:val="single" w:sz="4" w:space="0" w:color="0969DA"/>
-            </w:tcBorders>
-            <w:shd w:val="clear" w:color="auto" w:fill="0969DA"/>
-            <w:tcMar>
-              <w:top w:w="100" w:type="dxa"/>
-              <w:left w:w="140" w:type="dxa"/>
-              <w:bottom w:w="100" w:type="dxa"/>
-              <w:right w:w="140" w:type="dxa"/>
-            </w:tcMar>
-          </w:tcPr>
-          <w:p>
-            <w:pPr>
-              <w:spacing w:before="60" w:after="60"/>
-            </w:pPr>
-            <w:r>
-              <w:rPr>
-                <w:b/>
-                <w:bCs/>
-                <w:color w:val="FFFFFF"/>
-              </w:rPr>
-              <w:t>Claude hỏi</w:t>
-            </w:r>
-          </w:p>
-        </w:tc>
-        <w:tc>
-          <w:tcPr>
-            <w:tcW w:w="6846" w:type="dxa"/>
-            <w:tcBorders>
-              <w:top w:val="single" w:sz="4" w:space="0" w:color="0969DA"/>
-              <w:left w:val="single" w:sz="4" w:space="0" w:color="0969DA"/>
-              <w:bottom w:val="single" w:sz="4" w:space="0" w:color="0969DA"/>
-              <w:right w:val="single" w:sz="4" w:space="0" w:color="0969DA"/>
-            </w:tcBorders>
-            <w:shd w:val="clear" w:color="auto" w:fill="0969DA"/>
-            <w:tcMar>
-              <w:top w:w="100" w:type="dxa"/>
-              <w:left w:w="140" w:type="dxa"/>
-              <w:bottom w:w="100" w:type="dxa"/>
-              <w:right w:w="140" w:type="dxa"/>
-            </w:tcMar>
-          </w:tcPr>
-          <w:p>
-            <w:pPr>
-              <w:spacing w:before="60" w:after="60"/>
-            </w:pPr>
-            <w:r>
-              <w:rPr>
-                <w:b/>
-                <w:bCs/>
-                <w:color w:val="FFFFFF"/>
-              </w:rPr>
-              <w:t>Bạn chọn / trả lời</w:t>
-            </w:r>
-          </w:p>
-        </w:tc>
-      </w:tr>
-      <w:tr>
-        <w:tc>
-          <w:tcPr>
-            <w:tcW w:w="2900" w:type="dxa"/>
-            <w:tcBorders>
-              <w:top w:val="single" w:sz="4" w:space="0" w:color="D0D7DE"/>
-              <w:left w:val="single" w:sz="4" w:space="0" w:color="D0D7DE"/>
-              <w:bottom w:val="single" w:sz="4" w:space="0" w:color="D0D7DE"/>
-              <w:right w:val="single" w:sz="4" w:space="0" w:color="D0D7DE"/>
-            </w:tcBorders>
-            <w:tcMar>
-              <w:top w:w="100" w:type="dxa"/>
-              <w:left w:w="140" w:type="dxa"/>
-              <w:bottom w:w="100" w:type="dxa"/>
-              <w:right w:w="140" w:type="dxa"/>
-            </w:tcMar>
-          </w:tcPr>
-          <w:p>
-            <w:pPr>
-              <w:spacing w:before="60" w:after="60"/>
-            </w:pPr>
-            <w:r>
-              <w:rPr>
-                <w:b/>
-                <w:bCs/>
-                <w:color w:val="24292F"/>
-              </w:rPr>
-              <w:t>1. Đã có design system chưa?</w:t>
-            </w:r>
-          </w:p>
-        </w:tc>
-        <w:tc>
-          <w:tcPr>
-            <w:tcW w:w="6846" w:type="dxa"/>
-            <w:tcBorders>
-              <w:top w:val="single" w:sz="4" w:space="0" w:color="D0D7DE"/>
-              <w:left w:val="single" w:sz="4" w:space="0" w:color="D0D7DE"/>
-              <w:bottom w:val="single" w:sz="4" w:space="0" w:color="D0D7DE"/>
-              <w:right w:val="single" w:sz="4" w:space="0" w:color="D0D7DE"/>
-            </w:tcBorders>
-            <w:tcMar>
-              <w:top w:w="100" w:type="dxa"/>
-              <w:left w:w="140" w:type="dxa"/>
-              <w:bottom w:w="100" w:type="dxa"/>
-              <w:right w:w="140" w:type="dxa"/>
-            </w:tcMar>
-          </w:tcPr>
-          <w:p>
-            <w:pPr>
-              <w:spacing w:before="60" w:after="60"/>
-            </w:pPr>
-            <w:r>
-              <w:rPr>
-                <w:color w:val="24292F"/>
-              </w:rPr>
-              <w:t xml:space="preserve">Link Figma (cấu trúc design hoặc màn hình thực tế) · File tài liệu · Link artifact Design System · Chưa có (→ Claude dừng)</w:t>
-            </w:r>
-          </w:p>
-        </w:tc>
-      </w:tr>
-      <w:tr>
-        <w:tc>
-          <w:tcPr>
-            <w:tcW w:w="2900" w:type="dxa"/>
-            <w:tcBorders>
-              <w:top w:val="single" w:sz="4" w:space="0" w:color="D0D7DE"/>
-              <w:left w:val="single" w:sz="4" w:space="0" w:color="D0D7DE"/>
-              <w:bottom w:val="single" w:sz="4" w:space="0" w:color="D0D7DE"/>
-              <w:right w:val="single" w:sz="4" w:space="0" w:color="D0D7DE"/>
-            </w:tcBorders>
-            <w:tcMar>
-              <w:top w:w="100" w:type="dxa"/>
-              <w:left w:w="140" w:type="dxa"/>
-              <w:bottom w:w="100" w:type="dxa"/>
-              <w:right w:w="140" w:type="dxa"/>
-            </w:tcMar>
-          </w:tcPr>
-          <w:p>
-            <w:pPr>
-              <w:spacing w:before="60" w:after="60"/>
-            </w:pPr>
-            <w:r>
-              <w:rPr>
-                <w:b/>
-                <w:bCs/>
-                <w:color w:val="24292F"/>
-              </w:rPr>
-              <w:t>2. Design system còn thiếu … — bổ sung thế nào?</w:t>
-            </w:r>
-          </w:p>
-        </w:tc>
-        <w:tc>
-          <w:tcPr>
-            <w:tcW w:w="6846" w:type="dxa"/>
-            <w:tcBorders>
-              <w:top w:val="single" w:sz="4" w:space="0" w:color="D0D7DE"/>
-              <w:left w:val="single" w:sz="4" w:space="0" w:color="D0D7DE"/>
-              <w:bottom w:val="single" w:sz="4" w:space="0" w:color="D0D7DE"/>
-              <w:right w:val="single" w:sz="4" w:space="0" w:color="D0D7DE"/>
-            </w:tcBorders>
-            <w:tcMar>
-              <w:top w:w="100" w:type="dxa"/>
-              <w:left w:w="140" w:type="dxa"/>
-              <w:bottom w:w="100" w:type="dxa"/>
-              <w:right w:w="140" w:type="dxa"/>
-            </w:tcMar>
-          </w:tcPr>
-          <w:p>
-            <w:pPr>
-              <w:spacing w:before="60" w:after="60"/>
-            </w:pPr>
-            <w:r>
-              <w:rPr>
-                <w:color w:val="24292F"/>
-              </w:rPr>
-              <w:t>(chỉ hỏi khi thiếu) Gửi 1–5 màn Figma (khuyến nghị) · Gửi thêm tài liệu · Dùng tạm (ghi TBD) · Dừng lại</w:t>
-            </w:r>
-          </w:p>
-        </w:tc>
-      </w:tr>
-      <w:tr>
-        <w:tc>
-          <w:tcPr>
-            <w:tcW w:w="2900" w:type="dxa"/>
-            <w:tcBorders>
-              <w:top w:val="single" w:sz="4" w:space="0" w:color="D0D7DE"/>
-              <w:left w:val="single" w:sz="4" w:space="0" w:color="D0D7DE"/>
-              <w:bottom w:val="single" w:sz="4" w:space="0" w:color="D0D7DE"/>
-              <w:right w:val="single" w:sz="4" w:space="0" w:color="D0D7DE"/>
-            </w:tcBorders>
-            <w:tcMar>
-              <w:top w:w="100" w:type="dxa"/>
-              <w:left w:w="140" w:type="dxa"/>
-              <w:bottom w:w="100" w:type="dxa"/>
-              <w:right w:w="140" w:type="dxa"/>
-            </w:tcMar>
-          </w:tcPr>
-          <w:p>
-            <w:pPr>
-              <w:spacing w:before="60" w:after="60"/>
-            </w:pPr>
-            <w:r>
-              <w:rPr>
-                <w:b/>
-                <w:bCs/>
-                <w:color w:val="24292F"/>
-              </w:rPr>
-              <w:t>3. Duyệt design system?</w:t>
-            </w:r>
-          </w:p>
-        </w:tc>
-        <w:tc>
-          <w:tcPr>
-            <w:tcW w:w="6846" w:type="dxa"/>
-            <w:tcBorders>
-              <w:top w:val="single" w:sz="4" w:space="0" w:color="D0D7DE"/>
-              <w:left w:val="single" w:sz="4" w:space="0" w:color="D0D7DE"/>
-              <w:bottom w:val="single" w:sz="4" w:space="0" w:color="D0D7DE"/>
-              <w:right w:val="single" w:sz="4" w:space="0" w:color="D0D7DE"/>
-            </w:tcBorders>
-            <w:tcMar>
-              <w:top w:w="100" w:type="dxa"/>
-              <w:left w:w="140" w:type="dxa"/>
-              <w:bottom w:w="100" w:type="dxa"/>
-              <w:right w:w="140" w:type="dxa"/>
-            </w:tcMar>
-          </w:tcPr>
-          <w:p>
-            <w:pPr>
-              <w:spacing w:before="60" w:after="60"/>
-            </w:pPr>
-            <w:r>
-              <w:rPr>
-                <w:color w:val="24292F"/>
-              </w:rPr>
-              <w:t xml:space="preserve">Claude gửi link Design System + tóm tắt màu, font, component → Duyệt · Sửa</w:t>
-            </w:r>
-          </w:p>
-        </w:tc>
-      </w:tr>
-      <w:tr>
-        <w:tc>
-          <w:tcPr>
-            <w:tcW w:w="2900" w:type="dxa"/>
-            <w:tcBorders>
-              <w:top w:val="single" w:sz="4" w:space="0" w:color="D0D7DE"/>
-              <w:left w:val="single" w:sz="4" w:space="0" w:color="D0D7DE"/>
-              <w:bottom w:val="single" w:sz="4" w:space="0" w:color="D0D7DE"/>
-              <w:right w:val="single" w:sz="4" w:space="0" w:color="D0D7DE"/>
-            </w:tcBorders>
-            <w:tcMar>
-              <w:top w:w="100" w:type="dxa"/>
-              <w:left w:w="140" w:type="dxa"/>
-              <w:bottom w:w="100" w:type="dxa"/>
-              <w:right w:w="140" w:type="dxa"/>
-            </w:tcMar>
-          </w:tcPr>
-          <w:p>
-            <w:pPr>
-              <w:spacing w:before="60" w:after="60"/>
-            </w:pPr>
-            <w:r>
-              <w:rPr>
-                <w:b/>
-                <w:bCs/>
-                <w:color w:val="24292F"/>
-              </w:rPr>
-              <w:t>4. Tài liệu ở đâu? · Tài liệu khác?</w:t>
-            </w:r>
-          </w:p>
-        </w:tc>
-        <w:tc>
-          <w:tcPr>
-            <w:tcW w:w="6846" w:type="dxa"/>
-            <w:tcBorders>
-              <w:top w:val="single" w:sz="4" w:space="0" w:color="D0D7DE"/>
-              <w:left w:val="single" w:sz="4" w:space="0" w:color="D0D7DE"/>
-              <w:bottom w:val="single" w:sz="4" w:space="0" w:color="D0D7DE"/>
-              <w:right w:val="single" w:sz="4" w:space="0" w:color="D0D7DE"/>
-            </w:tcBorders>
-            <w:tcMar>
-              <w:top w:w="100" w:type="dxa"/>
-              <w:left w:w="140" w:type="dxa"/>
-              <w:bottom w:w="100" w:type="dxa"/>
-              <w:right w:w="140" w:type="dxa"/>
-            </w:tcMar>
-          </w:tcPr>
-          <w:p>
-            <w:pPr>
-              <w:spacing w:before="60" w:after="60"/>
-            </w:pPr>
-            <w:r>
-              <w:rPr>
-                <w:color w:val="24292F"/>
-              </w:rPr>
-              <w:t>Trong input (khuyến nghị) · Đường dẫn khác — Tài liệu: SPEC / yêu cầu · Figma wireframe · Ảnh · Không có</w:t>
-            </w:r>
-          </w:p>
-        </w:tc>
-      </w:tr>
-      <w:tr>
-        <w:tc>
-          <w:tcPr>
-            <w:tcW w:w="2900" w:type="dxa"/>
-            <w:tcBorders>
-              <w:top w:val="single" w:sz="4" w:space="0" w:color="D0D7DE"/>
-              <w:left w:val="single" w:sz="4" w:space="0" w:color="D0D7DE"/>
-              <w:bottom w:val="single" w:sz="4" w:space="0" w:color="D0D7DE"/>
-              <w:right w:val="single" w:sz="4" w:space="0" w:color="D0D7DE"/>
-            </w:tcBorders>
-            <w:tcMar>
-              <w:top w:w="100" w:type="dxa"/>
-              <w:left w:w="140" w:type="dxa"/>
-              <w:bottom w:w="100" w:type="dxa"/>
-              <w:right w:w="140" w:type="dxa"/>
-            </w:tcMar>
-          </w:tcPr>
-          <w:p>
-            <w:pPr>
-              <w:spacing w:before="60" w:after="60"/>
-            </w:pPr>
-            <w:r>
-              <w:rPr>
-                <w:b/>
-                <w:bCs/>
-                <w:color w:val="24292F"/>
-              </w:rPr>
-              <w:t>5. Muốn phân tích / vẽ gì?</w:t>
-            </w:r>
-          </w:p>
-        </w:tc>
-        <w:tc>
-          <w:tcPr>
-            <w:tcW w:w="6846" w:type="dxa"/>
-            <w:tcBorders>
-              <w:top w:val="single" w:sz="4" w:space="0" w:color="D0D7DE"/>
-              <w:left w:val="single" w:sz="4" w:space="0" w:color="D0D7DE"/>
-              <w:bottom w:val="single" w:sz="4" w:space="0" w:color="D0D7DE"/>
-              <w:right w:val="single" w:sz="4" w:space="0" w:color="D0D7DE"/>
-            </w:tcBorders>
-            <w:tcMar>
-              <w:top w:w="100" w:type="dxa"/>
-              <w:left w:w="140" w:type="dxa"/>
-              <w:bottom w:w="100" w:type="dxa"/>
-              <w:right w:w="140" w:type="dxa"/>
-            </w:tcMar>
-          </w:tcPr>
-          <w:p>
-            <w:pPr>
-              <w:spacing w:before="60" w:after="60"/>
-            </w:pPr>
-            <w:r>
-              <w:rPr>
-                <w:color w:val="24292F"/>
-              </w:rPr>
-              <w:t>Vẽ toàn bộ (khuyến nghị) · Chọn một số màn · Chỉ phân tích (chưa vẽ) · Vẽ 1 luồng cụ thể</w:t>
-            </w:r>
-          </w:p>
-        </w:tc>
-      </w:tr>
-      <w:tr>
-        <w:tc>
-          <w:tcPr>
-            <w:tcW w:w="2900" w:type="dxa"/>
-            <w:tcBorders>
-              <w:top w:val="single" w:sz="4" w:space="0" w:color="D0D7DE"/>
-              <w:left w:val="single" w:sz="4" w:space="0" w:color="D0D7DE"/>
-              <w:bottom w:val="single" w:sz="4" w:space="0" w:color="D0D7DE"/>
-              <w:right w:val="single" w:sz="4" w:space="0" w:color="D0D7DE"/>
-            </w:tcBorders>
-            <w:tcMar>
-              <w:top w:w="100" w:type="dxa"/>
-              <w:left w:w="140" w:type="dxa"/>
-              <w:bottom w:w="100" w:type="dxa"/>
-              <w:right w:w="140" w:type="dxa"/>
-            </w:tcMar>
-          </w:tcPr>
-          <w:p>
-            <w:pPr>
-              <w:spacing w:before="60" w:after="60"/>
-            </w:pPr>
-            <w:r>
-              <w:rPr>
-                <w:b/>
-                <w:bCs/>
-                <w:color w:val="24292F"/>
-              </w:rPr>
-              <w:t>6. Link Figma đầu ra? · Tên output?</w:t>
-            </w:r>
-          </w:p>
-        </w:tc>
-        <w:tc>
-          <w:tcPr>
-            <w:tcW w:w="6846" w:type="dxa"/>
-            <w:tcBorders>
-              <w:top w:val="single" w:sz="4" w:space="0" w:color="D0D7DE"/>
-              <w:left w:val="single" w:sz="4" w:space="0" w:color="D0D7DE"/>
-              <w:bottom w:val="single" w:sz="4" w:space="0" w:color="D0D7DE"/>
-              <w:right w:val="single" w:sz="4" w:space="0" w:color="D0D7DE"/>
-            </w:tcBorders>
-            <w:tcMar>
-              <w:top w:w="100" w:type="dxa"/>
-              <w:left w:w="140" w:type="dxa"/>
-              <w:bottom w:w="100" w:type="dxa"/>
-              <w:right w:w="140" w:type="dxa"/>
-            </w:tcMar>
-          </w:tcPr>
-          <w:p>
-            <w:pPr>
-              <w:spacing w:before="60" w:after="60"/>
-            </w:pPr>
-            <w:r>
-              <w:rPr>
-                <w:color w:val="24292F"/>
-              </w:rPr>
-              <w:t>Dán link (bắt buộc, có quyền EDIT) hoặc Tạo file mới — Tên: Claude đề xuất AI_Generate_&lt;tính năng&gt; · Tự đặt</w:t>
-            </w:r>
-          </w:p>
-        </w:tc>
-      </w:tr>
-      <w:tr>
-        <w:tc>
-          <w:tcPr>
-            <w:tcW w:w="2900" w:type="dxa"/>
-            <w:tcBorders>
-              <w:top w:val="single" w:sz="4" w:space="0" w:color="D0D7DE"/>
-              <w:left w:val="single" w:sz="4" w:space="0" w:color="D0D7DE"/>
-              <w:bottom w:val="single" w:sz="4" w:space="0" w:color="D0D7DE"/>
-              <w:right w:val="single" w:sz="4" w:space="0" w:color="D0D7DE"/>
-            </w:tcBorders>
-            <w:tcMar>
-              <w:top w:w="100" w:type="dxa"/>
-              <w:left w:w="140" w:type="dxa"/>
-              <w:bottom w:w="100" w:type="dxa"/>
-              <w:right w:w="140" w:type="dxa"/>
-            </w:tcMar>
-          </w:tcPr>
-          <w:p>
-            <w:pPr>
-              <w:spacing w:before="60" w:after="60"/>
-            </w:pPr>
-            <w:r>
-              <w:rPr>
-                <w:b/>
-                <w:bCs/>
-                <w:color w:val="24292F"/>
-              </w:rPr>
-              <w:t>7. Platform? · Ngôn ngữ tên màn?</w:t>
-            </w:r>
-          </w:p>
-        </w:tc>
-        <w:tc>
-          <w:tcPr>
-            <w:tcW w:w="6846" w:type="dxa"/>
-            <w:tcBorders>
-              <w:top w:val="single" w:sz="4" w:space="0" w:color="D0D7DE"/>
-              <w:left w:val="single" w:sz="4" w:space="0" w:color="D0D7DE"/>
-              <w:bottom w:val="single" w:sz="4" w:space="0" w:color="D0D7DE"/>
-              <w:right w:val="single" w:sz="4" w:space="0" w:color="D0D7DE"/>
-            </w:tcBorders>
-            <w:tcMar>
-              <w:top w:w="100" w:type="dxa"/>
-              <w:left w:w="140" w:type="dxa"/>
-              <w:bottom w:w="100" w:type="dxa"/>
-              <w:right w:w="140" w:type="dxa"/>
-            </w:tcMar>
-          </w:tcPr>
-          <w:p>
-            <w:pPr>
-              <w:spacing w:before="60" w:after="60"/>
-            </w:pPr>
-            <w:r>
-              <w:rPr>
-                <w:color w:val="24292F"/>
-              </w:rPr>
-              <w:t>Platform theo design system — Ngôn ngữ: vi + ja + en (khuyến nghị) · vi + ja · ja · vi</w:t>
-            </w:r>
-          </w:p>
-        </w:tc>
-      </w:tr>
-      <w:tr>
-        <w:tc>
-          <w:tcPr>
-            <w:tcW w:w="2900" w:type="dxa"/>
-            <w:tcBorders>
-              <w:top w:val="single" w:sz="4" w:space="0" w:color="D0D7DE"/>
-              <w:left w:val="single" w:sz="4" w:space="0" w:color="D0D7DE"/>
-              <w:bottom w:val="single" w:sz="4" w:space="0" w:color="D0D7DE"/>
-              <w:right w:val="single" w:sz="4" w:space="0" w:color="D0D7DE"/>
-            </w:tcBorders>
-            <w:tcMar>
-              <w:top w:w="100" w:type="dxa"/>
-              <w:left w:w="140" w:type="dxa"/>
-              <w:bottom w:w="100" w:type="dxa"/>
-              <w:right w:w="140" w:type="dxa"/>
-            </w:tcMar>
-          </w:tcPr>
-          <w:p>
-            <w:pPr>
-              <w:spacing w:before="60" w:after="60"/>
-            </w:pPr>
-            <w:r>
-              <w:rPr>
-                <w:b/>
-                <w:bCs/>
-                <w:color w:val="24292F"/>
-              </w:rPr>
-              <w:t>8. Duyệt danh sách màn?</w:t>
-            </w:r>
-          </w:p>
-        </w:tc>
-        <w:tc>
-          <w:tcPr>
-            <w:tcW w:w="6846" w:type="dxa"/>
-            <w:tcBorders>
-              <w:top w:val="single" w:sz="4" w:space="0" w:color="D0D7DE"/>
-              <w:left w:val="single" w:sz="4" w:space="0" w:color="D0D7DE"/>
-              <w:bottom w:val="single" w:sz="4" w:space="0" w:color="D0D7DE"/>
-              <w:right w:val="single" w:sz="4" w:space="0" w:color="D0D7DE"/>
-            </w:tcBorders>
-            <w:tcMar>
-              <w:top w:w="100" w:type="dxa"/>
-              <w:left w:w="140" w:type="dxa"/>
-              <w:bottom w:w="100" w:type="dxa"/>
-              <w:right w:w="140" w:type="dxa"/>
-            </w:tcMar>
-          </w:tcPr>
-          <w:p>
-            <w:pPr>
-              <w:spacing w:before="60" w:after="60"/>
-            </w:pPr>
-            <w:r>
-              <w:rPr>
-                <w:color w:val="24292F"/>
-              </w:rPr>
-              <w:t>Claude liệt kê các màn + popup / toast / lỗi → Duyệt · Sửa danh sách</w:t>
-            </w:r>
-          </w:p>
-        </w:tc>
-      </w:tr>
-    </w:tbl>
-    <w:p>
-      <w:pPr>
-        <w:spacing w:before="120" w:after="40"/>
-        <w:jc w:val="center"/>
-      </w:pPr>
-      <w:r>
-        <w:rPr>
-          <w:noProof/>
-        </w:rPr>
-        <w:lastRenderedPageBreak/>
-        <w:drawing>
-          <wp:inline distT="0" distB="0" distL="0" distR="0">
-            <wp:extent cx="5905500" cy="2047875"/>
-            <wp:effectExtent l="0" t="0" r="0" b="0"/>
-            <wp:docPr id="9" name="gen/g_ask.png" descr="Hình minh họa — hộp chọn design system và phạm vi" title="Hình minh họa — hộp chọn design system và phạm vi"/>
-            <wp:cNvGraphicFramePr>
-              <a:graphicFrameLocks xmlns:a="http://schemas.openxmlformats.org/drawingml/2006/main" noChangeAspect="1"/>
-            </wp:cNvGraphicFramePr>
-            <a:graphic xmlns:a="http://schemas.openxmlformats.org/drawingml/2006/main">
-              <a:graphicData uri="http://schemas.openxmlformats.org/drawingml/2006/picture">
-                <pic:pic xmlns:pic="http://schemas.openxmlformats.org/drawingml/2006/picture">
-                  <pic:nvPicPr>
-                    <pic:cNvPr id="0" name=""/>
-                    <pic:cNvPicPr>
-                      <a:picLocks noChangeAspect="1" noChangeArrowheads="1"/>
-                    </pic:cNvPicPr>
-                  </pic:nvPicPr>
-                  <pic:blipFill>
-                    <a:blip r:embed="rId15"/>
-                    <a:srcRect/>
-                    <a:stretch>
-                      <a:fillRect/>
-                    </a:stretch>
-                  </pic:blipFill>
-                  <pic:spPr bwMode="auto">
-                    <a:xfrm>
-                      <a:off x="0" y="0"/>
-                      <a:ext cx="5905500" cy="2047875"/>
-                    </a:xfrm>
-                    <a:prstGeom prst="rect">
-                      <a:avLst/>
-                    </a:prstGeom>
-                  </pic:spPr>
-                </pic:pic>
-              </a:graphicData>
-            </a:graphic>
-          </wp:inline>
-        </w:drawing>
-      </w:r>
-    </w:p>
-    <w:p>
-      <w:pPr>
-        <w:spacing w:before="60" w:after="160"/>
-        <w:jc w:val="center"/>
-      </w:pPr>
-      <w:r>
-        <w:rPr>
-          <w:i/>
-          <w:iCs/>
-          <w:color w:val="6E7781"/>
-          <w:sz w:val="18"/>
-          <w:szCs w:val="18"/>
-        </w:rPr>
-        <w:t>Hình minh họa — hộp chọn design system và phạm vi</w:t>
-      </w:r>
-    </w:p>
-    <w:p>
-      <w:pPr>
-        <w:spacing w:before="60" w:after="60"/>
-      </w:pPr>
-      <w:r>
-        <w:rPr>
-          <w:b/>
-          <w:bCs/>
-          <w:color w:val="24292F"/>
-        </w:rPr>
-        <w:t xml:space="preserve">Tên đa ngôn ngữ không bị cắt: </w:t>
-      </w:r>
-      <w:r>
-        <w:rPr>
-          <w:color w:val="24292F"/>
-        </w:rPr>
-        <w:t>Claude đặt tên layer 1 dòng và thêm nhãn chữ nhiều dòng (mỗi ngôn ngữ 1 dòng) ngay trên mỗi màn.</w:t>
-      </w:r>
-    </w:p>
-    <w:p>
-      <w:pPr>
-        <w:spacing w:before="120" w:after="40"/>
-        <w:jc w:val="center"/>
-      </w:pPr>
-      <w:r>
-        <w:rPr>
-          <w:noProof/>
-        </w:rPr>
-        <w:drawing>
-          <wp:inline distT="0" distB="0" distL="0" distR="0">
-            <wp:extent cx="5524500" cy="1733550"/>
-            <wp:effectExtent l="0" t="0" r="0" b="0"/>
-            <wp:docPr id="10" name="gen/img3_naming.png" descr="Trái: tên 1 dòng bị cắt — Phải: nhãn nhiều dòng đầy đủ" title="Trái: tên 1 dòng bị cắt — Phải: nhãn nhiều dòng đầy đủ"/>
-            <wp:cNvGraphicFramePr>
-              <a:graphicFrameLocks xmlns:a="http://schemas.openxmlformats.org/drawingml/2006/main" noChangeAspect="1"/>
-            </wp:cNvGraphicFramePr>
-            <a:graphic xmlns:a="http://schemas.openxmlformats.org/drawingml/2006/main">
-              <a:graphicData uri="http://schemas.openxmlformats.org/drawingml/2006/picture">
-                <pic:pic xmlns:pic="http://schemas.openxmlformats.org/drawingml/2006/picture">
-                  <pic:nvPicPr>
-                    <pic:cNvPr id="0" name=""/>
-                    <pic:cNvPicPr>
-                      <a:picLocks noChangeAspect="1" noChangeArrowheads="1"/>
-                    </pic:cNvPicPr>
-                  </pic:nvPicPr>
-                  <pic:blipFill>
-                    <a:blip r:embed="rId16"/>
-                    <a:srcRect/>
-                    <a:stretch>
-                      <a:fillRect/>
-                    </a:stretch>
-                  </pic:blipFill>
-                  <pic:spPr bwMode="auto">
-                    <a:xfrm>
-                      <a:off x="0" y="0"/>
-                      <a:ext cx="5524500" cy="1733550"/>
-                    </a:xfrm>
-                    <a:prstGeom prst="rect">
-                      <a:avLst/>
-                    </a:prstGeom>
-                  </pic:spPr>
-                </pic:pic>
-              </a:graphicData>
-            </a:graphic>
-          </wp:inline>
-        </w:drawing>
-      </w:r>
-    </w:p>
-    <w:p>
-      <w:pPr>
-        <w:spacing w:before="60" w:after="160"/>
-        <w:jc w:val="center"/>
-      </w:pPr>
-      <w:r>
-        <w:rPr>
-          <w:i/>
-          <w:iCs/>
-          <w:color w:val="6E7781"/>
-          <w:sz w:val="18"/>
-          <w:szCs w:val="18"/>
-        </w:rPr>
-        <w:t>Trái: tên 1 dòng bị cắt — Phải: nhãn nhiều dòng đầy đủ</w:t>
-      </w:r>
-    </w:p>
-    <w:p>
-      <w:pPr>
-        <w:keepNext/>
-        <w:spacing w:after="120"/>
-      </w:pPr>
-    </w:p>
-    <w:tbl>
-      <w:tblPr>
-        <w:tblW w:w="9746" w:type="dxa"/>
-        <w:tblBorders>
-          <w:top w:val="single" w:sz="4" w:space="0" w:color="auto"/>
-          <w:left w:val="single" w:sz="4" w:space="0" w:color="auto"/>
-          <w:bottom w:val="single" w:sz="4" w:space="0" w:color="auto"/>
-          <w:right w:val="single" w:sz="4" w:space="0" w:color="auto"/>
-          <w:insideH w:val="single" w:sz="4" w:space="0" w:color="auto"/>
-          <w:insideV w:val="single" w:sz="4" w:space="0" w:color="auto"/>
-        </w:tblBorders>
-        <w:tblCellMar>
-          <w:left w:w="10" w:type="dxa"/>
-          <w:right w:w="10" w:type="dxa"/>
-        </w:tblCellMar>
-        <w:tblLook w:val="04A0" w:firstRow="1" w:lastRow="0" w:firstColumn="1" w:lastColumn="0" w:noHBand="0" w:noVBand="1"/>
-      </w:tblPr>
-      <w:tblGrid>
-        <w:gridCol w:w="9746"/>
-      </w:tblGrid>
-      <w:tr>
-        <w:tc>
-          <w:tcPr>
-            <w:tcW w:w="9746" w:type="dxa"/>
-            <w:tcBorders>
-              <w:top w:val="single" w:sz="4" w:space="0" w:color="0969DA"/>
-              <w:left w:val="single" w:sz="4" w:space="0" w:color="0969DA"/>
-              <w:bottom w:val="single" w:sz="4" w:space="0" w:color="0969DA"/>
-              <w:right w:val="single" w:sz="4" w:space="0" w:color="0969DA"/>
-            </w:tcBorders>
-            <w:shd w:val="clear" w:color="auto" w:fill="0969DA"/>
-            <w:tcMar>
-              <w:top w:w="100" w:type="dxa"/>
-              <w:left w:w="140" w:type="dxa"/>
-              <w:bottom w:w="100" w:type="dxa"/>
-              <w:right w:w="140" w:type="dxa"/>
-            </w:tcMar>
-          </w:tcPr>
-          <w:p>
-            <w:pPr>
-              <w:keepNext/>
-              <w:spacing w:before="40" w:after="40"/>
-            </w:pPr>
-            <w:r>
-              <w:rPr>
-                <w:b/>
-                <w:bCs/>
-                <w:color w:val="FFFFFF"/>
-                <w:sz w:val="26"/>
-                <w:szCs w:val="26"/>
-              </w:rPr>
-              <w:t>BƯỚC 8 — ĐỢI VÀ KIỂM TRA KẾT QUẢ TRÊN FIGMA</w:t>
-            </w:r>
-          </w:p>
-        </w:tc>
-      </w:tr>
-    </w:tbl>
-    <w:p>
-      <w:pPr>
-        <w:keepNext/>
-        <w:spacing w:after="80"/>
-      </w:pPr>
-    </w:p>
-    <w:p>
-      <w:pPr>
-        <w:spacing w:before="60" w:after="60"/>
-      </w:pPr>
-      <w:r>
-        <w:rPr>
-          <w:color w:val="24292F"/>
-        </w:rPr>
-        <w:t>Khi xong, Claude trả về link Figma và file báo cáo. Bấm link để mở đúng Section vừa vẽ, rồi kiểm tra:</w:t>
-      </w:r>
-    </w:p>
-    <w:p>
-      <w:pPr>
-        <w:pStyle w:val="ListParagraph"/>
-        <w:numPr>
-          <w:ilvl w:val="0"/>
-          <w:numId w:val="2"/>
-        </w:numPr>
-        <w:spacing w:before="20" w:after="20"/>
-      </w:pPr>
-      <w:r>
-        <w:rPr>
-          <w:color w:val="24292F"/>
-        </w:rPr>
-        <w:t>Đủ các màn + popup / toast / màn lỗi / màn trống so với tài liệu nguồn</w:t>
-      </w:r>
-    </w:p>
-    <w:p>
-      <w:pPr>
-        <w:pStyle w:val="ListParagraph"/>
-        <w:numPr>
-          <w:ilvl w:val="0"/>
-          <w:numId w:val="2"/>
-        </w:numPr>
-        <w:spacing w:before="20" w:after="20"/>
-      </w:pPr>
-      <w:r>
-        <w:rPr>
-          <w:color w:val="24292F"/>
-        </w:rPr>
-        <w:t>Đúng màu, font, kích thước theo design system</w:t>
-      </w:r>
-    </w:p>
-    <w:p>
-      <w:pPr>
-        <w:pStyle w:val="ListParagraph"/>
-        <w:numPr>
-          <w:ilvl w:val="0"/>
-          <w:numId w:val="2"/>
-        </w:numPr>
-        <w:spacing w:before="20" w:after="20"/>
-      </w:pPr>
-      <w:r>
-        <w:rPr>
-          <w:color w:val="24292F"/>
-        </w:rPr>
-        <w:t>Component là component thật của library dự án</w:t>
-      </w:r>
-    </w:p>
-    <w:p>
-      <w:pPr>
-        <w:pStyle w:val="ListParagraph"/>
-        <w:numPr>
-          <w:ilvl w:val="0"/>
-          <w:numId w:val="2"/>
-        </w:numPr>
-        <w:spacing w:before="20" w:after="20"/>
-      </w:pPr>
-      <w:r>
-        <w:rPr>
-          <w:color w:val="24292F"/>
-        </w:rPr>
-        <w:t>Tên màn hình đủ ngôn ngữ, không bị cắt chữ</w:t>
-      </w:r>
-    </w:p>
-    <w:p>
-      <w:pPr>
-        <w:pStyle w:val="ListParagraph"/>
-        <w:numPr>
-          <w:ilvl w:val="0"/>
-          <w:numId w:val="2"/>
-        </w:numPr>
-        <w:spacing w:before="20" w:after="20"/>
-      </w:pPr>
-      <w:r>
-        <w:rPr>
-          <w:color w:val="24292F"/>
-        </w:rPr>
-        <w:t>Báo cáo: mở folder output → figma-screens.md (danh sách màn + link Figma + điểm cần xác nhận)</w:t>
-      </w:r>
-    </w:p>
-    <w:p>
-      <w:pPr>
-        <w:spacing w:before="120" w:after="40"/>
-        <w:jc w:val="center"/>
-      </w:pPr>
-      <w:r>
-        <w:rPr>
-          <w:noProof/>
-        </w:rPr>
-        <w:lastRenderedPageBreak/>
-        <w:drawing>
-          <wp:inline distT="0" distB="0" distL="0" distR="0">
-            <wp:extent cx="5905500" cy="2695575"/>
-            <wp:effectExtent l="0" t="0" r="0" b="0"/>
-            <wp:docPr id="11" name="gen/s7g.png" descr="Hình minh họa — Bước 8" title="Hình minh họa — Bước 8"/>
-            <wp:cNvGraphicFramePr>
-              <a:graphicFrameLocks xmlns:a="http://schemas.openxmlformats.org/drawingml/2006/main" noChangeAspect="1"/>
-            </wp:cNvGraphicFramePr>
-            <a:graphic xmlns:a="http://schemas.openxmlformats.org/drawingml/2006/main">
-              <a:graphicData uri="http://schemas.openxmlformats.org/drawingml/2006/picture">
-                <pic:pic xmlns:pic="http://schemas.openxmlformats.org/drawingml/2006/picture">
-                  <pic:nvPicPr>
-                    <pic:cNvPr id="0" name=""/>
-                    <pic:cNvPicPr>
-                      <a:picLocks noChangeAspect="1" noChangeArrowheads="1"/>
-                    </pic:cNvPicPr>
-                  </pic:nvPicPr>
-                  <pic:blipFill>
-                    <a:blip r:embed="rId17"/>
-                    <a:srcRect/>
-                    <a:stretch>
-                      <a:fillRect/>
-                    </a:stretch>
-                  </pic:blipFill>
-                  <pic:spPr bwMode="auto">
-                    <a:xfrm>
-                      <a:off x="0" y="0"/>
-                      <a:ext cx="5905500" cy="2695575"/>
-                    </a:xfrm>
-                    <a:prstGeom prst="rect">
-                      <a:avLst/>
-                    </a:prstGeom>
-                  </pic:spPr>
-                </pic:pic>
-              </a:graphicData>
-            </a:graphic>
-          </wp:inline>
-        </w:drawing>
-      </w:r>
-    </w:p>
-    <w:p>
-      <w:pPr>
-        <w:spacing w:before="60" w:after="160"/>
-        <w:jc w:val="center"/>
-      </w:pPr>
-      <w:r>
-        <w:rPr>
-          <w:i/>
-          <w:iCs/>
-          <w:color w:val="6E7781"/>
-          <w:sz w:val="18"/>
-          <w:szCs w:val="18"/>
-        </w:rPr>
-        <w:t>Hình minh họa — Bước 8</w:t>
-      </w:r>
-    </w:p>
-    <w:p>
-      <w:pPr>
-        <w:keepNext/>
-        <w:spacing w:after="120"/>
-      </w:pPr>
-    </w:p>
-    <w:tbl>
-      <w:tblPr>
-        <w:tblW w:w="9746" w:type="dxa"/>
-        <w:tblBorders>
-          <w:top w:val="single" w:sz="4" w:space="0" w:color="auto"/>
-          <w:left w:val="single" w:sz="4" w:space="0" w:color="auto"/>
-          <w:bottom w:val="single" w:sz="4" w:space="0" w:color="auto"/>
-          <w:right w:val="single" w:sz="4" w:space="0" w:color="auto"/>
-          <w:insideH w:val="single" w:sz="4" w:space="0" w:color="auto"/>
-          <w:insideV w:val="single" w:sz="4" w:space="0" w:color="auto"/>
-        </w:tblBorders>
-        <w:tblCellMar>
-          <w:left w:w="10" w:type="dxa"/>
-          <w:right w:w="10" w:type="dxa"/>
-        </w:tblCellMar>
-        <w:tblLook w:val="04A0" w:firstRow="1" w:lastRow="0" w:firstColumn="1" w:lastColumn="0" w:noHBand="0" w:noVBand="1"/>
-      </w:tblPr>
-      <w:tblGrid>
-        <w:gridCol w:w="9746"/>
-      </w:tblGrid>
-      <w:tr>
-        <w:tc>
-          <w:tcPr>
-            <w:tcW w:w="9746" w:type="dxa"/>
-            <w:tcBorders>
-              <w:top w:val="single" w:sz="4" w:space="0" w:color="0969DA"/>
-              <w:left w:val="single" w:sz="4" w:space="0" w:color="0969DA"/>
-              <w:bottom w:val="single" w:sz="4" w:space="0" w:color="0969DA"/>
-              <w:right w:val="single" w:sz="4" w:space="0" w:color="0969DA"/>
-            </w:tcBorders>
-            <w:shd w:val="clear" w:color="auto" w:fill="0969DA"/>
-            <w:tcMar>
-              <w:top w:w="100" w:type="dxa"/>
-              <w:left w:w="140" w:type="dxa"/>
-              <w:bottom w:w="100" w:type="dxa"/>
-              <w:right w:w="140" w:type="dxa"/>
-            </w:tcMar>
-          </w:tcPr>
-          <w:p>
-            <w:pPr>
-              <w:keepNext/>
-              <w:spacing w:before="40" w:after="40"/>
-            </w:pPr>
-            <w:r>
-              <w:rPr>
-                <w:b/>
-                <w:bCs/>
-                <w:color w:val="FFFFFF"/>
-                <w:sz w:val="26"/>
-                <w:szCs w:val="26"/>
-              </w:rPr>
-              <w:t>BƯỚC 9 — SỬA MÀN / CẬP NHẬT DESIGN SYSTEM</w:t>
-            </w:r>
-          </w:p>
-        </w:tc>
-      </w:tr>
-    </w:tbl>
-    <w:p>
-      <w:pPr>
-        <w:keepNext/>
-        <w:spacing w:after="80"/>
-      </w:pPr>
-    </w:p>
-    <w:p>
-      <w:pPr>
-        <w:pStyle w:val="Heading2"/>
-        <w:keepNext/>
-        <w:spacing w:before="240" w:after="100"/>
-      </w:pPr>
-      <w:r>
-        <w:rPr>
-          <w:b/>
-          <w:bCs/>
-          <w:color w:val="D86107"/>
-        </w:rPr>
-        <w:t>Sửa 1 màn</w:t>
-      </w:r>
-    </w:p>
-    <w:p>
-      <w:pPr>
-        <w:pStyle w:val="ListParagraph"/>
-        <w:numPr>
-          <w:ilvl w:val="0"/>
-          <w:numId w:val="9"/>
-        </w:numPr>
-        <w:spacing w:before="20" w:after="20"/>
-      </w:pPr>
-      <w:r>
-        <w:rPr>
-          <w:color w:val="24292F"/>
-        </w:rPr>
-        <w:t xml:space="preserve">Trong Figma, chuột phải vào frame cần sửa → </w:t>
-      </w:r>
-      <w:r>
-        <w:rPr>
-          <w:b/>
-          <w:bCs/>
-          <w:color w:val="24292F"/>
-        </w:rPr>
-        <w:t>Copy link to selection</w:t>
-      </w:r>
-      <w:r>
-        <w:rPr>
-          <w:color w:val="24292F"/>
-        </w:rPr>
-        <w:t>.</w:t>
-      </w:r>
-    </w:p>
-    <w:p>
-      <w:pPr>
-        <w:pStyle w:val="ListParagraph"/>
-        <w:numPr>
-          <w:ilvl w:val="0"/>
-          <w:numId w:val="9"/>
-        </w:numPr>
-        <w:spacing w:before="20" w:after="20"/>
-      </w:pPr>
-      <w:r>
-        <w:rPr>
-          <w:color w:val="24292F"/>
-        </w:rPr>
-        <w:t>Dán vào ô chat Claude kèm nội dung cần sửa:</w:t>
-      </w:r>
-    </w:p>
-    <w:tbl>
-      <w:tblPr>
-        <w:tblW w:w="9746" w:type="dxa"/>
-        <w:tblBorders>
-          <w:top w:val="single" w:sz="4" w:space="0" w:color="auto"/>
-          <w:left w:val="single" w:sz="4" w:space="0" w:color="auto"/>
-          <w:bottom w:val="single" w:sz="4" w:space="0" w:color="auto"/>
-          <w:right w:val="single" w:sz="4" w:space="0" w:color="auto"/>
-          <w:insideH w:val="single" w:sz="4" w:space="0" w:color="auto"/>
-          <w:insideV w:val="single" w:sz="4" w:space="0" w:color="auto"/>
-        </w:tblBorders>
-        <w:tblCellMar>
-          <w:left w:w="10" w:type="dxa"/>
-          <w:right w:w="10" w:type="dxa"/>
-        </w:tblCellMar>
-        <w:tblLook w:val="04A0" w:firstRow="1" w:lastRow="0" w:firstColumn="1" w:lastColumn="0" w:noHBand="0" w:noVBand="1"/>
-      </w:tblPr>
-      <w:tblGrid>
-        <w:gridCol w:w="9746"/>
-      </w:tblGrid>
-      <w:tr>
-        <w:tc>
-          <w:tcPr>
-            <w:tcW w:w="9746" w:type="dxa"/>
-            <w:tcBorders>
-              <w:top w:val="single" w:sz="4" w:space="0" w:color="97D3FF"/>
-              <w:left w:val="single" w:sz="4" w:space="0" w:color="97D3FF"/>
-              <w:bottom w:val="single" w:sz="4" w:space="0" w:color="97D3FF"/>
-              <w:right w:val="single" w:sz="4" w:space="0" w:color="97D3FF"/>
-            </w:tcBorders>
-            <w:shd w:val="clear" w:color="auto" w:fill="E5F6FF"/>
-            <w:tcMar>
-              <w:top w:w="100" w:type="dxa"/>
-              <w:left w:w="140" w:type="dxa"/>
-              <w:bottom w:w="100" w:type="dxa"/>
-              <w:right w:w="140" w:type="dxa"/>
-            </w:tcMar>
-          </w:tcPr>
-          <w:p>
-            <w:pPr>
-              <w:spacing w:before="60" w:after="40"/>
-            </w:pPr>
-            <w:r>
-              <w:rPr>
-                <w:b/>
-                <w:bCs/>
-                <w:color w:val="6E7781"/>
-                <w:sz w:val="16"/>
-                <w:szCs w:val="16"/>
-              </w:rPr>
-              <w:t>PROMPT MẪU</w:t>
-            </w:r>
-          </w:p>
-          <w:p>
-            <w:pPr>
-              <w:spacing w:after="20"/>
-            </w:pPr>
-            <w:r>
-              <w:rPr>
-                <w:b/>
-                <w:bCs/>
-                <w:color w:val="0969DA"/>
-                <w:sz w:val="24"/>
-                <w:szCs w:val="24"/>
-              </w:rPr>
-              <w:t>Sửa màn &lt;link Figma frame&gt;: thêm cột Ngày duyệt vào bảng</w:t>
-            </w:r>
-          </w:p>
-        </w:tc>
-      </w:tr>
-    </w:tbl>
-    <w:p>
-      <w:pPr>
-        <w:keepNext/>
-        <w:spacing w:after="60"/>
-      </w:pPr>
-    </w:p>
-    <w:tbl>
-      <w:tblPr>
-        <w:tblW w:w="9746" w:type="dxa"/>
-        <w:tblBorders>
-          <w:top w:val="single" w:sz="4" w:space="0" w:color="auto"/>
-          <w:left w:val="single" w:sz="4" w:space="0" w:color="auto"/>
-          <w:bottom w:val="single" w:sz="4" w:space="0" w:color="auto"/>
-          <w:right w:val="single" w:sz="4" w:space="0" w:color="auto"/>
-          <w:insideH w:val="single" w:sz="4" w:space="0" w:color="auto"/>
-          <w:insideV w:val="single" w:sz="4" w:space="0" w:color="auto"/>
-        </w:tblBorders>
-        <w:tblCellMar>
-          <w:left w:w="10" w:type="dxa"/>
-          <w:right w:w="10" w:type="dxa"/>
-        </w:tblCellMar>
-        <w:tblLook w:val="04A0" w:firstRow="1" w:lastRow="0" w:firstColumn="1" w:lastColumn="0" w:noHBand="0" w:noVBand="1"/>
-      </w:tblPr>
-      <w:tblGrid>
-        <w:gridCol w:w="9746"/>
-      </w:tblGrid>
-      <w:tr>
-        <w:tc>
-          <w:tcPr>
-            <w:tcW w:w="9746" w:type="dxa"/>
-            <w:tcBorders>
-              <w:top w:val="single" w:sz="4" w:space="0" w:color="FDDA8A"/>
-              <w:left w:val="single" w:sz="4" w:space="0" w:color="FDDA8A"/>
-              <w:bottom w:val="single" w:sz="4" w:space="0" w:color="FDDA8A"/>
-              <w:right w:val="single" w:sz="4" w:space="0" w:color="FDDA8A"/>
-            </w:tcBorders>
-            <w:shd w:val="clear" w:color="auto" w:fill="FFF9EB"/>
-            <w:tcMar>
-              <w:top w:w="100" w:type="dxa"/>
-              <w:left w:w="140" w:type="dxa"/>
-              <w:bottom w:w="100" w:type="dxa"/>
-              <w:right w:w="140" w:type="dxa"/>
-            </w:tcMar>
-          </w:tcPr>
-          <w:p>
-            <w:pPr>
-              <w:spacing w:before="60" w:after="60"/>
-            </w:pPr>
-            <w:r>
-              <w:rPr>
-                <w:b/>
-                <w:bCs/>
-                <w:color w:val="D86107"/>
-              </w:rPr>
-              <w:t xml:space="preserve">Lưu ý: </w:t>
-            </w:r>
-            <w:r>
-              <w:rPr>
-                <w:color w:val="24292F"/>
-              </w:rPr>
-              <w:t>Claude chỉ sửa đúng màn được chỉ định, không vẽ lại toàn bộ.</w:t>
-            </w:r>
-          </w:p>
-        </w:tc>
-      </w:tr>
-    </w:tbl>
-    <w:p>
-      <w:pPr>
-        <w:pStyle w:val="Heading2"/>
-        <w:keepNext/>
-        <w:spacing w:before="240" w:after="100"/>
-      </w:pPr>
-      <w:r>
-        <w:rPr>
-          <w:b/>
-          <w:bCs/>
-          <w:color w:val="D86107"/>
-        </w:rPr>
-        <w:t>Cập nhật design system</w:t>
-      </w:r>
-    </w:p>
-    <w:tbl>
-      <w:tblPr>
-        <w:tblW w:w="9746" w:type="dxa"/>
-        <w:tblBorders>
-          <w:top w:val="single" w:sz="4" w:space="0" w:color="auto"/>
-          <w:left w:val="single" w:sz="4" w:space="0" w:color="auto"/>
-          <w:bottom w:val="single" w:sz="4" w:space="0" w:color="auto"/>
-          <w:right w:val="single" w:sz="4" w:space="0" w:color="auto"/>
-          <w:insideH w:val="single" w:sz="4" w:space="0" w:color="auto"/>
-          <w:insideV w:val="single" w:sz="4" w:space="0" w:color="auto"/>
-        </w:tblBorders>
-        <w:tblCellMar>
-          <w:left w:w="10" w:type="dxa"/>
-          <w:right w:w="10" w:type="dxa"/>
-        </w:tblCellMar>
-        <w:tblLook w:val="04A0" w:firstRow="1" w:lastRow="0" w:firstColumn="1" w:lastColumn="0" w:noHBand="0" w:noVBand="1"/>
-      </w:tblPr>
-      <w:tblGrid>
-        <w:gridCol w:w="9746"/>
-      </w:tblGrid>
-      <w:tr>
-        <w:tc>
-          <w:tcPr>
-            <w:tcW w:w="9746" w:type="dxa"/>
-            <w:tcBorders>
-              <w:top w:val="single" w:sz="4" w:space="0" w:color="97D3FF"/>
-              <w:left w:val="single" w:sz="4" w:space="0" w:color="97D3FF"/>
-              <w:bottom w:val="single" w:sz="4" w:space="0" w:color="97D3FF"/>
-              <w:right w:val="single" w:sz="4" w:space="0" w:color="97D3FF"/>
-            </w:tcBorders>
-            <w:shd w:val="clear" w:color="auto" w:fill="E5F6FF"/>
-            <w:tcMar>
-              <w:top w:w="100" w:type="dxa"/>
-              <w:left w:w="140" w:type="dxa"/>
-              <w:bottom w:w="100" w:type="dxa"/>
-              <w:right w:w="140" w:type="dxa"/>
-            </w:tcMar>
-          </w:tcPr>
-          <w:p>
-            <w:pPr>
-              <w:spacing w:before="60" w:after="40"/>
-            </w:pPr>
-            <w:r>
-              <w:rPr>
-                <w:b/>
-                <w:bCs/>
-                <w:color w:val="6E7781"/>
-                <w:sz w:val="16"/>
-                <w:szCs w:val="16"/>
-              </w:rPr>
-              <w:t>PROMPT MẪU</w:t>
-            </w:r>
-          </w:p>
-          <w:p>
-            <w:pPr>
-              <w:spacing w:after="20"/>
-            </w:pPr>
-            <w:r>
-              <w:rPr>
-                <w:b/>
-                <w:bCs/>
-                <w:color w:val="0969DA"/>
-                <w:sz w:val="24"/>
-                <w:szCs w:val="24"/>
-              </w:rPr>
-              <w:t>Cập nhật design system: màu chính đổi thành &lt;mã màu&gt;, theo &lt;link Figma&gt;</w:t>
-            </w:r>
-          </w:p>
-        </w:tc>
-      </w:tr>
-    </w:tbl>
-    <w:p>
-      <w:pPr>
-        <w:keepNext/>
-        <w:spacing w:after="60"/>
-      </w:pPr>
-    </w:p>
-    <w:tbl>
-      <w:tblPr>
-        <w:tblW w:w="9746" w:type="dxa"/>
-        <w:tblBorders>
-          <w:top w:val="single" w:sz="4" w:space="0" w:color="auto"/>
-          <w:left w:val="single" w:sz="4" w:space="0" w:color="auto"/>
-          <w:bottom w:val="single" w:sz="4" w:space="0" w:color="auto"/>
-          <w:right w:val="single" w:sz="4" w:space="0" w:color="auto"/>
-          <w:insideH w:val="single" w:sz="4" w:space="0" w:color="auto"/>
-          <w:insideV w:val="single" w:sz="4" w:space="0" w:color="auto"/>
-        </w:tblBorders>
-        <w:tblCellMar>
-          <w:left w:w="10" w:type="dxa"/>
-          <w:right w:w="10" w:type="dxa"/>
-        </w:tblCellMar>
-        <w:tblLook w:val="04A0" w:firstRow="1" w:lastRow="0" w:firstColumn="1" w:lastColumn="0" w:noHBand="0" w:noVBand="1"/>
-      </w:tblPr>
-      <w:tblGrid>
-        <w:gridCol w:w="9746"/>
-      </w:tblGrid>
-      <w:tr>
-        <w:tc>
-          <w:tcPr>
-            <w:tcW w:w="9746" w:type="dxa"/>
-            <w:tcBorders>
-              <w:top w:val="single" w:sz="4" w:space="0" w:color="FDDA8A"/>
-              <w:left w:val="single" w:sz="4" w:space="0" w:color="FDDA8A"/>
-              <w:bottom w:val="single" w:sz="4" w:space="0" w:color="FDDA8A"/>
-              <w:right w:val="single" w:sz="4" w:space="0" w:color="FDDA8A"/>
-            </w:tcBorders>
-            <w:shd w:val="clear" w:color="auto" w:fill="FFF9EB"/>
-            <w:tcMar>
-              <w:top w:w="100" w:type="dxa"/>
-              <w:left w:w="140" w:type="dxa"/>
-              <w:bottom w:w="100" w:type="dxa"/>
-              <w:right w:w="140" w:type="dxa"/>
-            </w:tcMar>
-          </w:tcPr>
-          <w:p>
-            <w:pPr>
-              <w:spacing w:before="60" w:after="60"/>
-            </w:pPr>
-            <w:r>
-              <w:rPr>
-                <w:b/>
-                <w:bCs/>
-                <w:color w:val="D86107"/>
-              </w:rPr>
-              <w:t xml:space="preserve">Lưu ý: </w:t>
-            </w:r>
-            <w:r>
-              <w:rPr>
-                <w:color w:val="24292F"/>
-              </w:rPr>
-              <w:t>Claude cập nhật folder design-system, ghi lịch sử thay đổi và báo các màn đã vẽ bị ảnh hưởng.</w:t>
-            </w:r>
-          </w:p>
-        </w:tc>
-      </w:tr>
-    </w:tbl>
     <w:p>
       <w:r>
         <w:br w:type="page"/>
@@ -5229,7 +3649,7 @@
         <w:rPr>
           <w:color w:val="24292F"/>
         </w:rPr>
-        <w:t>Gom toàn bộ quy định giao diện của dự án vào một link duy nhất. Designer duyệt một lần; agent và cả team dùng lại cho mọi màn sau, không phải hỏi lại.</w:t>
+        <w:t>Gom toàn bộ quy định giao diện của dự án vào một link duy nhất. Designer duyệt một lần; agent và cả team dùng lại cho mọi màn sau, không phải hỏi lại. Đã có artifact đúng định dạng thì Claude dùng chính link đó, không tạo thêm.</w:t>
       </w:r>
       <w:r>
         <w:rPr>
@@ -5243,7 +3663,7 @@
         </w:rPr>
         <w:t xml:space="preserve">Ví dụ &gt; </w:t>
       </w:r>
-      <w:hyperlink r:id="rId18" w:history="1">
+      <w:hyperlink r:id="rId15" w:history="1">
         <w:r>
           <w:rPr>
             <w:rStyle w:val="Hyperlink"/>
@@ -5276,6 +3696,203 @@
             <wp:extent cx="5905500" cy="2573110"/>
             <wp:effectExtent l="0" t="0" r="0" b="0"/>
             <wp:docPr id="201" name="output-201.png" descr="Trang artifact (bìa + các tab) và cấu trúc folder design-system/" title="Trang artifact (bìa + các tab) và cấu trúc folder design-system/"/>
+            <wp:cNvGraphicFramePr>
+              <a:graphicFrameLocks xmlns:a="http://schemas.openxmlformats.org/drawingml/2006/main" noChangeAspect="1"/>
+            </wp:cNvGraphicFramePr>
+            <a:graphic xmlns:a="http://schemas.openxmlformats.org/drawingml/2006/main">
+              <a:graphicData uri="http://schemas.openxmlformats.org/drawingml/2006/picture">
+                <pic:pic xmlns:pic="http://schemas.openxmlformats.org/drawingml/2006/picture">
+                  <pic:nvPicPr>
+                    <pic:cNvPr id="0" name=""/>
+                    <pic:cNvPicPr>
+                      <a:picLocks noChangeAspect="1" noChangeArrowheads="1"/>
+                    </pic:cNvPicPr>
+                  </pic:nvPicPr>
+                  <pic:blipFill>
+                    <a:blip r:embed="rId16"/>
+                    <a:srcRect/>
+                    <a:stretch>
+                      <a:fillRect/>
+                    </a:stretch>
+                  </pic:blipFill>
+                  <pic:spPr bwMode="auto">
+                    <a:xfrm>
+                      <a:off x="0" y="0"/>
+                      <a:ext cx="5905500" cy="2573110"/>
+                    </a:xfrm>
+                    <a:prstGeom prst="rect">
+                      <a:avLst/>
+                    </a:prstGeom>
+                  </pic:spPr>
+                </pic:pic>
+              </a:graphicData>
+            </a:graphic>
+          </wp:inline>
+        </w:drawing>
+      </w:r>
+    </w:p>
+    <w:p>
+      <w:pPr>
+        <w:spacing w:before="60" w:after="160"/>
+        <w:jc w:val="center"/>
+      </w:pPr>
+      <w:r>
+        <w:rPr>
+          <w:i/>
+          <w:iCs/>
+          <w:color w:val="6E7781"/>
+          <w:sz w:val="18"/>
+          <w:szCs w:val="18"/>
+        </w:rPr>
+        <w:t>Trang artifact (bìa + các tab) và cấu trúc folder design-system/</w:t>
+      </w:r>
+    </w:p>
+    <w:p>
+      <w:pPr>
+        <w:spacing w:before="120" w:after="40"/>
+        <w:jc w:val="center"/>
+      </w:pPr>
+      <w:r>
+        <w:rPr>
+          <w:noProof/>
+        </w:rPr>
+        <w:lastRenderedPageBreak/>
+        <w:drawing>
+          <wp:inline distT="0" distB="0" distL="0" distR="0">
+            <wp:extent cx="5905500" cy="3787956"/>
+            <wp:effectExtent l="0" t="0" r="0" b="0"/>
+            <wp:docPr id="202" name="output-202.png" descr="tokens.json — màu theo từng portal, thang chữ, spacing, radius, shadow" title="tokens.json — màu theo từng portal, thang chữ, spacing, radius, shadow"/>
+            <wp:cNvGraphicFramePr>
+              <a:graphicFrameLocks xmlns:a="http://schemas.openxmlformats.org/drawingml/2006/main" noChangeAspect="1"/>
+            </wp:cNvGraphicFramePr>
+            <a:graphic xmlns:a="http://schemas.openxmlformats.org/drawingml/2006/main">
+              <a:graphicData uri="http://schemas.openxmlformats.org/drawingml/2006/picture">
+                <pic:pic xmlns:pic="http://schemas.openxmlformats.org/drawingml/2006/picture">
+                  <pic:nvPicPr>
+                    <pic:cNvPr id="0" name=""/>
+                    <pic:cNvPicPr>
+                      <a:picLocks noChangeAspect="1" noChangeArrowheads="1"/>
+                    </pic:cNvPicPr>
+                  </pic:nvPicPr>
+                  <pic:blipFill>
+                    <a:blip r:embed="rId17"/>
+                    <a:srcRect/>
+                    <a:stretch>
+                      <a:fillRect/>
+                    </a:stretch>
+                  </pic:blipFill>
+                  <pic:spPr bwMode="auto">
+                    <a:xfrm>
+                      <a:off x="0" y="0"/>
+                      <a:ext cx="5905500" cy="3787956"/>
+                    </a:xfrm>
+                    <a:prstGeom prst="rect">
+                      <a:avLst/>
+                    </a:prstGeom>
+                  </pic:spPr>
+                </pic:pic>
+              </a:graphicData>
+            </a:graphic>
+          </wp:inline>
+        </w:drawing>
+      </w:r>
+    </w:p>
+    <w:p>
+      <w:pPr>
+        <w:spacing w:before="60" w:after="160"/>
+        <w:jc w:val="center"/>
+      </w:pPr>
+      <w:r>
+        <w:rPr>
+          <w:i/>
+          <w:iCs/>
+          <w:color w:val="6E7781"/>
+          <w:sz w:val="18"/>
+          <w:szCs w:val="18"/>
+        </w:rPr>
+        <w:t>tokens.json — màu theo từng portal, thang chữ, spacing, radius, shadow</w:t>
+      </w:r>
+    </w:p>
+    <w:p>
+      <w:pPr>
+        <w:spacing w:before="120" w:after="40"/>
+        <w:jc w:val="center"/>
+      </w:pPr>
+      <w:r>
+        <w:rPr>
+          <w:noProof/>
+        </w:rPr>
+        <w:drawing>
+          <wp:inline distT="0" distB="0" distL="0" distR="0">
+            <wp:extent cx="5905500" cy="4277269"/>
+            <wp:effectExtent l="0" t="0" r="0" b="0"/>
+            <wp:docPr id="203" name="output-203.png" descr="Component có hướng dẫn dùng và preview chạy thật" title="Component có hướng dẫn dùng và preview chạy thật"/>
+            <wp:cNvGraphicFramePr>
+              <a:graphicFrameLocks xmlns:a="http://schemas.openxmlformats.org/drawingml/2006/main" noChangeAspect="1"/>
+            </wp:cNvGraphicFramePr>
+            <a:graphic xmlns:a="http://schemas.openxmlformats.org/drawingml/2006/main">
+              <a:graphicData uri="http://schemas.openxmlformats.org/drawingml/2006/picture">
+                <pic:pic xmlns:pic="http://schemas.openxmlformats.org/drawingml/2006/picture">
+                  <pic:nvPicPr>
+                    <pic:cNvPr id="0" name=""/>
+                    <pic:cNvPicPr>
+                      <a:picLocks noChangeAspect="1" noChangeArrowheads="1"/>
+                    </pic:cNvPicPr>
+                  </pic:nvPicPr>
+                  <pic:blipFill>
+                    <a:blip r:embed="rId18"/>
+                    <a:srcRect/>
+                    <a:stretch>
+                      <a:fillRect/>
+                    </a:stretch>
+                  </pic:blipFill>
+                  <pic:spPr bwMode="auto">
+                    <a:xfrm>
+                      <a:off x="0" y="0"/>
+                      <a:ext cx="5905500" cy="4277269"/>
+                    </a:xfrm>
+                    <a:prstGeom prst="rect">
+                      <a:avLst/>
+                    </a:prstGeom>
+                  </pic:spPr>
+                </pic:pic>
+              </a:graphicData>
+            </a:graphic>
+          </wp:inline>
+        </w:drawing>
+      </w:r>
+    </w:p>
+    <w:p>
+      <w:pPr>
+        <w:spacing w:before="60" w:after="160"/>
+        <w:jc w:val="center"/>
+      </w:pPr>
+      <w:r>
+        <w:rPr>
+          <w:i/>
+          <w:iCs/>
+          <w:color w:val="6E7781"/>
+          <w:sz w:val="18"/>
+          <w:szCs w:val="18"/>
+        </w:rPr>
+        <w:t>Component có hướng dẫn dùng và preview chạy thật</w:t>
+      </w:r>
+    </w:p>
+    <w:p>
+      <w:pPr>
+        <w:spacing w:before="120" w:after="40"/>
+        <w:jc w:val="center"/>
+      </w:pPr>
+      <w:r>
+        <w:rPr>
+          <w:noProof/>
+        </w:rPr>
+        <w:lastRenderedPageBreak/>
+        <w:drawing>
+          <wp:inline distT="0" distB="0" distL="0" distR="0">
+            <wp:extent cx="5905500" cy="3692343"/>
+            <wp:effectExtent l="0" t="0" r="0" b="0"/>
+            <wp:docPr id="204" name="output-204.png" descr="README.md (luật sử dụng) + logo và bộ icon" title="README.md (luật sử dụng) + logo và bộ icon"/>
             <wp:cNvGraphicFramePr>
               <a:graphicFrameLocks xmlns:a="http://schemas.openxmlformats.org/drawingml/2006/main" noChangeAspect="1"/>
             </wp:cNvGraphicFramePr>
@@ -5298,7 +3915,7 @@
                   <pic:spPr bwMode="auto">
                     <a:xfrm>
                       <a:off x="0" y="0"/>
-                      <a:ext cx="5905500" cy="2573110"/>
+                      <a:ext cx="5905500" cy="3692343"/>
                     </a:xfrm>
                     <a:prstGeom prst="rect">
                       <a:avLst/>
@@ -5324,7 +3941,43 @@
           <w:sz w:val="18"/>
           <w:szCs w:val="18"/>
         </w:rPr>
-        <w:t>Trang artifact (bìa + các tab) và cấu trúc folder design-system/</w:t>
+        <w:t>README.md (luật sử dụng) + logo và bộ icon</w:t>
+      </w:r>
+    </w:p>
+    <w:p>
+      <w:pPr>
+        <w:pStyle w:val="Heading2"/>
+        <w:keepNext/>
+        <w:spacing w:before="240" w:after="100"/>
+      </w:pPr>
+      <w:r>
+        <w:rPr>
+          <w:b/>
+          <w:bCs/>
+          <w:color w:val="D86107"/>
+        </w:rPr>
+        <w:lastRenderedPageBreak/>
+        <w:t>Output 2 — design-system/STATUS.md</w:t>
+      </w:r>
+    </w:p>
+    <w:p>
+      <w:pPr>
+        <w:keepNext/>
+        <w:spacing w:before="40" w:after="80"/>
+      </w:pPr>
+      <w:r>
+        <w:rPr>
+          <w:b/>
+          <w:bCs/>
+          <w:color w:val="0969DA"/>
+        </w:rPr>
+        <w:t xml:space="preserve">Mục đích: </w:t>
+      </w:r>
+      <w:r>
+        <w:rPr>
+          <w:color w:val="24292F"/>
+        </w:rPr>
+        <w:t>Sổ theo dõi nội bộ của kit (không publish): trạng thái DRAFT/APPROVED, link artifact, platform và screen prefix, các mục còn thiếu (TBD) và mâu thuẫn cần designer xác nhận.</w:t>
       </w:r>
     </w:p>
     <w:p>
@@ -5336,12 +3989,11 @@
         <w:rPr>
           <w:noProof/>
         </w:rPr>
-        <w:lastRenderedPageBreak/>
         <w:drawing>
           <wp:inline distT="0" distB="0" distL="0" distR="0">
-            <wp:extent cx="5905500" cy="3787956"/>
+            <wp:extent cx="5905500" cy="3945436"/>
             <wp:effectExtent l="0" t="0" r="0" b="0"/>
-            <wp:docPr id="202" name="output-202.png" descr="tokens.json — màu theo từng portal, thang chữ, spacing, radius, shadow" title="tokens.json — màu theo từng portal, thang chữ, spacing, radius, shadow"/>
+            <wp:docPr id="205" name="output-205.png" descr="STATUS.md của lần chạy ES Kitchen" title="STATUS.md của lần chạy ES Kitchen"/>
             <wp:cNvGraphicFramePr>
               <a:graphicFrameLocks xmlns:a="http://schemas.openxmlformats.org/drawingml/2006/main" noChangeAspect="1"/>
             </wp:cNvGraphicFramePr>
@@ -5364,7 +4016,7 @@
                   <pic:spPr bwMode="auto">
                     <a:xfrm>
                       <a:off x="0" y="0"/>
-                      <a:ext cx="5905500" cy="3787956"/>
+                      <a:ext cx="5905500" cy="3945436"/>
                     </a:xfrm>
                     <a:prstGeom prst="rect">
                       <a:avLst/>
@@ -5390,7 +4042,42 @@
           <w:sz w:val="18"/>
           <w:szCs w:val="18"/>
         </w:rPr>
-        <w:t>tokens.json — màu theo từng portal, thang chữ, spacing, radius, shadow</w:t>
+        <w:t>STATUS.md của lần chạy ES Kitchen</w:t>
+      </w:r>
+    </w:p>
+    <w:p>
+      <w:pPr>
+        <w:pStyle w:val="Heading2"/>
+        <w:keepNext/>
+        <w:spacing w:before="240" w:after="100"/>
+      </w:pPr>
+      <w:r>
+        <w:rPr>
+          <w:b/>
+          <w:bCs/>
+          <w:color w:val="D86107"/>
+        </w:rPr>
+        <w:t>Output 3 — Màn hình Figma high-fidelity</w:t>
+      </w:r>
+    </w:p>
+    <w:p>
+      <w:pPr>
+        <w:keepNext/>
+        <w:spacing w:before="40" w:after="80"/>
+      </w:pPr>
+      <w:r>
+        <w:rPr>
+          <w:b/>
+          <w:bCs/>
+          <w:color w:val="0969DA"/>
+        </w:rPr>
+        <w:t xml:space="preserve">Mục đích: </w:t>
+      </w:r>
+      <w:r>
+        <w:rPr>
+          <w:color w:val="24292F"/>
+        </w:rPr>
+        <w:t>Các màn hình vẽ đúng design system (component thật, màu và chữ theo token), đủ popup / toast / lỗi / trống, tên màn đa ngôn ngữ không bị cắt — để designer review và FE dựng giao diện.</w:t>
       </w:r>
     </w:p>
     <w:p>
@@ -5404,9 +4091,9 @@
         </w:rPr>
         <w:drawing>
           <wp:inline distT="0" distB="0" distL="0" distR="0">
-            <wp:extent cx="5905500" cy="4277269"/>
+            <wp:extent cx="5905500" cy="2694784"/>
             <wp:effectExtent l="0" t="0" r="0" b="0"/>
-            <wp:docPr id="203" name="output-203.png" descr="Component có hướng dẫn dùng và preview chạy thật" title="Component có hướng dẫn dùng và preview chạy thật"/>
+            <wp:docPr id="206" name="output-206.png" descr="Section AI_Generate_&lt;tính năng&gt; trên Figma (xem thêm Bước 8)" title="Section AI_Generate_&lt;tính năng&gt; trên Figma (xem thêm Bước 8)"/>
             <wp:cNvGraphicFramePr>
               <a:graphicFrameLocks xmlns:a="http://schemas.openxmlformats.org/drawingml/2006/main" noChangeAspect="1"/>
             </wp:cNvGraphicFramePr>
@@ -5429,273 +4116,6 @@
                   <pic:spPr bwMode="auto">
                     <a:xfrm>
                       <a:off x="0" y="0"/>
-                      <a:ext cx="5905500" cy="4277269"/>
-                    </a:xfrm>
-                    <a:prstGeom prst="rect">
-                      <a:avLst/>
-                    </a:prstGeom>
-                  </pic:spPr>
-                </pic:pic>
-              </a:graphicData>
-            </a:graphic>
-          </wp:inline>
-        </w:drawing>
-      </w:r>
-    </w:p>
-    <w:p>
-      <w:pPr>
-        <w:spacing w:before="60" w:after="160"/>
-        <w:jc w:val="center"/>
-      </w:pPr>
-      <w:r>
-        <w:rPr>
-          <w:i/>
-          <w:iCs/>
-          <w:color w:val="6E7781"/>
-          <w:sz w:val="18"/>
-          <w:szCs w:val="18"/>
-        </w:rPr>
-        <w:t>Component có hướng dẫn dùng và preview chạy thật</w:t>
-      </w:r>
-    </w:p>
-    <w:p>
-      <w:pPr>
-        <w:spacing w:before="120" w:after="40"/>
-        <w:jc w:val="center"/>
-      </w:pPr>
-      <w:r>
-        <w:rPr>
-          <w:noProof/>
-        </w:rPr>
-        <w:lastRenderedPageBreak/>
-        <w:drawing>
-          <wp:inline distT="0" distB="0" distL="0" distR="0">
-            <wp:extent cx="5905500" cy="3692343"/>
-            <wp:effectExtent l="0" t="0" r="0" b="0"/>
-            <wp:docPr id="204" name="output-204.png" descr="README.md (luật sử dụng) + logo và bộ icon" title="README.md (luật sử dụng) + logo và bộ icon"/>
-            <wp:cNvGraphicFramePr>
-              <a:graphicFrameLocks xmlns:a="http://schemas.openxmlformats.org/drawingml/2006/main" noChangeAspect="1"/>
-            </wp:cNvGraphicFramePr>
-            <a:graphic xmlns:a="http://schemas.openxmlformats.org/drawingml/2006/main">
-              <a:graphicData uri="http://schemas.openxmlformats.org/drawingml/2006/picture">
-                <pic:pic xmlns:pic="http://schemas.openxmlformats.org/drawingml/2006/picture">
-                  <pic:nvPicPr>
-                    <pic:cNvPr id="0" name=""/>
-                    <pic:cNvPicPr>
-                      <a:picLocks noChangeAspect="1" noChangeArrowheads="1"/>
-                    </pic:cNvPicPr>
-                  </pic:nvPicPr>
-                  <pic:blipFill>
-                    <a:blip r:embed="rId22"/>
-                    <a:srcRect/>
-                    <a:stretch>
-                      <a:fillRect/>
-                    </a:stretch>
-                  </pic:blipFill>
-                  <pic:spPr bwMode="auto">
-                    <a:xfrm>
-                      <a:off x="0" y="0"/>
-                      <a:ext cx="5905500" cy="3692343"/>
-                    </a:xfrm>
-                    <a:prstGeom prst="rect">
-                      <a:avLst/>
-                    </a:prstGeom>
-                  </pic:spPr>
-                </pic:pic>
-              </a:graphicData>
-            </a:graphic>
-          </wp:inline>
-        </w:drawing>
-      </w:r>
-    </w:p>
-    <w:p>
-      <w:pPr>
-        <w:spacing w:before="60" w:after="160"/>
-        <w:jc w:val="center"/>
-      </w:pPr>
-      <w:r>
-        <w:rPr>
-          <w:i/>
-          <w:iCs/>
-          <w:color w:val="6E7781"/>
-          <w:sz w:val="18"/>
-          <w:szCs w:val="18"/>
-        </w:rPr>
-        <w:t>README.md (luật sử dụng) + logo và bộ icon</w:t>
-      </w:r>
-    </w:p>
-    <w:p>
-      <w:pPr>
-        <w:pStyle w:val="Heading2"/>
-        <w:keepNext/>
-        <w:spacing w:before="240" w:after="100"/>
-      </w:pPr>
-      <w:r>
-        <w:rPr>
-          <w:b/>
-          <w:bCs/>
-          <w:color w:val="D86107"/>
-        </w:rPr>
-        <w:lastRenderedPageBreak/>
-        <w:t>Output 2 — design-system/STATUS.md</w:t>
-      </w:r>
-    </w:p>
-    <w:p>
-      <w:pPr>
-        <w:keepNext/>
-        <w:spacing w:before="40" w:after="80"/>
-      </w:pPr>
-      <w:r>
-        <w:rPr>
-          <w:b/>
-          <w:bCs/>
-          <w:color w:val="0969DA"/>
-        </w:rPr>
-        <w:t xml:space="preserve">Mục đích: </w:t>
-      </w:r>
-      <w:r>
-        <w:rPr>
-          <w:color w:val="24292F"/>
-        </w:rPr>
-        <w:t>Sổ theo dõi nội bộ của kit (không publish): trạng thái DRAFT/APPROVED, link artifact, platform và screen prefix, các mục còn thiếu (TBD) và mâu thuẫn cần designer xác nhận.</w:t>
-      </w:r>
-    </w:p>
-    <w:p>
-      <w:pPr>
-        <w:spacing w:before="120" w:after="40"/>
-        <w:jc w:val="center"/>
-      </w:pPr>
-      <w:r>
-        <w:rPr>
-          <w:noProof/>
-        </w:rPr>
-        <w:drawing>
-          <wp:inline distT="0" distB="0" distL="0" distR="0">
-            <wp:extent cx="5905500" cy="3945436"/>
-            <wp:effectExtent l="0" t="0" r="0" b="0"/>
-            <wp:docPr id="205" name="output-205.png" descr="STATUS.md của lần chạy ES Kitchen" title="STATUS.md của lần chạy ES Kitchen"/>
-            <wp:cNvGraphicFramePr>
-              <a:graphicFrameLocks xmlns:a="http://schemas.openxmlformats.org/drawingml/2006/main" noChangeAspect="1"/>
-            </wp:cNvGraphicFramePr>
-            <a:graphic xmlns:a="http://schemas.openxmlformats.org/drawingml/2006/main">
-              <a:graphicData uri="http://schemas.openxmlformats.org/drawingml/2006/picture">
-                <pic:pic xmlns:pic="http://schemas.openxmlformats.org/drawingml/2006/picture">
-                  <pic:nvPicPr>
-                    <pic:cNvPr id="0" name=""/>
-                    <pic:cNvPicPr>
-                      <a:picLocks noChangeAspect="1" noChangeArrowheads="1"/>
-                    </pic:cNvPicPr>
-                  </pic:nvPicPr>
-                  <pic:blipFill>
-                    <a:blip r:embed="rId23"/>
-                    <a:srcRect/>
-                    <a:stretch>
-                      <a:fillRect/>
-                    </a:stretch>
-                  </pic:blipFill>
-                  <pic:spPr bwMode="auto">
-                    <a:xfrm>
-                      <a:off x="0" y="0"/>
-                      <a:ext cx="5905500" cy="3945436"/>
-                    </a:xfrm>
-                    <a:prstGeom prst="rect">
-                      <a:avLst/>
-                    </a:prstGeom>
-                  </pic:spPr>
-                </pic:pic>
-              </a:graphicData>
-            </a:graphic>
-          </wp:inline>
-        </w:drawing>
-      </w:r>
-    </w:p>
-    <w:p>
-      <w:pPr>
-        <w:spacing w:before="60" w:after="160"/>
-        <w:jc w:val="center"/>
-      </w:pPr>
-      <w:r>
-        <w:rPr>
-          <w:i/>
-          <w:iCs/>
-          <w:color w:val="6E7781"/>
-          <w:sz w:val="18"/>
-          <w:szCs w:val="18"/>
-        </w:rPr>
-        <w:t>STATUS.md của lần chạy ES Kitchen</w:t>
-      </w:r>
-    </w:p>
-    <w:p>
-      <w:pPr>
-        <w:pStyle w:val="Heading2"/>
-        <w:keepNext/>
-        <w:spacing w:before="240" w:after="100"/>
-      </w:pPr>
-      <w:r>
-        <w:rPr>
-          <w:b/>
-          <w:bCs/>
-          <w:color w:val="D86107"/>
-        </w:rPr>
-        <w:t>Output 3 — Màn hình Figma high-fidelity</w:t>
-      </w:r>
-    </w:p>
-    <w:p>
-      <w:pPr>
-        <w:keepNext/>
-        <w:spacing w:before="40" w:after="80"/>
-      </w:pPr>
-      <w:r>
-        <w:rPr>
-          <w:b/>
-          <w:bCs/>
-          <w:color w:val="0969DA"/>
-        </w:rPr>
-        <w:t xml:space="preserve">Mục đích: </w:t>
-      </w:r>
-      <w:r>
-        <w:rPr>
-          <w:color w:val="24292F"/>
-        </w:rPr>
-        <w:t>Các màn hình vẽ đúng design system (component thật, màu và chữ theo token), đủ popup / toast / lỗi / trống, tên màn đa ngôn ngữ không bị cắt — để designer review và FE dựng giao diện.</w:t>
-      </w:r>
-    </w:p>
-    <w:p>
-      <w:pPr>
-        <w:spacing w:before="120" w:after="40"/>
-        <w:jc w:val="center"/>
-      </w:pPr>
-      <w:r>
-        <w:rPr>
-          <w:noProof/>
-        </w:rPr>
-        <w:drawing>
-          <wp:inline distT="0" distB="0" distL="0" distR="0">
-            <wp:extent cx="5905500" cy="2694784"/>
-            <wp:effectExtent l="0" t="0" r="0" b="0"/>
-            <wp:docPr id="206" name="output-206.png" descr="Section AI_Generate_&lt;tính năng&gt; trên Figma (xem thêm Bước 8)" title="Section AI_Generate_&lt;tính năng&gt; trên Figma (xem thêm Bước 8)"/>
-            <wp:cNvGraphicFramePr>
-              <a:graphicFrameLocks xmlns:a="http://schemas.openxmlformats.org/drawingml/2006/main" noChangeAspect="1"/>
-            </wp:cNvGraphicFramePr>
-            <a:graphic xmlns:a="http://schemas.openxmlformats.org/drawingml/2006/main">
-              <a:graphicData uri="http://schemas.openxmlformats.org/drawingml/2006/picture">
-                <pic:pic xmlns:pic="http://schemas.openxmlformats.org/drawingml/2006/picture">
-                  <pic:nvPicPr>
-                    <pic:cNvPr id="0" name=""/>
-                    <pic:cNvPicPr>
-                      <a:picLocks noChangeAspect="1" noChangeArrowheads="1"/>
-                    </pic:cNvPicPr>
-                  </pic:nvPicPr>
-                  <pic:blipFill>
-                    <a:blip r:embed="rId17"/>
-                    <a:srcRect/>
-                    <a:stretch>
-                      <a:fillRect/>
-                    </a:stretch>
-                  </pic:blipFill>
-                  <pic:spPr bwMode="auto">
-                    <a:xfrm>
-                      <a:off x="0" y="0"/>
                       <a:ext cx="5905500" cy="2694784"/>
                     </a:xfrm>
                     <a:prstGeom prst="rect">
@@ -5788,7 +4208,7 @@
                     </pic:cNvPicPr>
                   </pic:nvPicPr>
                   <pic:blipFill>
-                    <a:blip r:embed="rId24"/>
+                    <a:blip r:embed="rId22"/>
                     <a:srcRect/>
                     <a:stretch>
                       <a:fillRect/>
@@ -6176,7 +4596,7 @@
       </w:r>
     </w:p>
     <w:sectPr>
-      <w:footerReference w:type="default" r:id="rId25"/>
+      <w:footerReference w:type="default" r:id="rId23"/>
       <w:pgSz w:w="12240" w:h="15840"/>
       <w:pgMar w:top="1134" w:right="1247" w:bottom="1134" w:left="1247" w:header="708" w:footer="708" w:gutter="0"/>
       <w:cols w:space="720"/>

</xml_diff>